<commit_message>
Fix author name to Alexander Apartsin
Correct byline and copyright; regenerate PDF + DOCX.

Co-Authored-By: Claude Opus 4.8 <noreply@anthropic.com>
</commit_message>
<xml_diff>
--- a/FuelAnomalies.docx
+++ b/FuelAnomalies.docx
@@ -89,7 +89,7 @@
         <w:pStyle w:val="FirstParagraph"/>
       </w:pPr>
       <w:r>
-        <w:t xml:space="preserve">Alexander Partsin</w:t>
+        <w:t xml:space="preserve">Alexander Apartsin</w:t>
       </w:r>
     </w:p>
     <w:p>
@@ -5257,7 +5257,7 @@
         <w:t xml:space="preserve">RESULTS.md</w:t>
       </w:r>
       <w:r>
-        <w:t xml:space="preserve">. © 2026 Alexander Partsin.</w:t>
+        <w:t xml:space="preserve">. © 2026 Alexander Apartsin.</w:t>
       </w:r>
     </w:p>
     <w:bookmarkEnd w:id="109"/>

</xml_diff>

<commit_message>
Apply full-paper review fixes (consistency + traceability)
- One-pass consolidated VED numbers (scripts/p10_consolidated.py): Table 4 shares
  now sum to 1.0; combustion R2 on driver-excess reconciled to a single -0.028
- Abstract/contributions: "R2 <= 0" -> "within 0.02 of zero"; decomposition panel
  14,460 -> 14,170; attribution stated as 95.9% [95.6,96.2]
- Table 5: drop non-comparable lean/ignition BSFC with a note
- Sec 8.3: axis-separability caveat + above-Gaussian-optimum explanation; axis
  correlation -0.01 reported (Sec 9.1 orthogonality claim now backed)
- Log Spearman rho=0.964, S_bench unrounded; house-style em-dash cleanup;
  permutation p <= 0.001; fix build_docs.sh WINROOT

Co-Authored-By: Claude Opus 4.8 <noreply@anthropic.com>
</commit_message>
<xml_diff>
--- a/FuelAnomalies.docx
+++ b/FuelAnomalies.docx
@@ -276,36 +276,36 @@
             </m:r>
           </m:sup>
         </m:sSup>
-        <m:r>
-          <m:rPr>
-            <m:sty m:val="p"/>
-          </m:rPr>
-          <m:t>≤</m:t>
-        </m:r>
-        <m:r>
-          <m:t>0</m:t>
-        </m:r>
       </m:oMath>
       <w:r>
-        <w:t xml:space="preserve">), a silence that survives a trim-corrected fuel target and</w:t>
-      </w:r>
-      <w:r>
-        <w:t xml:space="preserve"> </w:t>
-      </w:r>
-      <w:r>
-        <w:t xml:space="preserve">holds within the highest-trim vehicles. On semi-synthetic ground truth, where both causes raise fuel by</w:t>
-      </w:r>
-      <w:r>
-        <w:t xml:space="preserve"> </w:t>
-      </w:r>
-      <w:r>
-        <w:t xml:space="preserve">the same amount so that magnitude is uninformative, the signature attributes driver-versus-fault excess</w:t>
-      </w:r>
-      <w:r>
-        <w:t xml:space="preserve"> </w:t>
-      </w:r>
-      <w:r>
-        <w:t xml:space="preserve">at 96% accuracy (95% CI [0.956, 0.962]) against a fuel-only baseline at chance. Both axes derive from</w:t>
+        <w:t xml:space="preserve"> </w:t>
+      </w:r>
+      <w:r>
+        <w:t xml:space="preserve">within 0.02 of zero), a silence that survives a trim-corrected</w:t>
+      </w:r>
+      <w:r>
+        <w:t xml:space="preserve"> </w:t>
+      </w:r>
+      <w:r>
+        <w:t xml:space="preserve">fuel target and holds within the highest-trim vehicles. On semi-synthetic ground truth, where both</w:t>
+      </w:r>
+      <w:r>
+        <w:t xml:space="preserve"> </w:t>
+      </w:r>
+      <w:r>
+        <w:t xml:space="preserve">causes raise fuel by the same amount so that magnitude is uninformative, the signature attributes</w:t>
+      </w:r>
+      <w:r>
+        <w:t xml:space="preserve"> </w:t>
+      </w:r>
+      <w:r>
+        <w:t xml:space="preserve">driver-versus-fault excess at 95.9% accuracy (95% CI [95.6, 96.2]) against a fuel-only baseline at</w:t>
+      </w:r>
+      <w:r>
+        <w:t xml:space="preserve"> </w:t>
+      </w:r>
+      <w:r>
+        <w:t xml:space="preserve">chance. Both axes derive from</w:t>
       </w:r>
       <w:r>
         <w:t xml:space="preserve"> </w:t>
@@ -376,13 +376,19 @@
         </w:numPr>
       </w:pPr>
       <w:r>
-        <w:t xml:space="preserve">A variance decomposition of trip fuel on a 197-vehicle, 14,460-trip public fleet into behaviour,</w:t>
-      </w:r>
-      <w:r>
-        <w:t xml:space="preserve"> </w:t>
-      </w:r>
-      <w:r>
-        <w:t xml:space="preserve">vehicle-baseline, and environment components, each with bootstrap confidence intervals.</w:t>
+        <w:t xml:space="preserve">A variance decomposition of trip fuel on a 197-vehicle public fleet (14,170 trips after</w:t>
+      </w:r>
+      <w:r>
+        <w:t xml:space="preserve"> </w:t>
+      </w:r>
+      <w:r>
+        <w:t xml:space="preserve">fuel-quality filtering) into behaviour, vehicle-baseline, and environment components, each with</w:t>
+      </w:r>
+      <w:r>
+        <w:t xml:space="preserve"> </w:t>
+      </w:r>
+      <w:r>
+        <w:t xml:space="preserve">bootstrap confidence intervals.</w:t>
       </w:r>
     </w:p>
     <w:p>
@@ -413,7 +419,10 @@
         <w:t xml:space="preserve"> </w:t>
       </w:r>
       <w:r>
-        <w:t xml:space="preserve">(</w:t>
+        <w:t xml:space="preserve">(held-out</w:t>
+      </w:r>
+      <w:r>
+        <w:t xml:space="preserve"> </w:t>
       </w:r>
       <m:oMath>
         <m:sSup>
@@ -428,24 +437,18 @@
             </m:r>
           </m:sup>
         </m:sSup>
-        <m:r>
-          <m:rPr>
-            <m:sty m:val="p"/>
-          </m:rPr>
-          <m:t>≤</m:t>
-        </m:r>
-        <m:r>
-          <m:t>0</m:t>
-        </m:r>
       </m:oMath>
       <w:r>
-        <w:t xml:space="preserve">), a silence that survives trim-corrected fuel and the highest-trim vehicles, ruling</w:t>
-      </w:r>
-      <w:r>
-        <w:t xml:space="preserve"> </w:t>
-      </w:r>
-      <w:r>
-        <w:t xml:space="preserve">out a measurement artifact.</w:t>
+        <w:t xml:space="preserve"> </w:t>
+      </w:r>
+      <w:r>
+        <w:t xml:space="preserve">within 0.02 of zero), a silence that survives trim-corrected fuel and the</w:t>
+      </w:r>
+      <w:r>
+        <w:t xml:space="preserve"> </w:t>
+      </w:r>
+      <w:r>
+        <w:t xml:space="preserve">highest-trim vehicles, ruling out a measurement artifact.</w:t>
       </w:r>
     </w:p>
     <w:p>
@@ -467,13 +470,13 @@
           <w:b/>
           <w:bCs/>
         </w:rPr>
-        <w:t xml:space="preserve">attribution accuracy of 96%</w:t>
-      </w:r>
-      <w:r>
-        <w:t xml:space="preserve"> </w:t>
-      </w:r>
-      <w:r>
-        <w:t xml:space="preserve">(95% CI [0.956, 0.962]) on semi-synthetic ground</w:t>
+        <w:t xml:space="preserve">attribution accuracy of 95.9%</w:t>
+      </w:r>
+      <w:r>
+        <w:t xml:space="preserve"> </w:t>
+      </w:r>
+      <w:r>
+        <w:t xml:space="preserve">(95% CI [95.6, 96.2]) on semi-synthetic ground</w:t>
       </w:r>
       <w:r>
         <w:t xml:space="preserve"> </w:t>
@@ -514,7 +517,7 @@
               <a:graphicData uri="http://schemas.openxmlformats.org/drawingml/2006/picture">
                 <pic:pic>
                   <pic:nvPicPr>
-                    <pic:cNvPr descr="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" id="23" name="Picture"/>
+                    <pic:cNvPr descr="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" id="23" name="Picture"/>
                     <pic:cNvPicPr>
                       <a:picLocks noChangeArrowheads="1" noChangeAspect="1"/>
                     </pic:cNvPicPr>
@@ -856,7 +859,7 @@
         <w:t xml:space="preserve"> </w:t>
       </w:r>
       <w:r>
-        <w:t xml:space="preserve">magnitude is made uninformative, the signature recovers the cause at 96% accuracy. The remainder of</w:t>
+        <w:t xml:space="preserve">magnitude is made uninformative, the signature recovers the cause at 95.9% accuracy. The remainder of</w:t>
       </w:r>
       <w:r>
         <w:t xml:space="preserve"> </w:t>
@@ -1664,7 +1667,7 @@
               <w:jc w:val="left"/>
             </w:pPr>
             <w:r>
-              <w:t xml:space="preserve">—</w:t>
+              <w:t xml:space="preserve">n/a</w:t>
             </w:r>
           </w:p>
         </w:tc>
@@ -1748,7 +1751,7 @@
               <w:jc w:val="left"/>
             </w:pPr>
             <w:r>
-              <w:t xml:space="preserve">—</w:t>
+              <w:t xml:space="preserve">n/a</w:t>
             </w:r>
           </w:p>
         </w:tc>
@@ -5162,14 +5165,17 @@
           <m:rPr>
             <m:sty m:val="p"/>
           </m:rPr>
-          <m:t>≈</m:t>
+          <m:t>=</m:t>
         </m:r>
         <m:r>
           <m:t>1.66</m:t>
         </m:r>
       </m:oMath>
       <w:r>
-        <w:t xml:space="preserve">. A logistic attributor is trained on the two axis-deviations,</w:t>
+        <w:t xml:space="preserve"> </w:t>
+      </w:r>
+      <w:r>
+        <w:t xml:space="preserve">(from the unrounded shift and standard deviation). A logistic attributor is trained on the two axis-deviations,</w:t>
       </w:r>
       <w:r>
         <w:t xml:space="preserve"> </w:t>
@@ -5725,19 +5731,19 @@
               <w:jc w:val="left"/>
             </w:pPr>
             <w:r>
-              <w:t xml:space="preserve">0.366</w:t>
-            </w:r>
-          </w:p>
-        </w:tc>
-        <w:tc>
-          <w:tcPr/>
-          <w:p>
-            <w:pPr>
-              <w:pStyle w:val="Compact"/>
-              <w:jc w:val="left"/>
-            </w:pPr>
-            <w:r>
-              <w:t xml:space="preserve">—</w:t>
+              <w:t xml:space="preserve">0.368</w:t>
+            </w:r>
+          </w:p>
+        </w:tc>
+        <w:tc>
+          <w:tcPr/>
+          <w:p>
+            <w:pPr>
+              <w:pStyle w:val="Compact"/>
+              <w:jc w:val="left"/>
+            </w:pPr>
+            <w:r>
+              <w:t xml:space="preserve">n/a</w:t>
             </w:r>
           </w:p>
         </w:tc>
@@ -5865,19 +5871,19 @@
               <w:jc w:val="left"/>
             </w:pPr>
             <w:r>
-              <w:t xml:space="preserve">0.307</w:t>
-            </w:r>
-          </w:p>
-        </w:tc>
-        <w:tc>
-          <w:tcPr/>
-          <w:p>
-            <w:pPr>
-              <w:pStyle w:val="Compact"/>
-              <w:jc w:val="left"/>
-            </w:pPr>
-            <w:r>
-              <w:t xml:space="preserve">—</w:t>
+              <w:t xml:space="preserve">0.305</w:t>
+            </w:r>
+          </w:p>
+        </w:tc>
+        <w:tc>
+          <w:tcPr/>
+          <w:p>
+            <w:pPr>
+              <w:pStyle w:val="Compact"/>
+              <w:jc w:val="left"/>
+            </w:pPr>
+            <w:r>
+              <w:t xml:space="preserve">n/a</w:t>
             </w:r>
           </w:p>
         </w:tc>
@@ -5962,19 +5968,19 @@
               <w:jc w:val="left"/>
             </w:pPr>
             <w:r>
-              <w:t xml:space="preserve">0.185</w:t>
-            </w:r>
-          </w:p>
-        </w:tc>
-        <w:tc>
-          <w:tcPr/>
-          <w:p>
-            <w:pPr>
-              <w:pStyle w:val="Compact"/>
-              <w:jc w:val="left"/>
-            </w:pPr>
-            <w:r>
-              <w:t xml:space="preserve">—</w:t>
+              <w:t xml:space="preserve">0.184</w:t>
+            </w:r>
+          </w:p>
+        </w:tc>
+        <w:tc>
+          <w:tcPr/>
+          <w:p>
+            <w:pPr>
+              <w:pStyle w:val="Compact"/>
+              <w:jc w:val="left"/>
+            </w:pPr>
+            <w:r>
+              <w:t xml:space="preserve">n/a</w:t>
             </w:r>
           </w:p>
         </w:tc>
@@ -5995,19 +6001,25 @@
         <w:t xml:space="preserve"> </w:t>
       </w:r>
       <w:r>
-        <w:t xml:space="preserve">Variance decomposition of trip fuel (14,170 trips, 194 vehicles).</w:t>
-      </w:r>
-      <w:r>
-        <w:t xml:space="preserve"> </w:t>
-      </w:r>
-      <w:r>
-        <w:t xml:space="preserve">Behaviour and route share variance, so the unique 8% understates behaviour's total association; the</w:t>
-      </w:r>
-      <w:r>
-        <w:t xml:space="preserve"> </w:t>
-      </w:r>
-      <w:r>
-        <w:t xml:space="preserve">vehicle-baseline is a separate 14%.</w:t>
+        <w:t xml:space="preserve">Variance decomposition of trip fuel (14,170 trips, 194 vehicles),</w:t>
+      </w:r>
+      <w:r>
+        <w:t xml:space="preserve"> </w:t>
+      </w:r>
+      <w:r>
+        <w:t xml:space="preserve">computed in one pass so the environment, unique-behaviour, vehicle-baseline, and unexplained shares</w:t>
+      </w:r>
+      <w:r>
+        <w:t xml:space="preserve"> </w:t>
+      </w:r>
+      <w:r>
+        <w:t xml:space="preserve">sum to one. Behaviour and route share variance, so the unique 8% understates behaviour's total</w:t>
+      </w:r>
+      <w:r>
+        <w:t xml:space="preserve"> </w:t>
+      </w:r>
+      <w:r>
+        <w:t xml:space="preserve">association; the vehicle-baseline is a separate 14%. Point estimates; 95% CIs are cluster bootstraps.</w:t>
       </w:r>
     </w:p>
     <w:p>
@@ -6398,7 +6410,7 @@
           <m:rPr>
             <m:sty m:val="p"/>
           </m:rPr>
-          <m:t>=</m:t>
+          <m:t>≤</m:t>
         </m:r>
         <m:r>
           <m:t>0.001</m:t>
@@ -6702,7 +6714,7 @@
               <w:jc w:val="left"/>
             </w:pPr>
             <w:r>
-              <w:t xml:space="preserve">—</w:t>
+              <w:t xml:space="preserve">n/a</w:t>
             </w:r>
           </w:p>
         </w:tc>
@@ -6726,7 +6738,7 @@
               <w:jc w:val="left"/>
             </w:pPr>
             <w:r>
-              <w:t xml:space="preserve">—</w:t>
+              <w:t xml:space="preserve">n/a</w:t>
             </w:r>
           </w:p>
         </w:tc>
@@ -6850,7 +6862,7 @@
               <w:jc w:val="left"/>
             </w:pPr>
             <w:r>
-              <w:t xml:space="preserve">−29%</w:t>
+              <w:t xml:space="preserve">n/a</w:t>
             </w:r>
           </w:p>
         </w:tc>
@@ -6912,7 +6924,7 @@
               <w:jc w:val="left"/>
             </w:pPr>
             <w:r>
-              <w:t xml:space="preserve">−35%</w:t>
+              <w:t xml:space="preserve">n/a</w:t>
             </w:r>
           </w:p>
         </w:tc>
@@ -6939,7 +6951,19 @@
         <w:t xml:space="preserve"> </w:t>
       </w:r>
       <w:r>
-        <w:t xml:space="preserve">mixture is a fuel-relevant fault.</w:t>
+        <w:t xml:space="preserve">mixture is a fuel-relevant fault. Brake-specific fuel consumption is reported for the rich fault only;</w:t>
+      </w:r>
+      <w:r>
+        <w:t xml:space="preserve"> </w:t>
+      </w:r>
+      <w:r>
+        <w:t xml:space="preserve">the lean and ignition faults were sampled at systematically lower power on the bench, so their</w:t>
+      </w:r>
+      <w:r>
+        <w:t xml:space="preserve"> </w:t>
+      </w:r>
+      <w:r>
+        <w:t xml:space="preserve">per-work figures are not comparable and are omitted.</w:t>
       </w:r>
     </w:p>
     <w:p>
@@ -7185,7 +7209,7 @@
           <m:t>−</m:t>
         </m:r>
         <m:r>
-          <m:t>0.039</m:t>
+          <m:t>0.028</m:t>
         </m:r>
       </m:oMath>
       <w:r>
@@ -7332,7 +7356,7 @@
               <w:jc w:val="left"/>
             </w:pPr>
             <w:r>
-              <w:t xml:space="preserve">−0.039</w:t>
+              <w:t xml:space="preserve">−0.028</w:t>
             </w:r>
           </w:p>
         </w:tc>
@@ -7866,7 +7890,131 @@
         <w:t xml:space="preserve"> </w:t>
       </w:r>
       <w:r>
-        <w:t xml:space="preserve">restriction examined next.</w:t>
+        <w:t xml:space="preserve">restriction examined next. Two caveats on scope. The injection places each cause purely on its own</w:t>
+      </w:r>
+      <w:r>
+        <w:t xml:space="preserve"> </w:t>
+      </w:r>
+      <w:r>
+        <w:t xml:space="preserve">axis, so the experiment measures how detectable that separation is against real trip-to-trip noise; it</w:t>
+      </w:r>
+      <w:r>
+        <w:t xml:space="preserve"> </w:t>
+      </w:r>
+      <w:r>
+        <w:t xml:space="preserve">presumes rather than proves axis-separability, which rests instead on the bench signature and the</w:t>
+      </w:r>
+      <w:r>
+        <w:t xml:space="preserve"> </w:t>
+      </w:r>
+      <w:r>
+        <w:t xml:space="preserve">silent driver-excess cell. And the measured accuracy sits above the Gaussian-optimal bound of</w:t>
+      </w:r>
+      <w:r>
+        <w:t xml:space="preserve"> </w:t>
+      </w:r>
+      <m:oMath>
+        <m:r>
+          <m:t>Φ</m:t>
+        </m:r>
+        <m:d>
+          <m:dPr>
+            <m:begChr m:val="("/>
+            <m:endChr m:val=")"/>
+            <m:sepChr m:val=""/>
+            <m:grow/>
+          </m:dPr>
+          <m:e>
+            <m:r>
+              <m:t>S</m:t>
+            </m:r>
+            <m:r>
+              <m:rPr>
+                <m:sty m:val="p"/>
+              </m:rPr>
+              <m:t>/</m:t>
+            </m:r>
+            <m:rad>
+              <m:radPr>
+                <m:degHide m:val="on"/>
+              </m:radPr>
+              <m:deg/>
+              <m:e>
+                <m:r>
+                  <m:t>2</m:t>
+                </m:r>
+              </m:e>
+            </m:rad>
+          </m:e>
+        </m:d>
+        <m:r>
+          <m:rPr>
+            <m:sty m:val="p"/>
+          </m:rPr>
+          <m:t>≈</m:t>
+        </m:r>
+        <m:r>
+          <m:t>0.88</m:t>
+        </m:r>
+      </m:oMath>
+      <w:r>
+        <w:t xml:space="preserve"> </w:t>
+      </w:r>
+      <w:r>
+        <w:t xml:space="preserve">at</w:t>
+      </w:r>
+      <w:r>
+        <w:t xml:space="preserve"> </w:t>
+      </w:r>
+      <m:oMath>
+        <m:sSub>
+          <m:e>
+            <m:r>
+              <m:t>S</m:t>
+            </m:r>
+          </m:e>
+          <m:sub>
+            <m:r>
+              <m:rPr>
+                <m:nor/>
+                <m:sty m:val="p"/>
+              </m:rPr>
+              <m:t>bench</m:t>
+            </m:r>
+          </m:sub>
+        </m:sSub>
+      </m:oMath>
+      <w:r>
+        <w:t xml:space="preserve">, because the real within-vehicle deviations are</w:t>
+      </w:r>
+      <w:r>
+        <w:t xml:space="preserve"> </w:t>
+      </w:r>
+      <w:r>
+        <w:t xml:space="preserve">tighter than the median standard deviation used for calibration and the attributor also sees each</w:t>
+      </w:r>
+      <w:r>
+        <w:t xml:space="preserve"> </w:t>
+      </w:r>
+      <w:r>
+        <w:t xml:space="preserve">vehicle's baseline; the two axes are in fact near-independent in the fleet (trip-level correlation</w:t>
+      </w:r>
+      <w:r>
+        <w:t xml:space="preserve"> </w:t>
+      </w:r>
+      <m:oMath>
+        <m:r>
+          <m:rPr>
+            <m:sty m:val="p"/>
+          </m:rPr>
+          <m:t>−</m:t>
+        </m:r>
+        <m:r>
+          <m:t>0.01</m:t>
+        </m:r>
+      </m:oMath>
+      <w:r>
+        <w:t xml:space="preserve">), which is what makes them separable.</w:t>
       </w:r>
     </w:p>
     <w:p>
@@ -7931,7 +8079,7 @@
         <w:t xml:space="preserve"> </w:t>
       </w:r>
       <w:r>
-        <w:t xml:space="preserve">Attribution accuracy versus signature strength, reaching 96% at the</w:t>
+        <w:t xml:space="preserve">Attribution accuracy versus signature strength, reaching 95.9% at the</w:t>
       </w:r>
       <w:r>
         <w:t xml:space="preserve"> </w:t>
@@ -8294,13 +8442,30 @@
         <w:t xml:space="preserve"> </w:t>
       </w:r>
       <w:r>
-        <w:t xml:space="preserve">orthogonal, which is exactly why the combustion axis is silent for driver-caused excess and why</w:t>
-      </w:r>
-      <w:r>
-        <w:t xml:space="preserve"> </w:t>
-      </w:r>
-      <w:r>
-        <w:t xml:space="preserve">attribution is possible from standard channels.</w:t>
+        <w:t xml:space="preserve">orthogonal (trip-level correlation</w:t>
+      </w:r>
+      <w:r>
+        <w:t xml:space="preserve"> </w:t>
+      </w:r>
+      <m:oMath>
+        <m:r>
+          <m:rPr>
+            <m:sty m:val="p"/>
+          </m:rPr>
+          <m:t>−</m:t>
+        </m:r>
+        <m:r>
+          <m:t>0.01</m:t>
+        </m:r>
+      </m:oMath>
+      <w:r>
+        <w:t xml:space="preserve">), which is exactly why the combustion axis is silent for</w:t>
+      </w:r>
+      <w:r>
+        <w:t xml:space="preserve"> </w:t>
+      </w:r>
+      <w:r>
+        <w:t xml:space="preserve">driver-caused excess and why attribution is possible from standard channels.</w:t>
       </w:r>
     </w:p>
     <w:bookmarkEnd w:id="80"/>
@@ -8664,7 +8829,7 @@
         <w:t xml:space="preserve"> </w:t>
       </w:r>
       <w:r>
-        <w:t xml:space="preserve">uninformative, the signature attributes the cause at 96% accuracy where magnitude alone is at chance.</w:t>
+        <w:t xml:space="preserve">uninformative, the signature attributes the cause at 95.9% accuracy where magnitude alone is at chance.</w:t>
       </w:r>
       <w:r>
         <w:t xml:space="preserve"> </w:t>

</xml_diff>

<commit_message>
Add second author (Y. Aperstein) and affiliations (HIT; Afeka)
Co-Authored-By: Claude Opus 4.8 <noreply@anthropic.com>
</commit_message>
<xml_diff>
--- a/FuelAnomalies.docx
+++ b/FuelAnomalies.docx
@@ -90,6 +90,53 @@
       </w:pPr>
       <w:r>
         <w:t xml:space="preserve">Alexander Apartsin</w:t>
+      </w:r>
+      <w:r>
+        <w:rPr>
+          <w:vertAlign w:val="superscript"/>
+        </w:rPr>
+        <w:t xml:space="preserve">1</w:t>
+      </w:r>
+      <w:r>
+        <w:t xml:space="preserve">, Yehudit Aperstein</w:t>
+      </w:r>
+      <w:r>
+        <w:rPr>
+          <w:vertAlign w:val="superscript"/>
+        </w:rPr>
+        <w:t xml:space="preserve">2</w:t>
+      </w:r>
+    </w:p>
+    <w:p>
+      <w:pPr>
+        <w:pStyle w:val="BodyText"/>
+      </w:pPr>
+      <w:r>
+        <w:rPr>
+          <w:vertAlign w:val="superscript"/>
+        </w:rPr>
+        <w:t xml:space="preserve">1</w:t>
+      </w:r>
+      <w:r>
+        <w:t xml:space="preserve">School of Computer Science, Faculty of</w:t>
+      </w:r>
+      <w:r>
+        <w:t xml:space="preserve"> </w:t>
+      </w:r>
+      <w:r>
+        <w:t xml:space="preserve">Sciences, Holon Institute of Technology (HIT), Holon, Israel</w:t>
+      </w:r>
+      <w:r>
+        <w:br/>
+      </w:r>
+      <w:r>
+        <w:rPr>
+          <w:vertAlign w:val="superscript"/>
+        </w:rPr>
+        <w:t xml:space="preserve">2</w:t>
+      </w:r>
+      <w:r>
+        <w:t xml:space="preserve">Intelligent Systems, Afeka Academic College of Engineering, Tel-Aviv, Israel</w:t>
       </w:r>
     </w:p>
     <w:p>
@@ -8985,13 +9032,13 @@
         <w:t xml:space="preserve"> </w:t>
       </w:r>
       <w:r>
-        <w:t xml:space="preserve">A. Apartsin conceived the study, implemented the pipeline, and</w:t>
-      </w:r>
-      <w:r>
-        <w:t xml:space="preserve"> </w:t>
-      </w:r>
-      <w:r>
-        <w:t xml:space="preserve">wrote the manuscript.</w:t>
+        <w:t xml:space="preserve">A. Apartsin conceived and implemented the study and drafted</w:t>
+      </w:r>
+      <w:r>
+        <w:t xml:space="preserve"> </w:t>
+      </w:r>
+      <w:r>
+        <w:t xml:space="preserve">the manuscript; Y. Aperstein contributed to the study design and critically revised the manuscript.</w:t>
       </w:r>
       <w:r>
         <w:t xml:space="preserve"> </w:t>
@@ -9007,13 +9054,13 @@
         <w:t xml:space="preserve"> </w:t>
       </w:r>
       <w:r>
-        <w:t xml:space="preserve">We thank the creators of VED, EngineFaultDB, and the</w:t>
-      </w:r>
-      <w:r>
-        <w:t xml:space="preserve"> </w:t>
-      </w:r>
-      <w:r>
-        <w:t xml:space="preserve">Driving Events dataset for releasing their data openly.</w:t>
+        <w:t xml:space="preserve">We thank the creators of VED, EngineFaultDB, and the Driving Events dataset</w:t>
+      </w:r>
+      <w:r>
+        <w:t xml:space="preserve"> </w:t>
+      </w:r>
+      <w:r>
+        <w:t xml:space="preserve">for releasing their data openly.</w:t>
       </w:r>
     </w:p>
     <w:bookmarkEnd w:id="91"/>
@@ -10137,7 +10184,7 @@
         <w:t xml:space="preserve">RESULTS.md</w:t>
       </w:r>
       <w:r>
-        <w:t xml:space="preserve">. © 2026 Alexander Apartsin.</w:t>
+        <w:t xml:space="preserve">. © 2026 Alexander Apartsin and Yehudit Aperstein.</w:t>
       </w:r>
     </w:p>
     <w:bookmarkEnd w:id="137"/>

</xml_diff>

<commit_message>
Final polish pass (Fable review): clarity, consistency, stale content
- Remove draft badges/status/bibtest mentions; footer to plain copyright
- Reconcile Table 6 kinematic to 0.084; silent-cell R2=-0.03 in abstract/contributions
- Vehicle count 194 (not 197) for the 14,170-trip decomposition panel
- Cite Figures 1/2/4/5/6 and Table 2; define bar-e/bar-f after Eq 7; attributor sees baseline
- Rename fig2_double_dissociation -> signature_contrast (title + file); sync fig values
- Split dense abstract sentences; trim repetition; Table 5 2dp

Co-Authored-By: Claude Opus 4.8 <noreply@anthropic.com>
</commit_message>
<xml_diff>
--- a/FuelAnomalies.docx
+++ b/FuelAnomalies.docx
@@ -58,17 +58,6 @@
         <w:t xml:space="preserve">Consumption</w:t>
       </w:r>
     </w:p>
-    <w:p>
-      <w:pPr>
-        <w:pStyle w:val="FirstParagraph"/>
-      </w:pPr>
-      <w:r>
-        <w:t xml:space="preserve">Working draft</w:t>
-      </w:r>
-      <w:r>
-        <w:t xml:space="preserve">v0.4 (full)</w:t>
-      </w:r>
-    </w:p>
     <w:bookmarkStart w:id="20" w:name="Xb86f25cd334bec3280bd4d2fc6af5404396d8df"/>
     <w:p>
       <w:pPr>
@@ -139,47 +128,6 @@
         <w:t xml:space="preserve">Intelligent Systems, Afeka Academic College of Engineering, Tel-Aviv, Israel</w:t>
       </w:r>
     </w:p>
-    <w:p>
-      <w:pPr>
-        <w:pStyle w:val="BodyText"/>
-      </w:pPr>
-      <w:r>
-        <w:t xml:space="preserve">Full-length draft. Every number is a computed result traceable to a script in</w:t>
-      </w:r>
-      <w:r>
-        <w:t xml:space="preserve"> </w:t>
-      </w:r>
-      <w:r>
-        <w:rPr>
-          <w:rStyle w:val="VerbatimChar"/>
-        </w:rPr>
-        <w:t xml:space="preserve">scripts/</w:t>
-      </w:r>
-      <w:r>
-        <w:t xml:space="preserve"> </w:t>
-      </w:r>
-      <w:r>
-        <w:t xml:space="preserve">and an entry in</w:t>
-      </w:r>
-      <w:r>
-        <w:t xml:space="preserve"> </w:t>
-      </w:r>
-      <w:r>
-        <w:rPr>
-          <w:rStyle w:val="VerbatimChar"/>
-        </w:rPr>
-        <w:t xml:space="preserve">RESULTS.md</w:t>
-      </w:r>
-      <w:r>
-        <w:t xml:space="preserve">; confidence intervals are cluster</w:t>
-      </w:r>
-      <w:r>
-        <w:t xml:space="preserve"> </w:t>
-      </w:r>
-      <w:r>
-        <w:t xml:space="preserve">bootstraps. References validated with bibtest.</w:t>
-      </w:r>
-    </w:p>
     <w:bookmarkEnd w:id="20"/>
     <w:bookmarkStart w:id="25" w:name="abstract"/>
     <w:p>
@@ -231,13 +179,7 @@
         <w:t xml:space="preserve"> </w:t>
       </w:r>
       <w:r>
-        <w:t xml:space="preserve">the unburnt-fuel emission products. Because no public dataset carries fuel, mechanical-fault labels,</w:t>
-      </w:r>
-      <w:r>
-        <w:t xml:space="preserve"> </w:t>
-      </w:r>
-      <w:r>
-        <w:t xml:space="preserve">and driver behaviour jointly, we adopt a two-arm design on real data: a fleet-telemetry arm on the</w:t>
+        <w:t xml:space="preserve">the unburnt-fuel emission products. No public dataset carries fuel, mechanical-fault labels, and driver behaviour jointly. We therefore adopt a two-arm design on real data: a fleet-telemetry arm on the</w:t>
       </w:r>
       <w:r>
         <w:t xml:space="preserve"> </w:t>
@@ -323,12 +265,24 @@
             </m:r>
           </m:sup>
         </m:sSup>
+        <m:r>
+          <m:rPr>
+            <m:sty m:val="p"/>
+          </m:rPr>
+          <m:t>=</m:t>
+        </m:r>
+        <m:r>
+          <m:rPr>
+            <m:sty m:val="p"/>
+          </m:rPr>
+          <m:t>−</m:t>
+        </m:r>
+        <m:r>
+          <m:t>0.03</m:t>
+        </m:r>
       </m:oMath>
       <w:r>
-        <w:t xml:space="preserve"> </w:t>
-      </w:r>
-      <w:r>
-        <w:t xml:space="preserve">within 0.02 of zero), a silence that survives a trim-corrected</w:t>
+        <w:t xml:space="preserve">), a silence that survives a trim-corrected</w:t>
       </w:r>
       <w:r>
         <w:t xml:space="preserve"> </w:t>
@@ -423,13 +377,7 @@
         </w:numPr>
       </w:pPr>
       <w:r>
-        <w:t xml:space="preserve">A variance decomposition of trip fuel on a 197-vehicle public fleet (14,170 trips after</w:t>
-      </w:r>
-      <w:r>
-        <w:t xml:space="preserve"> </w:t>
-      </w:r>
-      <w:r>
-        <w:t xml:space="preserve">fuel-quality filtering) into behaviour, vehicle-baseline, and environment components, each with</w:t>
+        <w:t xml:space="preserve">A variance decomposition of trip fuel on a public fleet of 194 vehicles (14,170 trips after fuel-quality filtering of the 197-vehicle, 14,460-trip panel) into behaviour, vehicle-baseline, and environment components, each with</w:t>
       </w:r>
       <w:r>
         <w:t xml:space="preserve"> </w:t>
@@ -484,12 +432,24 @@
             </m:r>
           </m:sup>
         </m:sSup>
+        <m:r>
+          <m:rPr>
+            <m:sty m:val="p"/>
+          </m:rPr>
+          <m:t>=</m:t>
+        </m:r>
+        <m:r>
+          <m:rPr>
+            <m:sty m:val="p"/>
+          </m:rPr>
+          <m:t>−</m:t>
+        </m:r>
+        <m:r>
+          <m:t>0.03</m:t>
+        </m:r>
       </m:oMath>
       <w:r>
-        <w:t xml:space="preserve"> </w:t>
-      </w:r>
-      <w:r>
-        <w:t xml:space="preserve">within 0.02 of zero), a silence that survives trim-corrected fuel and the</w:t>
+        <w:t xml:space="preserve">), a silence that survives trim-corrected fuel and the</w:t>
       </w:r>
       <w:r>
         <w:t xml:space="preserve"> </w:t>
@@ -541,13 +501,7 @@
         </w:numPr>
       </w:pPr>
       <w:r>
-        <w:t xml:space="preserve">An account of the field-wide absence of any joint fuel + fault + behaviour dataset, and a</w:t>
-      </w:r>
-      <w:r>
-        <w:t xml:space="preserve"> </w:t>
-      </w:r>
-      <w:r>
-        <w:t xml:space="preserve">reproducible pipeline and paper in which every number traces to a script.</w:t>
+        <w:t xml:space="preserve">A documented survey of the joint fuel + fault + behaviour data gap, and a reproducible pipeline and paper in which every number traces to a script.</w:t>
       </w:r>
     </w:p>
     <w:p>
@@ -564,7 +518,7 @@
               <a:graphicData uri="http://schemas.openxmlformats.org/drawingml/2006/picture">
                 <pic:pic>
                   <pic:nvPicPr>
-                    <pic:cNvPr descr="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" id="23" name="Picture"/>
+                    <pic:cNvPr descr="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" id="23" name="Picture"/>
                     <pic:cNvPicPr>
                       <a:picLocks noChangeArrowheads="1" noChangeAspect="1"/>
                     </pic:cNvPicPr>
@@ -714,7 +668,7 @@
         <w:t xml:space="preserve"> </w:t>
       </w:r>
       <w:r>
-        <w:t xml:space="preserve">task is to decompose that excess into a driver-behaviour component and a vehicle component. Raw fuel</w:t>
+        <w:t xml:space="preserve">task is to decompose that excess into a driver-behaviour component and a vehicle component (the vehicle-baseline defined in Section 4.3). Raw fuel</w:t>
       </w:r>
       <w:r>
         <w:t xml:space="preserve"> </w:t>
@@ -832,7 +786,7 @@
         <w:t xml:space="preserve"> </w:t>
       </w:r>
       <w:r>
-        <w:t xml:space="preserve">gap: the datasets that pair fuel with fault labels lack driver context or ship dimensionality-reduced,</w:t>
+        <w:t xml:space="preserve">gap: the datasets that pair fuel with fault labels lack driver context or ship only dimensionality-reduced features,</w:t>
       </w:r>
       <w:r>
         <w:t xml:space="preserve"> </w:t>
@@ -876,7 +830,7 @@
         <w:pStyle w:val="BodyText"/>
       </w:pPr>
       <w:r>
-        <w:t xml:space="preserve">The evidence chain runs as follows: an expected-fuel model and its variance decomposition establish</w:t>
+        <w:t xml:space="preserve">The evidence chain (Figure 1) runs as follows: an expected-fuel model and its variance decomposition establish</w:t>
       </w:r>
       <w:r>
         <w:t xml:space="preserve"> </w:t>
@@ -2010,7 +1964,7 @@
                 <w:b/>
                 <w:bCs/>
               </w:rPr>
-              <w:t xml:space="preserve">yes (measured, 96%)</w:t>
+              <w:t xml:space="preserve">yes (measured, 95.9%)</w:t>
             </w:r>
           </w:p>
         </w:tc>
@@ -2448,13 +2402,7 @@
         <w:t xml:space="preserve"> </w:t>
       </w:r>
       <w:r>
-        <w:t xml:space="preserve">without drivers. This documented gap is the reason for the two-arm design and the semi-synthetic</w:t>
-      </w:r>
-      <w:r>
-        <w:t xml:space="preserve"> </w:t>
-      </w:r>
-      <w:r>
-        <w:t xml:space="preserve">bridge.</w:t>
+        <w:t xml:space="preserve">without drivers. This documented gap (Table 2) is the reason for the two-arm design and the semi-synthetic bridge.</w:t>
       </w:r>
     </w:p>
     <w:tbl>
@@ -4632,7 +4580,49 @@
         </m:sSub>
       </m:oMath>
       <w:r>
-        <w:t xml:space="preserve">.</w:t>
+        <w:t xml:space="preserve">; here</w:t>
+      </w:r>
+      <w:r>
+        <w:t xml:space="preserve"> </w:t>
+      </w:r>
+      <m:oMath>
+        <m:acc>
+          <m:accPr>
+            <m:chr m:val="‾"/>
+          </m:accPr>
+          <m:e>
+            <m:r>
+              <m:t>e</m:t>
+            </m:r>
+          </m:e>
+        </m:acc>
+      </m:oMath>
+      <w:r>
+        <w:t xml:space="preserve"> </w:t>
+      </w:r>
+      <w:r>
+        <w:t xml:space="preserve">and</w:t>
+      </w:r>
+      <w:r>
+        <w:t xml:space="preserve"> </w:t>
+      </w:r>
+      <m:oMath>
+        <m:acc>
+          <m:accPr>
+            <m:chr m:val="‾"/>
+          </m:accPr>
+          <m:e>
+            <m:r>
+              <m:t>f</m:t>
+            </m:r>
+          </m:e>
+        </m:acc>
+      </m:oMath>
+      <w:r>
+        <w:t xml:space="preserve"> </w:t>
+      </w:r>
+      <w:r>
+        <w:t xml:space="preserve">are the fleet-mean residual and fleet-mean trip fuel.</w:t>
       </w:r>
     </w:p>
     <w:bookmarkEnd w:id="40"/>
@@ -5222,7 +5212,7 @@
         <w:t xml:space="preserve"> </w:t>
       </w:r>
       <w:r>
-        <w:t xml:space="preserve">(from the unrounded shift and standard deviation). A logistic attributor is trained on the two axis-deviations,</w:t>
+        <w:t xml:space="preserve">(from the unrounded shift and standard deviation). A logistic attributor is trained on the two axis-deviations</w:t>
       </w:r>
       <w:r>
         <w:t xml:space="preserve"> </w:t>
@@ -5270,7 +5260,10 @@
         </m:d>
       </m:oMath>
       <w:r>
-        <w:t xml:space="preserve">, under GroupKFold by vehicle; a control classifier that sees only the fuel excess</w:t>
+        <w:t xml:space="preserve"> </w:t>
+      </w:r>
+      <w:r>
+        <w:t xml:space="preserve">together with the vehicle baseline, under GroupKFold by vehicle; a control classifier that sees only the fuel excess</w:t>
       </w:r>
       <w:r>
         <w:t xml:space="preserve"> </w:t>
@@ -5351,19 +5344,7 @@
         <w:t xml:space="preserve"> </w:t>
       </w:r>
       <w:r>
-        <w:t xml:space="preserve">systematic effect is left unattributed when the vehicle is not modelled. Because no cause-labelled</w:t>
-      </w:r>
-      <w:r>
-        <w:t xml:space="preserve"> </w:t>
-      </w:r>
-      <w:r>
-        <w:t xml:space="preserve">trip benchmark exists on real data, these comparisons establish a capability contrast; the</w:t>
-      </w:r>
-      <w:r>
-        <w:t xml:space="preserve"> </w:t>
-      </w:r>
-      <w:r>
-        <w:t xml:space="preserve">quantitative accuracy comparison is the semi-synthetic experiment of Section 4.5.</w:t>
+        <w:t xml:space="preserve">systematic effect is left unattributed when the vehicle is not modelled.</w:t>
       </w:r>
     </w:p>
     <w:bookmarkEnd w:id="43"/>
@@ -5573,7 +5554,7 @@
         <w:pStyle w:val="FirstParagraph"/>
       </w:pPr>
       <w:r>
-        <w:t xml:space="preserve">Decomposing the variance of trip fuel (Table 4) shows that route and environment dominate, that</w:t>
+        <w:t xml:space="preserve">Decomposing the variance of trip fuel (Table 4, Figure 2) shows that route and environment dominate, that</w:t>
       </w:r>
       <w:r>
         <w:t xml:space="preserve"> </w:t>
@@ -6432,19 +6413,13 @@
         <w:t xml:space="preserve"> </w:t>
       </w:r>
       <w:r>
-        <w:t xml:space="preserve">per-driver 0.984, 0.934, 0.992). A random forest reaches 0.79; with only two training drivers per fold</w:t>
-      </w:r>
-      <w:r>
-        <w:t xml:space="preserve"> </w:t>
-      </w:r>
-      <w:r>
-        <w:t xml:space="preserve">the linear model generalizes across drivers better, and we report both. A 1,000-permutation test</w:t>
-      </w:r>
-      <w:r>
-        <w:t xml:space="preserve"> </w:t>
-      </w:r>
-      <w:r>
-        <w:t xml:space="preserve">collapses the AUC to chance (permuted mean 0.471,</w:t>
+        <w:t xml:space="preserve">per-driver 0.984, 0.934, 0.992; Figure 4). A random forest reaches 0.79; with only two training drivers per fold</w:t>
+      </w:r>
+      <w:r>
+        <w:t xml:space="preserve"> </w:t>
+      </w:r>
+      <w:r>
+        <w:t xml:space="preserve">the linear model generalizes across drivers better, and we report both. Under a 1,000-permutation test the label-permuted AUC falls to chance (mean 0.471), placing the real AUC at</w:t>
       </w:r>
       <w:r>
         <w:t xml:space="preserve"> </w:t>
@@ -6457,14 +6432,14 @@
           <m:rPr>
             <m:sty m:val="p"/>
           </m:rPr>
-          <m:t>≤</m:t>
+          <m:t>=</m:t>
         </m:r>
         <m:r>
           <m:t>0.001</m:t>
         </m:r>
       </m:oMath>
       <w:r>
-        <w:t xml:space="preserve">). This validates that the kinematic</w:t>
+        <w:t xml:space="preserve">. This validates that the kinematic</w:t>
       </w:r>
       <w:r>
         <w:t xml:space="preserve"> </w:t>
@@ -6584,13 +6559,7 @@
         <w:t xml:space="preserve"> </w:t>
       </w:r>
       <w:r>
-        <w:t xml:space="preserve">deviation of 0.20 L/100km, so the baseline is well calibrated. Scoring the faults (Table 5), only the</w:t>
-      </w:r>
-      <w:r>
-        <w:t xml:space="preserve"> </w:t>
-      </w:r>
-      <w:r>
-        <w:t xml:space="preserve">rich mixture burns measurably more:</w:t>
+        <w:t xml:space="preserve">deviation of 0.20 L/100km, so the baseline is well calibrated. Scoring the faults (Table 5, Figure 5), only the rich mixture burns measurably more:</w:t>
       </w:r>
       <w:r>
         <w:t xml:space="preserve"> </w:t>
@@ -6600,7 +6569,7 @@
           <w:b/>
           <w:bCs/>
         </w:rPr>
-        <w:t xml:space="preserve">+0.498 L/100km, or +6.2%</w:t>
+        <w:t xml:space="preserve">+0.50 L/100km, or +6.2%</w:t>
       </w:r>
       <w:r>
         <w:t xml:space="preserve"> </w:t>
@@ -6811,7 +6780,7 @@
               <w:jc w:val="left"/>
             </w:pPr>
             <w:r>
-              <w:t xml:space="preserve">+0.498</w:t>
+              <w:t xml:space="preserve">+0.50</w:t>
             </w:r>
           </w:p>
         </w:tc>
@@ -7159,13 +7128,7 @@
         <w:pStyle w:val="FirstParagraph"/>
       </w:pPr>
       <w:r>
-        <w:t xml:space="preserve">Regressing each excess on each axis (Table 6) gives the central qualitative result. The kinematic</w:t>
-      </w:r>
-      <w:r>
-        <w:t xml:space="preserve"> </w:t>
-      </w:r>
-      <w:r>
-        <w:t xml:space="preserve">axis explains driver-caused excess (held-out</w:t>
+        <w:t xml:space="preserve">Regressing each excess on each axis (Table 6, Figure 6) gives the central qualitative result. The kinematic axis explains driver-caused excess (held-out</w:t>
       </w:r>
       <w:r>
         <w:t xml:space="preserve"> </w:t>
@@ -7190,7 +7153,7 @@
           <m:t>=</m:t>
         </m:r>
         <m:r>
-          <m:t>0.107</m:t>
+          <m:t>0.084</m:t>
         </m:r>
       </m:oMath>
       <w:r>
@@ -7279,18 +7242,6 @@
       <w:r>
         <w:t xml:space="preserve">).</w:t>
       </w:r>
-      <w:r>
-        <w:t xml:space="preserve"> </w:t>
-      </w:r>
-      <w:r>
-        <w:t xml:space="preserve">This reproduces, as an independent consistency check, an earlier finding that per-vehicle fuel</w:t>
-      </w:r>
-      <w:r>
-        <w:t xml:space="preserve"> </w:t>
-      </w:r>
-      <w:r>
-        <w:t xml:space="preserve">residual does not track fuel-trim drift on VED.</w:t>
-      </w:r>
     </w:p>
     <w:tbl>
       <w:tblPr>
@@ -7365,7 +7316,7 @@
               <w:jc w:val="left"/>
             </w:pPr>
             <w:r>
-              <w:t xml:space="preserve">0.107</w:t>
+              <w:t xml:space="preserve">0.084</w:t>
             </w:r>
           </w:p>
         </w:tc>
@@ -7665,7 +7616,7 @@
               <a:graphicData uri="http://schemas.openxmlformats.org/drawingml/2006/picture">
                 <pic:pic>
                   <pic:nvPicPr>
-                    <pic:cNvPr descr="figures/fig2_double_dissociation.png" id="65" name="Picture"/>
+                    <pic:cNvPr descr="figures/signature_contrast.png" id="65" name="Picture"/>
                     <pic:cNvPicPr>
                       <a:picLocks noChangeArrowheads="1" noChangeAspect="1"/>
                     </pic:cNvPicPr>
@@ -8613,25 +8564,7 @@
         <w:t xml:space="preserve"> </w:t>
       </w:r>
       <w:r>
-        <w:t xml:space="preserve">accumulated wear, and accessory load. That VED cannot resolve this further is itself informative: the</w:t>
-      </w:r>
-      <w:r>
-        <w:t xml:space="preserve"> </w:t>
-      </w:r>
-      <w:r>
-        <w:t xml:space="preserve">fleet is healthy, its fuel trims are small, and the trims do not track efficiency, which is why the</w:t>
-      </w:r>
-      <w:r>
-        <w:t xml:space="preserve"> </w:t>
-      </w:r>
-      <w:r>
-        <w:t xml:space="preserve">malfunction side of the attribution is anchored on a controlled bench rather than observed in the</w:t>
-      </w:r>
-      <w:r>
-        <w:t xml:space="preserve"> </w:t>
-      </w:r>
-      <w:r>
-        <w:t xml:space="preserve">fleet. Attribution here identifies</w:t>
+        <w:t xml:space="preserve">accumulated wear, and accessory load. That VED cannot resolve this further is itself informative: the fleet is healthy, which is why the malfunction side of the attribution is anchored on a controlled bench rather than observed in the fleet. Attribution here identifies</w:t>
       </w:r>
       <w:r>
         <w:t xml:space="preserve"> </w:t>
@@ -8671,13 +8604,7 @@
         <w:pStyle w:val="FirstParagraph"/>
       </w:pPr>
       <w:r>
-        <w:t xml:space="preserve">The two-arm design is a response to a missing dataset, and naming what would close the gap turns the</w:t>
-      </w:r>
-      <w:r>
-        <w:t xml:space="preserve"> </w:t>
-      </w:r>
-      <w:r>
-        <w:t xml:space="preserve">limitation into an agenda: a fleet logged with true fuel-flow meters, OBD trims, driver identifiers,</w:t>
+        <w:t xml:space="preserve">Naming what would close the joint-data gap (Section 3.4) turns it into an agenda: a fleet logged with true fuel-flow meters, OBD trims, driver identifiers,</w:t>
       </w:r>
       <w:r>
         <w:t xml:space="preserve"> </w:t>
@@ -8846,19 +8773,7 @@
         <w:t xml:space="preserve"> </w:t>
       </w:r>
       <w:r>
-        <w:t xml:space="preserve">excess is transient and kinematic, malfunction excess is steady-state and combustion-linked. On a</w:t>
-      </w:r>
-      <w:r>
-        <w:t xml:space="preserve"> </w:t>
-      </w:r>
-      <w:r>
-        <w:t xml:space="preserve">197-vehicle public fleet, behaviour and a persistent vehicle-baseline account for measurable 8% and</w:t>
-      </w:r>
-      <w:r>
-        <w:t xml:space="preserve"> </w:t>
-      </w:r>
-      <w:r>
-        <w:t xml:space="preserve">14% shares of trip-fuel variance; on a controlled bench, a rich-mixture fault burns 6.2% more with an</w:t>
+        <w:t xml:space="preserve">excess is transient and kinematic, malfunction excess is steady-state and combustion-linked. On a 194-vehicle public fleet, behaviour and a persistent vehicle-baseline account for measurable 8% and 14% shares of trip-fuel variance; on a controlled bench, a rich-mixture fault burns 6.2% more with an</w:t>
       </w:r>
       <w:r>
         <w:t xml:space="preserve"> </w:t>
@@ -8990,7 +8905,7 @@
         <w:rPr>
           <w:rStyle w:val="VerbatimChar"/>
         </w:rPr>
-        <w:t xml:space="preserve">scripts/p9_bench_behav.py</w:t>
+        <w:t xml:space="preserve">scripts/p10_consolidated.py</w:t>
       </w:r>
       <w:r>
         <w:t xml:space="preserve">), results log (</w:t>
@@ -9071,14 +8986,6 @@
       </w:pPr>
       <w:r>
         <w:t xml:space="preserve">References</w:t>
-      </w:r>
-    </w:p>
-    <w:p>
-      <w:pPr>
-        <w:pStyle w:val="Bibliography"/>
-      </w:pPr>
-      <w:r>
-        <w:t xml:space="preserve">All entries validated against Crossref/OpenAlex/DataCite (bibtest).</w:t>
       </w:r>
     </w:p>
     <w:p>
@@ -10151,40 +10058,7 @@
         <w:pStyle w:val="Bibliography"/>
       </w:pPr>
       <w:r>
-        <w:t xml:space="preserve">Full-length working draft. Every filled number traces to a script in</w:t>
-      </w:r>
-      <w:r>
-        <w:t xml:space="preserve"> </w:t>
-      </w:r>
-      <w:r>
-        <w:rPr>
-          <w:rStyle w:val="VerbatimChar"/>
-        </w:rPr>
-        <w:t xml:space="preserve">scripts/</w:t>
-      </w:r>
-      <w:r>
-        <w:t xml:space="preserve"> </w:t>
-      </w:r>
-      <w:r>
-        <w:t xml:space="preserve">and an</w:t>
-      </w:r>
-      <w:r>
-        <w:t xml:space="preserve"> </w:t>
-      </w:r>
-      <w:r>
-        <w:t xml:space="preserve">entry in</w:t>
-      </w:r>
-      <w:r>
-        <w:t xml:space="preserve"> </w:t>
-      </w:r>
-      <w:r>
-        <w:rPr>
-          <w:rStyle w:val="VerbatimChar"/>
-        </w:rPr>
-        <w:t xml:space="preserve">RESULTS.md</w:t>
-      </w:r>
-      <w:r>
-        <w:t xml:space="preserve">. © 2026 Alexander Apartsin and Yehudit Aperstein.</w:t>
+        <w:t xml:space="preserve">© 2026 Alexander Apartsin and Yehudit Aperstein.</w:t>
       </w:r>
     </w:p>
     <w:bookmarkEnd w:id="137"/>

</xml_diff>

<commit_message>
EAAI-review revision: new experiments + reframing
Experiments (scripts p11/p12): E1 cross-fit vehicle baseline (held-out 0.14, split-half r=0.95 -> real, not in-sample artifact); E9 model comparison (ridge 0.663 vs HGB 0.673); E10 leakage ablation (+RPM/load ->0.738); E2 trim STFT/LTFT-separate + additive/multiplicative (silence robust); E7 bench blocked CV (0.903 -> -0.48 leave-region-out; deploy subset 0.12); E8 counterfactual percentile sensitivity.

Reframing: retitle to 'Multi-Source Signature Attribution ... Under Missing Joint Cause Labels'; fuel trims described as fueling-correction (not direct AFR); 95.9% qualified as calibrated semi-synthetic; monotonicity relabelled internal face-validity; vehicle-baseline = persistent vehicle-associated residual (cross-fit paragraph); weak-supervision framing + Vucinic 2026 and Zhou 2018 refs (25 total, bibtest-valid); results.json provenance file.
</commit_message>
<xml_diff>
--- a/FuelAnomalies.docx
+++ b/FuelAnomalies.docx
@@ -25,7 +25,13 @@
         <w:t xml:space="preserve"> </w:t>
       </w:r>
       <w:r>
-        <w:t xml:space="preserve">Signature-Based</w:t>
+        <w:t xml:space="preserve">Multi-Source</w:t>
+      </w:r>
+      <w:r>
+        <w:t xml:space="preserve"> </w:t>
+      </w:r>
+      <w:r>
+        <w:t xml:space="preserve">Signature</w:t>
       </w:r>
       <w:r>
         <w:t xml:space="preserve"> </w:t>
@@ -51,26 +57,20 @@
       <w:r>
         <w:t xml:space="preserve">Fuel</w:t>
       </w:r>
-      <w:r>
-        <w:t xml:space="preserve"> </w:t>
-      </w:r>
-      <w:r>
-        <w:t xml:space="preserve">Consumption</w:t>
-      </w:r>
-    </w:p>
-    <w:bookmarkStart w:id="20" w:name="Xb86f25cd334bec3280bd4d2fc6af5404396d8df"/>
+    </w:p>
+    <w:bookmarkStart w:id="20" w:name="X524239ff30af4a85c14a5e9e77d6e5a662b8d5d"/>
     <w:p>
       <w:pPr>
         <w:pStyle w:val="Heading1"/>
       </w:pPr>
       <w:r>
-        <w:t xml:space="preserve">Driver or Vehicle? Signature-Based Attribution of Excess Fuel Consumption</w:t>
+        <w:t xml:space="preserve">Driver or Vehicle? Multi-Source Signature Attribution of Excess Fuel Consumption</w:t>
       </w:r>
       <w:r>
         <w:br/>
       </w:r>
       <w:r>
-        <w:t xml:space="preserve">Using Public Fleet Telemetry and an Engine-Fault Bench</w:t>
+        <w:t xml:space="preserve">Under Missing Joint Cause Labels</w:t>
       </w:r>
     </w:p>
     <w:p>
@@ -294,19 +294,7 @@
         <w:t xml:space="preserve"> </w:t>
       </w:r>
       <w:r>
-        <w:t xml:space="preserve">causes raise fuel by the same amount so that magnitude is uninformative, the signature attributes</w:t>
-      </w:r>
-      <w:r>
-        <w:t xml:space="preserve"> </w:t>
-      </w:r>
-      <w:r>
-        <w:t xml:space="preserve">driver-versus-fault excess at 95.9% accuracy (95% CI [95.6, 96.2]) against a fuel-only baseline at</w:t>
-      </w:r>
-      <w:r>
-        <w:t xml:space="preserve"> </w:t>
-      </w:r>
-      <w:r>
-        <w:t xml:space="preserve">chance. Both axes derive from</w:t>
+        <w:t xml:space="preserve">causes raise fuel by the same amount so that magnitude is uninformative, the signature attributes driver-versus-fault excess at 95.9% accuracy (95% CI [95.6, 96.2]) in a calibrated semi-synthetic test, against a fuel-only baseline at chance. Both axes derive from</w:t>
       </w:r>
       <w:r>
         <w:t xml:space="preserve"> </w:t>
@@ -1369,13 +1357,42 @@
         <w:t xml:space="preserve"> </w:t>
       </w:r>
       <w:r>
-        <w:t xml:space="preserve">-vehicle cause. Fuel theft or leakage is a related but distinct anomaly, detected as an abrupt change</w:t>
-      </w:r>
-      <w:r>
-        <w:t xml:space="preserve"> </w:t>
-      </w:r>
-      <w:r>
-        <w:t xml:space="preserve">point [</w:t>
+        <w:t xml:space="preserve">-vehicle cause. Closest in spirit, recent work detects anomalies in OBD snapshots and adds a</w:t>
+      </w:r>
+      <w:r>
+        <w:t xml:space="preserve"> </w:t>
+      </w:r>
+      <w:r>
+        <w:t xml:space="preserve">SHAP-based cause investigation with synthetically generated anomalies [</w:t>
+      </w:r>
+      <w:hyperlink w:anchor="r24">
+        <w:r>
+          <w:rPr>
+            <w:rStyle w:val="Hyperlink"/>
+          </w:rPr>
+          <w:t xml:space="preserve">24</w:t>
+        </w:r>
+      </w:hyperlink>
+      <w:r>
+        <w:t xml:space="preserve">]; it</w:t>
+      </w:r>
+      <w:r>
+        <w:t xml:space="preserve"> </w:t>
+      </w:r>
+      <w:r>
+        <w:t xml:space="preserve">investigates which features drive a flagged anomaly, whereas we attribute the competing driver-versus</w:t>
+      </w:r>
+      <w:r>
+        <w:t xml:space="preserve"> </w:t>
+      </w:r>
+      <w:r>
+        <w:t xml:space="preserve">-vehicle cause across heterogeneous datasets that carry no joint naturalistic cause labels. Fuel theft</w:t>
+      </w:r>
+      <w:r>
+        <w:t xml:space="preserve"> </w:t>
+      </w:r>
+      <w:r>
+        <w:t xml:space="preserve">or leakage is a related but distinct anomaly, detected as an abrupt change point [</w:t>
       </w:r>
       <w:hyperlink w:anchor="r10">
         <w:r>
@@ -1386,13 +1403,13 @@
         </w:r>
       </w:hyperlink>
       <w:r>
-        <w:t xml:space="preserve">]; that is a sudden step in fuel level, whereas the excess we attribute is</w:t>
-      </w:r>
-      <w:r>
-        <w:t xml:space="preserve"> </w:t>
-      </w:r>
-      <w:r>
-        <w:t xml:space="preserve">a sustained efficiency shift.</w:t>
+        <w:t xml:space="preserve">];</w:t>
+      </w:r>
+      <w:r>
+        <w:t xml:space="preserve"> </w:t>
+      </w:r>
+      <w:r>
+        <w:t xml:space="preserve">that is a sudden step in fuel level, whereas the excess we attribute is a sustained efficiency shift.</w:t>
       </w:r>
     </w:p>
     <w:bookmarkEnd w:id="30"/>
@@ -1506,7 +1523,36 @@
         <w:t xml:space="preserve"> </w:t>
       </w:r>
       <w:r>
-        <w:t xml:space="preserve">attribution.</w:t>
+        <w:t xml:space="preserve">attribution. Methodologically the setting is a form of weak supervision [</w:t>
+      </w:r>
+      <w:hyperlink w:anchor="r25">
+        <w:r>
+          <w:rPr>
+            <w:rStyle w:val="Hyperlink"/>
+          </w:rPr>
+          <w:t xml:space="preserve">25</w:t>
+        </w:r>
+      </w:hyperlink>
+      <w:r>
+        <w:t xml:space="preserve">]: the</w:t>
+      </w:r>
+      <w:r>
+        <w:t xml:space="preserve"> </w:t>
+      </w:r>
+      <w:r>
+        <w:t xml:space="preserve">target fleet carries the outcome but no cause labels, while each competing cause is labelled only in a</w:t>
+      </w:r>
+      <w:r>
+        <w:t xml:space="preserve"> </w:t>
+      </w:r>
+      <w:r>
+        <w:t xml:space="preserve">separate source domain with its own feature space, so cause-specific signatures must be learned from</w:t>
+      </w:r>
+      <w:r>
+        <w:t xml:space="preserve"> </w:t>
+      </w:r>
+      <w:r>
+        <w:t xml:space="preserve">the sources and combined on the target without joint supervision.</w:t>
       </w:r>
     </w:p>
     <w:tbl>
@@ -4678,19 +4724,7 @@
         <w:t xml:space="preserve"> </w:t>
       </w:r>
       <w:r>
-        <w:t xml:space="preserve">measures the deviation of the air-fuel ratio from stoichiometric. The</w:t>
-      </w:r>
-      <w:r>
-        <w:t xml:space="preserve"> </w:t>
-      </w:r>
-      <w:r>
-        <w:t xml:space="preserve">combustion axis is observable in both worlds and placed on a common percent-fuel-per-air scale: in</w:t>
-      </w:r>
-      <w:r>
-        <w:t xml:space="preserve"> </w:t>
-      </w:r>
-      <w:r>
-        <w:t xml:space="preserve">VED as the fuel trims,</w:t>
+        <w:t xml:space="preserve">measures the deviation of the air-fuel ratio from stoichiometric. On the bench the axis is the air-fuel-ratio deviation directly. In VED the observable is the short- and long-term fuel trims, which are the engine control unit's feedback corrections to the base fuel schedule rather than a direct air-fuel-ratio measurement; we therefore treat the VED side as a fueling-correction signal,</w:t>
       </w:r>
       <w:r>
         <w:t xml:space="preserve"> </w:t>
@@ -4740,13 +4774,7 @@
         </m:r>
       </m:oMath>
       <w:r>
-        <w:t xml:space="preserve">, and on the bench directly from the</w:t>
-      </w:r>
-      <w:r>
-        <w:t xml:space="preserve"> </w:t>
-      </w:r>
-      <w:r>
-        <w:t xml:space="preserve">air-fuel ratio,</w:t>
+        <w:t xml:space="preserve">, placed on a common percent-fuel-per-air scale with the bench,</w:t>
       </w:r>
     </w:p>
     <w:p>
@@ -5441,7 +5469,86 @@
         <w:t xml:space="preserve"> </w:t>
       </w:r>
       <w:r>
-        <w:t xml:space="preserve">pipeline scripts regenerate every number.</w:t>
+        <w:t xml:space="preserve">pipeline scripts regenerate every number. The expected-fuel conclusions are not specific to the</w:t>
+      </w:r>
+      <w:r>
+        <w:t xml:space="preserve"> </w:t>
+      </w:r>
+      <w:r>
+        <w:t xml:space="preserve">gradient-boosted model: under the same vehicle-grouped protocol a ridge baseline reaches</w:t>
+      </w:r>
+      <w:r>
+        <w:t xml:space="preserve"> </w:t>
+      </w:r>
+      <m:oMath>
+        <m:sSup>
+          <m:e>
+            <m:r>
+              <m:t>R</m:t>
+            </m:r>
+          </m:e>
+          <m:sup>
+            <m:r>
+              <m:t>2</m:t>
+            </m:r>
+          </m:sup>
+        </m:sSup>
+        <m:r>
+          <m:rPr>
+            <m:sty m:val="p"/>
+          </m:rPr>
+          <m:t>=</m:t>
+        </m:r>
+        <m:r>
+          <m:t>0.663</m:t>
+        </m:r>
+      </m:oMath>
+      <w:r>
+        <w:t xml:space="preserve"> </w:t>
+      </w:r>
+      <w:r>
+        <w:t xml:space="preserve">and a random forest 0.640, against the boosted model's 0.673 and a mean predictor's</w:t>
+      </w:r>
+      <w:r>
+        <w:t xml:space="preserve"> </w:t>
+      </w:r>
+      <w:r>
+        <w:t xml:space="preserve">0.00. Engine-state channels (RPM, load) are deliberately excluded from the expected-fuel model; adding</w:t>
+      </w:r>
+      <w:r>
+        <w:t xml:space="preserve"> </w:t>
+      </w:r>
+      <w:r>
+        <w:t xml:space="preserve">them raises predictive</w:t>
+      </w:r>
+      <w:r>
+        <w:t xml:space="preserve"> </w:t>
+      </w:r>
+      <m:oMath>
+        <m:sSup>
+          <m:e>
+            <m:r>
+              <m:t>R</m:t>
+            </m:r>
+          </m:e>
+          <m:sup>
+            <m:r>
+              <m:t>2</m:t>
+            </m:r>
+          </m:sup>
+        </m:sSup>
+      </m:oMath>
+      <w:r>
+        <w:t xml:space="preserve"> </w:t>
+      </w:r>
+      <w:r>
+        <w:t xml:space="preserve">to 0.738 but they are engine outputs rather than driver inputs, and</w:t>
+      </w:r>
+      <w:r>
+        <w:t xml:space="preserve"> </w:t>
+      </w:r>
+      <w:r>
+        <w:t xml:space="preserve">their inclusion would let the predictor absorb part of the diagnostic signature we aim to isolate.</w:t>
       </w:r>
     </w:p>
     <w:bookmarkEnd w:id="45"/>
@@ -5591,6 +5698,100 @@
       </w:r>
       <w:r>
         <w:t xml:space="preserve">a model that does not represent the vehicle.</w:t>
+      </w:r>
+    </w:p>
+    <w:p>
+      <w:pPr>
+        <w:pStyle w:val="BodyText"/>
+      </w:pPr>
+      <w:r>
+        <w:t xml:space="preserve">The vehicle-baseline is not an in-sample artifact of estimating a group mean from the same trips it is</w:t>
+      </w:r>
+      <w:r>
+        <w:t xml:space="preserve"> </w:t>
+      </w:r>
+      <w:r>
+        <w:t xml:space="preserve">scored on. Estimating each vehicle's offset on one random half of its trips and evaluating the fuel</w:t>
+      </w:r>
+      <w:r>
+        <w:t xml:space="preserve"> </w:t>
+      </w:r>
+      <w:r>
+        <w:t xml:space="preserve">variance it explains on the held-out half gives a cross-fitted share of</w:t>
+      </w:r>
+      <w:r>
+        <w:t xml:space="preserve"> </w:t>
+      </w:r>
+      <w:r>
+        <w:rPr>
+          <w:b/>
+          <w:bCs/>
+        </w:rPr>
+        <w:t xml:space="preserve">0.136–0.138</w:t>
+      </w:r>
+      <w:r>
+        <w:t xml:space="preserve"> </w:t>
+      </w:r>
+      <w:r>
+        <w:t xml:space="preserve">(stable across a minimum of 5, 10, 15, or 20 trips per vehicle), essentially unchanged from the</w:t>
+      </w:r>
+      <w:r>
+        <w:t xml:space="preserve"> </w:t>
+      </w:r>
+      <w:r>
+        <w:t xml:space="preserve">0.143 in-sample value, and an empirical-Bayes shrinkage estimate agrees (0.138). The offsets are</w:t>
+      </w:r>
+      <w:r>
+        <w:t xml:space="preserve"> </w:t>
+      </w:r>
+      <w:r>
+        <w:t xml:space="preserve">highly reliable: the split-half correlation of per-vehicle baselines is</w:t>
+      </w:r>
+      <w:r>
+        <w:t xml:space="preserve"> </w:t>
+      </w:r>
+      <w:r>
+        <w:rPr>
+          <w:b/>
+          <w:bCs/>
+        </w:rPr>
+        <w:t xml:space="preserve">r = 0.95</w:t>
+      </w:r>
+      <w:r>
+        <w:t xml:space="preserve"> </w:t>
+      </w:r>
+      <w:r>
+        <w:t xml:space="preserve">(160 vehicles</w:t>
+      </w:r>
+      <w:r>
+        <w:t xml:space="preserve"> </w:t>
+      </w:r>
+      <w:r>
+        <w:t xml:space="preserve">with at least ten trips). A persistent, statistically stable per-vehicle component therefore survives</w:t>
+      </w:r>
+      <w:r>
+        <w:t xml:space="preserve"> </w:t>
+      </w:r>
+      <w:r>
+        <w:t xml:space="preserve">honest out-of-sample estimation. We label it a persistent vehicle-associated residual, not a verified</w:t>
+      </w:r>
+      <w:r>
+        <w:t xml:space="preserve"> </w:t>
+      </w:r>
+      <w:r>
+        <w:t xml:space="preserve">malfunction: VED has effectively one driver per vehicle, so it cannot separate a vehicle's mechanical</w:t>
+      </w:r>
+      <w:r>
+        <w:t xml:space="preserve"> </w:t>
+      </w:r>
+      <w:r>
+        <w:t xml:space="preserve">state from its habitual driver and routes (Section 10); the malfunction side of the attribution is</w:t>
+      </w:r>
+      <w:r>
+        <w:t xml:space="preserve"> </w:t>
+      </w:r>
+      <w:r>
+        <w:t xml:space="preserve">anchored on the controlled bench, where the fault is actually induced.</w:t>
       </w:r>
     </w:p>
     <w:tbl>
@@ -6083,25 +6284,7 @@
         <w:t xml:space="preserve"> </w:t>
       </w:r>
       <w:r>
-        <w:t xml:space="preserve">fuel), rising to 1.59 at the 90th percentile. The component increases with independently measured</w:t>
-      </w:r>
-      <w:r>
-        <w:t xml:space="preserve"> </w:t>
-      </w:r>
-      <w:r>
-        <w:t xml:space="preserve">aggression: across deciles of harsh-event rate its mean rises from 0.34 to 1.55 L/100km (Figure 3),</w:t>
-      </w:r>
-      <w:r>
-        <w:t xml:space="preserve"> </w:t>
-      </w:r>
-      <w:r>
-        <w:t xml:space="preserve">monotone from the median upward, with a Spearman rank correlation of 0.96 across deciles</w:t>
-      </w:r>
-      <w:r>
-        <w:t xml:space="preserve"> </w:t>
-      </w:r>
-      <w:r>
-        <w:t xml:space="preserve">(</w:t>
+        <w:t xml:space="preserve">fuel), rising to 1.59 at the 90th percentile. The component increases across deciles of the harsh-event rate (Figure 3): its mean rises from 0.34 to 1.55 L/100km, monotone from the median upward, with a Spearman rank correlation of 0.96 across deciles (</w:t>
       </w:r>
       <m:oMath>
         <m:r>
@@ -6127,13 +6310,13 @@
               <m:t>−</m:t>
             </m:r>
             <m:r>
-              <m:t>5</m:t>
+              <m:t>4</m:t>
             </m:r>
           </m:sup>
         </m:sSup>
       </m:oMath>
       <w:r>
-        <w:t xml:space="preserve">). The magnitude is consistent with the 5-15% eco-driving range in the literature</w:t>
+        <w:t xml:space="preserve">). Because the harsh-event rate is itself an input to the behaviour features, this is an internal face-validity check; the independent validation is the external dataset of Section 6.3. The magnitude is consistent with the 5-15% eco-driving range in the literature</w:t>
       </w:r>
       <w:r>
         <w:t xml:space="preserve"> </w:t>
@@ -7555,7 +7738,69 @@
         <w:t xml:space="preserve"> </w:t>
       </w:r>
       <w:r>
-        <w:t xml:space="preserve">air-fuel-ratio transform misses the emission channels. We therefore treat this cell as a physical</w:t>
+        <w:t xml:space="preserve">air-fuel-ratio transform misses the emission channels. It is also interpolation, not generalization:</w:t>
+      </w:r>
+      <w:r>
+        <w:t xml:space="preserve"> </w:t>
+      </w:r>
+      <w:r>
+        <w:t xml:space="preserve">under leave-operating-region-out cross-validation (RPM×power terciles) the all-sensor fit falls</w:t>
+      </w:r>
+      <w:r>
+        <w:t xml:space="preserve"> </w:t>
+      </w:r>
+      <w:r>
+        <w:t xml:space="preserve">to</w:t>
+      </w:r>
+      <w:r>
+        <w:t xml:space="preserve"> </w:t>
+      </w:r>
+      <m:oMath>
+        <m:sSup>
+          <m:e>
+            <m:r>
+              <m:t>R</m:t>
+            </m:r>
+          </m:e>
+          <m:sup>
+            <m:r>
+              <m:t>2</m:t>
+            </m:r>
+          </m:sup>
+        </m:sSup>
+        <m:r>
+          <m:rPr>
+            <m:sty m:val="p"/>
+          </m:rPr>
+          <m:t>=</m:t>
+        </m:r>
+        <m:r>
+          <m:rPr>
+            <m:sty m:val="p"/>
+          </m:rPr>
+          <m:t>−</m:t>
+        </m:r>
+        <m:r>
+          <m:t>0.48</m:t>
+        </m:r>
+      </m:oMath>
+      <w:r>
+        <w:t xml:space="preserve"> </w:t>
+      </w:r>
+      <w:r>
+        <w:t xml:space="preserve">and a deployment-transferable subset (air-fuel ratio, lambda, oxygen; excluding the</w:t>
+      </w:r>
+      <w:r>
+        <w:t xml:space="preserve"> </w:t>
+      </w:r>
+      <w:r>
+        <w:t xml:space="preserve">bench-only CO and HC analyzers) to 0.12, so the 0.903 reflects near-neighbour operating points rather</w:t>
+      </w:r>
+      <w:r>
+        <w:t xml:space="preserve"> </w:t>
+      </w:r>
+      <w:r>
+        <w:t xml:space="preserve">than a portable predictor. We therefore treat this cell as a physical</w:t>
       </w:r>
       <w:r>
         <w:t xml:space="preserve"> </w:t>
@@ -8197,7 +8442,94 @@
         <w:t xml:space="preserve"> </w:t>
       </w:r>
       <w:r>
-        <w:t xml:space="preserve">fleet (median 1.5%, 90th percentile 11%).</w:t>
+        <w:t xml:space="preserve">fleet (median 1.5%, 90th percentile 11%). The result is also robust to how the fueling-correction</w:t>
+      </w:r>
+      <w:r>
+        <w:t xml:space="preserve"> </w:t>
+      </w:r>
+      <w:r>
+        <w:t xml:space="preserve">signal is treated: the short- and long-term trims are individually uninformative for driver-excess</w:t>
+      </w:r>
+      <w:r>
+        <w:t xml:space="preserve"> </w:t>
+      </w:r>
+      <w:r>
+        <w:t xml:space="preserve">(</w:t>
+      </w:r>
+      <m:oMath>
+        <m:sSup>
+          <m:e>
+            <m:r>
+              <m:t>R</m:t>
+            </m:r>
+          </m:e>
+          <m:sup>
+            <m:r>
+              <m:t>2</m:t>
+            </m:r>
+          </m:sup>
+        </m:sSup>
+        <m:r>
+          <m:rPr>
+            <m:sty m:val="p"/>
+          </m:rPr>
+          <m:t>=</m:t>
+        </m:r>
+        <m:r>
+          <m:t>0.019</m:t>
+        </m:r>
+      </m:oMath>
+      <w:r>
+        <w:t xml:space="preserve"> </w:t>
+      </w:r>
+      <w:r>
+        <w:t xml:space="preserve">and</w:t>
+      </w:r>
+      <w:r>
+        <w:t xml:space="preserve"> </w:t>
+      </w:r>
+      <m:oMath>
+        <m:r>
+          <m:rPr>
+            <m:sty m:val="p"/>
+          </m:rPr>
+          <m:t>−</m:t>
+        </m:r>
+        <m:r>
+          <m:t>0.051</m:t>
+        </m:r>
+      </m:oMath>
+      <w:r>
+        <w:t xml:space="preserve">), and an additive versus multiplicative trim correction changes the</w:t>
+      </w:r>
+      <w:r>
+        <w:t xml:space="preserve"> </w:t>
+      </w:r>
+      <w:r>
+        <w:t xml:space="preserve">fuel target by a median of 0.002 L/100km and the combustion</w:t>
+      </w:r>
+      <w:r>
+        <w:t xml:space="preserve"> </w:t>
+      </w:r>
+      <m:oMath>
+        <m:sSup>
+          <m:e>
+            <m:r>
+              <m:t>R</m:t>
+            </m:r>
+          </m:e>
+          <m:sup>
+            <m:r>
+              <m:t>2</m:t>
+            </m:r>
+          </m:sup>
+        </m:sSup>
+      </m:oMath>
+      <w:r>
+        <w:t xml:space="preserve"> </w:t>
+      </w:r>
+      <w:r>
+        <w:t xml:space="preserve">by less than 0.01.</w:t>
       </w:r>
     </w:p>
     <w:bookmarkEnd w:id="72"/>
@@ -8791,7 +9123,7 @@
         <w:t xml:space="preserve"> </w:t>
       </w:r>
       <w:r>
-        <w:t xml:space="preserve">uninformative, the signature attributes the cause at 95.9% accuracy where magnitude alone is at chance.</w:t>
+        <w:t xml:space="preserve">uninformative, the signature attributes the cause at 95.9% accuracy in a calibrated semi-synthetic evaluation, where magnitude alone is at chance.</w:t>
       </w:r>
       <w:r>
         <w:t xml:space="preserve"> </w:t>
@@ -8979,7 +9311,7 @@
       </w:r>
     </w:p>
     <w:bookmarkEnd w:id="91"/>
-    <w:bookmarkStart w:id="137" w:name="refs"/>
+    <w:bookmarkStart w:id="141" w:name="refs"/>
     <w:p>
       <w:pPr>
         <w:pStyle w:val="Heading2"/>
@@ -10055,13 +10387,109 @@
     </w:p>
     <w:p>
       <w:pPr>
+        <w:pStyle w:val="Compact"/>
+        <w:numPr>
+          <w:ilvl w:val="0"/>
+          <w:numId w:val="1002"/>
+        </w:numPr>
+      </w:pPr>
+      <w:bookmarkStart w:id="138" w:name="r24"/>
+      <w:r>
+        <w:t xml:space="preserve">V. Vučinić et al. Anomaly Detection for Vehicle Diagnostics Based on OBD</w:t>
+      </w:r>
+      <w:r>
+        <w:t xml:space="preserve"> </w:t>
+      </w:r>
+      <w:r>
+        <w:t xml:space="preserve">Snapshots With Cause Investigation.</w:t>
+      </w:r>
+      <w:r>
+        <w:t xml:space="preserve"> </w:t>
+      </w:r>
+      <w:r>
+        <w:rPr>
+          <w:i/>
+          <w:iCs/>
+        </w:rPr>
+        <w:t xml:space="preserve">IEEE Access</w:t>
+      </w:r>
+      <w:r>
+        <w:t xml:space="preserve">, 14:24765–24785, 2026.</w:t>
+      </w:r>
+      <w:r>
+        <w:t xml:space="preserve"> </w:t>
+      </w:r>
+      <w:hyperlink r:id="rId137">
+        <w:r>
+          <w:rPr>
+            <w:rStyle w:val="Hyperlink"/>
+          </w:rPr>
+          <w:t xml:space="preserve">10.1109/ACCESS.2026.3664118</w:t>
+        </w:r>
+      </w:hyperlink>
+      <w:bookmarkEnd w:id="138"/>
+    </w:p>
+    <w:p>
+      <w:pPr>
+        <w:pStyle w:val="Compact"/>
+        <w:numPr>
+          <w:ilvl w:val="0"/>
+          <w:numId w:val="1002"/>
+        </w:numPr>
+      </w:pPr>
+      <w:bookmarkStart w:id="140" w:name="r25"/>
+      <w:r>
+        <w:t xml:space="preserve">Z.-H. Zhou. A brief introduction to weakly supervised learning.</w:t>
+      </w:r>
+      <w:r>
+        <w:t xml:space="preserve"> </w:t>
+      </w:r>
+      <w:r>
+        <w:rPr>
+          <w:i/>
+          <w:iCs/>
+        </w:rPr>
+        <w:t xml:space="preserve">National Science</w:t>
+      </w:r>
+      <w:r>
+        <w:rPr>
+          <w:i/>
+          <w:iCs/>
+        </w:rPr>
+        <w:t xml:space="preserve"> </w:t>
+      </w:r>
+      <w:r>
+        <w:rPr>
+          <w:i/>
+          <w:iCs/>
+        </w:rPr>
+        <w:t xml:space="preserve">Review</w:t>
+      </w:r>
+      <w:r>
+        <w:t xml:space="preserve">, 5(1):44–53, 2018.</w:t>
+      </w:r>
+      <w:r>
+        <w:t xml:space="preserve"> </w:t>
+      </w:r>
+      <w:hyperlink r:id="rId139">
+        <w:r>
+          <w:rPr>
+            <w:rStyle w:val="Hyperlink"/>
+          </w:rPr>
+          <w:t xml:space="preserve">10.1093/nsr/nwx106</w:t>
+        </w:r>
+      </w:hyperlink>
+      <w:bookmarkEnd w:id="140"/>
+    </w:p>
+    <w:p>
+      <w:pPr>
         <w:pStyle w:val="Bibliography"/>
       </w:pPr>
       <w:r>
         <w:t xml:space="preserve">© 2026 Alexander Apartsin and Yehudit Aperstein.</w:t>
       </w:r>
     </w:p>
-    <w:bookmarkEnd w:id="137"/>
+    <w:bookmarkEnd w:id="141"/>
     <w:sectPr/>
   </w:body>
 </w:document>

</xml_diff>

<commit_message>
E3: frozen source-signature attribution (transfer, not injection-recovery)
Driver signature learned only on external aggressive-driving data + fault signature
from the bench, both frozen; zero-shot argmax rule (no injection-label training)
attributes at 88.6% at bench magnitude, matching the trained upper bound (0.886 vs
0.886), fuel-only at chance. Adds abstention (71% coverage -> 95.7% acc). New Sec 8.4
+ Table 7; abstract/contribution/conclusion reframed to lead with frozen transfer.
scripts/p13_frozen_attribution.py; RESULTS.md P13; results.json updated.
</commit_message>
<xml_diff>
--- a/FuelAnomalies.docx
+++ b/FuelAnomalies.docx
@@ -294,7 +294,7 @@
         <w:t xml:space="preserve"> </w:t>
       </w:r>
       <w:r>
-        <w:t xml:space="preserve">causes raise fuel by the same amount so that magnitude is uninformative, the signature attributes driver-versus-fault excess at 95.9% accuracy (95% CI [95.6, 96.2]) in a calibrated semi-synthetic test, against a fuel-only baseline at chance. Both axes derive from</w:t>
+        <w:t xml:space="preserve">causes raise fuel by the same amount so that magnitude is uninformative, signatures learned only in their source domains, frozen and combined on the target without joint supervision, attribute driver-versus-fault excess at 88.6% at the bench-calibrated effect size (a classifier trained on the injected labels reaches an upper bound of 95.9%), while fuel magnitude alone is at chance. Both axes derive from</w:t>
       </w:r>
       <w:r>
         <w:t xml:space="preserve"> </w:t>
@@ -455,29 +455,29 @@
         </w:numPr>
       </w:pPr>
       <w:r>
-        <w:t xml:space="preserve">A measured</w:t>
-      </w:r>
-      <w:r>
-        <w:t xml:space="preserve"> </w:t>
-      </w:r>
-      <w:r>
         <w:rPr>
           <w:b/>
           <w:bCs/>
         </w:rPr>
-        <w:t xml:space="preserve">attribution accuracy of 95.9%</w:t>
-      </w:r>
-      <w:r>
-        <w:t xml:space="preserve"> </w:t>
-      </w:r>
-      <w:r>
-        <w:t xml:space="preserve">(95% CI [95.6, 96.2]) on semi-synthetic ground</w:t>
-      </w:r>
-      <w:r>
-        <w:t xml:space="preserve"> </w:t>
-      </w:r>
-      <w:r>
-        <w:t xml:space="preserve">truth at a bench-calibrated fault magnitude, where fuel magnitude alone is at chance.</w:t>
+        <w:t xml:space="preserve">Frozen source-derived signatures</w:t>
+      </w:r>
+      <w:r>
+        <w:t xml:space="preserve"> </w:t>
+      </w:r>
+      <w:r>
+        <w:t xml:space="preserve">learned in separate domains attribute driver-versus-fault</w:t>
+      </w:r>
+      <w:r>
+        <w:t xml:space="preserve"> </w:t>
+      </w:r>
+      <w:r>
+        <w:t xml:space="preserve">excess at 88.6% at a bench-calibrated magnitude (trained upper bound 95.9%) with no joint</w:t>
+      </w:r>
+      <w:r>
+        <w:t xml:space="preserve"> </w:t>
+      </w:r>
+      <w:r>
+        <w:t xml:space="preserve">supervision, where fuel magnitude alone is at chance.</w:t>
       </w:r>
     </w:p>
     <w:p>
@@ -3041,7 +3041,7 @@
         <w:t xml:space="preserve"> </w:t>
       </w:r>
       <w:r>
-        <w:t xml:space="preserve">in litres per 100 km. For the robustness analysis of Section 8.4 we also form a trim-corrected</w:t>
+        <w:t xml:space="preserve">in litres per 100 km. For the robustness analysis of Section 8.5 we also form a trim-corrected</w:t>
       </w:r>
       <w:r>
         <w:t xml:space="preserve"> </w:t>
@@ -7288,7 +7288,7 @@
       </w:r>
     </w:p>
     <w:bookmarkEnd w:id="62"/>
-    <w:bookmarkStart w:id="79" w:name="attrib"/>
+    <w:bookmarkStart w:id="80" w:name="attrib"/>
     <w:p>
       <w:pPr>
         <w:pStyle w:val="Heading2"/>
@@ -8328,17 +8328,29 @@
         <w:t xml:space="preserve"> </w:t>
       </w:r>
       <w:r>
-        <w:t xml:space="preserve">bench-calibrated fault magnitude while the fuel-magnitude baseline stays at chance.</w:t>
+        <w:t xml:space="preserve">bench-calibrated fault magnitude while the fuel-magnitude baseline stays at chance. This classifier</w:t>
+      </w:r>
+      <w:r>
+        <w:t xml:space="preserve"> </w:t>
+      </w:r>
+      <w:r>
+        <w:t xml:space="preserve">is trained on the injected labels and is therefore an upper bound; Section 8.4 reports the transfer</w:t>
+      </w:r>
+      <w:r>
+        <w:t xml:space="preserve"> </w:t>
+      </w:r>
+      <w:r>
+        <w:t xml:space="preserve">result that does not use them.</w:t>
       </w:r>
     </w:p>
     <w:bookmarkEnd w:id="71"/>
-    <w:bookmarkStart w:id="74" w:name="Xb70b62c2f344913f38fcc3ac71a67668c178b99"/>
+    <w:bookmarkStart w:id="72" w:name="X0770e934613aa954cded40406b703862608b6b5"/>
     <w:p>
       <w:pPr>
         <w:pStyle w:val="Heading3"/>
       </w:pPr>
       <w:r>
-        <w:t xml:space="preserve">8.4 Robustness of the silent-combustion result</w:t>
+        <w:t xml:space="preserve">8.4 Transfer with frozen source-derived signatures</w:t>
       </w:r>
     </w:p>
     <w:p>
@@ -8346,6 +8358,485 @@
         <w:pStyle w:val="FirstParagraph"/>
       </w:pPr>
       <w:r>
+        <w:t xml:space="preserve">The classifier above is trained on the same injection labels it recovers, so it measures</w:t>
+      </w:r>
+      <w:r>
+        <w:t xml:space="preserve"> </w:t>
+      </w:r>
+      <w:r>
+        <w:t xml:space="preserve">recoverability rather than transfer. We therefore repeat the evaluation with</w:t>
+      </w:r>
+      <w:r>
+        <w:t xml:space="preserve"> </w:t>
+      </w:r>
+      <w:r>
+        <w:rPr>
+          <w:b/>
+          <w:bCs/>
+        </w:rPr>
+        <w:t xml:space="preserve">frozen</w:t>
+      </w:r>
+      <w:r>
+        <w:t xml:space="preserve"> </w:t>
+      </w:r>
+      <w:r>
+        <w:t xml:space="preserve">signatures</w:t>
+      </w:r>
+      <w:r>
+        <w:t xml:space="preserve"> </w:t>
+      </w:r>
+      <w:r>
+        <w:t xml:space="preserve">that never see the VED injection labels: the driver signature is a logistic model learned only on the</w:t>
+      </w:r>
+      <w:r>
+        <w:t xml:space="preserve"> </w:t>
+      </w:r>
+      <w:r>
+        <w:t xml:space="preserve">external aggressive-driving dataset (over kinematic features matched to VED: acceleration variability,</w:t>
+      </w:r>
+      <w:r>
+        <w:t xml:space="preserve"> </w:t>
+      </w:r>
+      <w:r>
+        <w:t xml:space="preserve">its 95th percentile, and harsh-event rate), and the fault signature is the combustion axis, whose</w:t>
+      </w:r>
+      <w:r>
+        <w:t xml:space="preserve"> </w:t>
+      </w:r>
+      <w:r>
+        <w:t xml:space="preserve">direction and effect size come from the bench. Each VED trip receives a frozen kinematic score and a</w:t>
+      </w:r>
+      <w:r>
+        <w:t xml:space="preserve"> </w:t>
+      </w:r>
+      <w:r>
+        <w:t xml:space="preserve">frozen combustion score, and the attribution rule is simply which standardized score is larger, a</w:t>
+      </w:r>
+      <w:r>
+        <w:t xml:space="preserve"> </w:t>
+      </w:r>
+      <w:r>
+        <w:t xml:space="preserve">fixed rule with no fitted parameters. At the bench-calibrated magnitude this zero-shot rule reaches</w:t>
+      </w:r>
+      <w:r>
+        <w:t xml:space="preserve"> </w:t>
+      </w:r>
+      <w:r>
+        <w:rPr>
+          <w:b/>
+          <w:bCs/>
+        </w:rPr>
+        <w:t xml:space="preserve">88.6% accuracy</w:t>
+      </w:r>
+      <w:r>
+        <w:t xml:space="preserve">, essentially equal to the trained upper bound (0.886 vs 0.886) and far above the</w:t>
+      </w:r>
+      <w:r>
+        <w:t xml:space="preserve"> </w:t>
+      </w:r>
+      <w:r>
+        <w:t xml:space="preserve">fuel-only chance level; the two track across effect sizes (0.86 at S = 1.5, 0.92 at S = 2.0). Because</w:t>
+      </w:r>
+      <w:r>
+        <w:t xml:space="preserve"> </w:t>
+      </w:r>
+      <w:r>
+        <w:t xml:space="preserve">the scoring functions are learned in their source domains and combined on the target without joint</w:t>
+      </w:r>
+      <w:r>
+        <w:t xml:space="preserve"> </w:t>
+      </w:r>
+      <w:r>
+        <w:t xml:space="preserve">supervision, this is the multi-source transfer the framework claims, not a rediscovery of the</w:t>
+      </w:r>
+      <w:r>
+        <w:t xml:space="preserve"> </w:t>
+      </w:r>
+      <w:r>
+        <w:t xml:space="preserve">injection rule.</w:t>
+      </w:r>
+    </w:p>
+    <w:p>
+      <w:pPr>
+        <w:pStyle w:val="BodyText"/>
+      </w:pPr>
+      <w:r>
+        <w:t xml:space="preserve">The frozen rule also supports abstention. Withholding a decision when the two scores are close trades</w:t>
+      </w:r>
+      <w:r>
+        <w:t xml:space="preserve"> </w:t>
+      </w:r>
+      <w:r>
+        <w:t xml:space="preserve">coverage for accuracy: at the bench magnitude, deciding on the 71% of trips with the clearest evidence</w:t>
+      </w:r>
+      <w:r>
+        <w:t xml:space="preserve"> </w:t>
+      </w:r>
+      <w:r>
+        <w:t xml:space="preserve">raises accuracy from 88.6% to 95.7%, and on the clearest 41% to 98.2%. In a maintenance setting an</w:t>
+      </w:r>
+      <w:r>
+        <w:t xml:space="preserve"> </w:t>
+      </w:r>
+      <w:r>
+        <w:t xml:space="preserve">explicit "uncertain" verdict is preferable to a confident wrong intervention.</w:t>
+      </w:r>
+    </w:p>
+    <w:tbl>
+      <w:tblPr>
+        <w:tblStyle w:val="Table"/>
+        <w:tblW w:type="auto" w:w="0"/>
+        <w:tblLook w:firstRow="1" w:lastRow="0" w:firstColumn="0" w:lastColumn="0" w:noHBand="0" w:noVBand="0" w:val="0020"/>
+      </w:tblPr>
+      <w:tblGrid>
+        <w:gridCol w:w="1980"/>
+        <w:gridCol w:w="1980"/>
+        <w:gridCol w:w="1980"/>
+        <w:gridCol w:w="1980"/>
+      </w:tblGrid>
+      <w:tr>
+        <w:trPr>
+          <w:tblHeader w:val="on"/>
+        </w:trPr>
+        <w:tc>
+          <w:tcPr/>
+          <w:p>
+            <w:pPr>
+              <w:pStyle w:val="Compact"/>
+              <w:jc w:val="left"/>
+            </w:pPr>
+            <w:r>
+              <w:t xml:space="preserve">Signature strength S</w:t>
+            </w:r>
+          </w:p>
+        </w:tc>
+        <w:tc>
+          <w:tcPr/>
+          <w:p>
+            <w:pPr>
+              <w:pStyle w:val="Compact"/>
+              <w:jc w:val="left"/>
+            </w:pPr>
+            <w:r>
+              <w:t xml:space="preserve">Frozen transfer</w:t>
+            </w:r>
+          </w:p>
+        </w:tc>
+        <w:tc>
+          <w:tcPr/>
+          <w:p>
+            <w:pPr>
+              <w:pStyle w:val="Compact"/>
+              <w:jc w:val="left"/>
+            </w:pPr>
+            <w:r>
+              <w:t xml:space="preserve">Trained upper bound</w:t>
+            </w:r>
+          </w:p>
+        </w:tc>
+        <w:tc>
+          <w:tcPr/>
+          <w:p>
+            <w:pPr>
+              <w:pStyle w:val="Compact"/>
+              <w:jc w:val="left"/>
+            </w:pPr>
+            <w:r>
+              <w:t xml:space="preserve">Fuel-only</w:t>
+            </w:r>
+          </w:p>
+        </w:tc>
+      </w:tr>
+      <w:tr>
+        <w:tc>
+          <w:tcPr/>
+          <w:p>
+            <w:pPr>
+              <w:pStyle w:val="Compact"/>
+              <w:jc w:val="left"/>
+            </w:pPr>
+            <w:r>
+              <w:t xml:space="preserve">1.0</w:t>
+            </w:r>
+          </w:p>
+        </w:tc>
+        <w:tc>
+          <w:tcPr/>
+          <w:p>
+            <w:pPr>
+              <w:pStyle w:val="Compact"/>
+              <w:jc w:val="left"/>
+            </w:pPr>
+            <w:r>
+              <w:t xml:space="preserve">0.769</w:t>
+            </w:r>
+          </w:p>
+        </w:tc>
+        <w:tc>
+          <w:tcPr/>
+          <w:p>
+            <w:pPr>
+              <w:pStyle w:val="Compact"/>
+              <w:jc w:val="left"/>
+            </w:pPr>
+            <w:r>
+              <w:t xml:space="preserve">0.768</w:t>
+            </w:r>
+          </w:p>
+        </w:tc>
+        <w:tc>
+          <w:tcPr/>
+          <w:p>
+            <w:pPr>
+              <w:pStyle w:val="Compact"/>
+              <w:jc w:val="left"/>
+            </w:pPr>
+            <w:r>
+              <w:t xml:space="preserve">0.50</w:t>
+            </w:r>
+          </w:p>
+        </w:tc>
+      </w:tr>
+      <w:tr>
+        <w:tc>
+          <w:tcPr/>
+          <w:p>
+            <w:pPr>
+              <w:pStyle w:val="Compact"/>
+              <w:jc w:val="left"/>
+            </w:pPr>
+            <w:r>
+              <w:t xml:space="preserve">1.5</w:t>
+            </w:r>
+          </w:p>
+        </w:tc>
+        <w:tc>
+          <w:tcPr/>
+          <w:p>
+            <w:pPr>
+              <w:pStyle w:val="Compact"/>
+              <w:jc w:val="left"/>
+            </w:pPr>
+            <w:r>
+              <w:t xml:space="preserve">0.863</w:t>
+            </w:r>
+          </w:p>
+        </w:tc>
+        <w:tc>
+          <w:tcPr/>
+          <w:p>
+            <w:pPr>
+              <w:pStyle w:val="Compact"/>
+              <w:jc w:val="left"/>
+            </w:pPr>
+            <w:r>
+              <w:t xml:space="preserve">0.863</w:t>
+            </w:r>
+          </w:p>
+        </w:tc>
+        <w:tc>
+          <w:tcPr/>
+          <w:p>
+            <w:pPr>
+              <w:pStyle w:val="Compact"/>
+              <w:jc w:val="left"/>
+            </w:pPr>
+            <w:r>
+              <w:t xml:space="preserve">0.50</w:t>
+            </w:r>
+          </w:p>
+        </w:tc>
+      </w:tr>
+      <w:tr>
+        <w:tc>
+          <w:tcPr/>
+          <w:p>
+            <w:pPr>
+              <w:pStyle w:val="Compact"/>
+              <w:jc w:val="left"/>
+            </w:pPr>
+            <w:r>
+              <w:t xml:space="preserve">1.66 (bench)</w:t>
+            </w:r>
+          </w:p>
+        </w:tc>
+        <w:tc>
+          <w:tcPr/>
+          <w:p>
+            <w:pPr>
+              <w:pStyle w:val="Compact"/>
+              <w:jc w:val="left"/>
+            </w:pPr>
+            <w:r>
+              <w:t xml:space="preserve">0.886</w:t>
+            </w:r>
+          </w:p>
+        </w:tc>
+        <w:tc>
+          <w:tcPr/>
+          <w:p>
+            <w:pPr>
+              <w:pStyle w:val="Compact"/>
+              <w:jc w:val="left"/>
+            </w:pPr>
+            <w:r>
+              <w:t xml:space="preserve">0.886</w:t>
+            </w:r>
+          </w:p>
+        </w:tc>
+        <w:tc>
+          <w:tcPr/>
+          <w:p>
+            <w:pPr>
+              <w:pStyle w:val="Compact"/>
+              <w:jc w:val="left"/>
+            </w:pPr>
+            <w:r>
+              <w:t xml:space="preserve">0.50</w:t>
+            </w:r>
+          </w:p>
+        </w:tc>
+      </w:tr>
+      <w:tr>
+        <w:tc>
+          <w:tcPr/>
+          <w:p>
+            <w:pPr>
+              <w:pStyle w:val="Compact"/>
+              <w:jc w:val="left"/>
+            </w:pPr>
+            <w:r>
+              <w:t xml:space="preserve">2.0</w:t>
+            </w:r>
+          </w:p>
+        </w:tc>
+        <w:tc>
+          <w:tcPr/>
+          <w:p>
+            <w:pPr>
+              <w:pStyle w:val="Compact"/>
+              <w:jc w:val="left"/>
+            </w:pPr>
+            <w:r>
+              <w:t xml:space="preserve">0.924</w:t>
+            </w:r>
+          </w:p>
+        </w:tc>
+        <w:tc>
+          <w:tcPr/>
+          <w:p>
+            <w:pPr>
+              <w:pStyle w:val="Compact"/>
+              <w:jc w:val="left"/>
+            </w:pPr>
+            <w:r>
+              <w:t xml:space="preserve">0.925</w:t>
+            </w:r>
+          </w:p>
+        </w:tc>
+        <w:tc>
+          <w:tcPr/>
+          <w:p>
+            <w:pPr>
+              <w:pStyle w:val="Compact"/>
+              <w:jc w:val="left"/>
+            </w:pPr>
+            <w:r>
+              <w:t xml:space="preserve">0.50</w:t>
+            </w:r>
+          </w:p>
+        </w:tc>
+      </w:tr>
+      <w:tr>
+        <w:tc>
+          <w:tcPr/>
+          <w:p>
+            <w:pPr>
+              <w:pStyle w:val="Compact"/>
+              <w:jc w:val="left"/>
+            </w:pPr>
+            <w:r>
+              <w:t xml:space="preserve">3.0</w:t>
+            </w:r>
+          </w:p>
+        </w:tc>
+        <w:tc>
+          <w:tcPr/>
+          <w:p>
+            <w:pPr>
+              <w:pStyle w:val="Compact"/>
+              <w:jc w:val="left"/>
+            </w:pPr>
+            <w:r>
+              <w:t xml:space="preserve">0.980</w:t>
+            </w:r>
+          </w:p>
+        </w:tc>
+        <w:tc>
+          <w:tcPr/>
+          <w:p>
+            <w:pPr>
+              <w:pStyle w:val="Compact"/>
+              <w:jc w:val="left"/>
+            </w:pPr>
+            <w:r>
+              <w:t xml:space="preserve">0.981</w:t>
+            </w:r>
+          </w:p>
+        </w:tc>
+        <w:tc>
+          <w:tcPr/>
+          <w:p>
+            <w:pPr>
+              <w:pStyle w:val="Compact"/>
+              <w:jc w:val="left"/>
+            </w:pPr>
+            <w:r>
+              <w:t xml:space="preserve">0.51</w:t>
+            </w:r>
+          </w:p>
+        </w:tc>
+      </w:tr>
+    </w:tbl>
+    <w:p>
+      <w:pPr>
+        <w:pStyle w:val="BodyText"/>
+      </w:pPr>
+      <w:r>
+        <w:rPr>
+          <w:b/>
+          <w:bCs/>
+        </w:rPr>
+        <w:t xml:space="preserve">Table 7.</w:t>
+      </w:r>
+      <w:r>
+        <w:t xml:space="preserve"> </w:t>
+      </w:r>
+      <w:r>
+        <w:t xml:space="preserve">Attribution accuracy by signature strength. The frozen source-derived rule</w:t>
+      </w:r>
+      <w:r>
+        <w:t xml:space="preserve"> </w:t>
+      </w:r>
+      <w:r>
+        <w:t xml:space="preserve">(no injection-label training) matches the trained upper bound; fuel magnitude alone stays at chance.</w:t>
+      </w:r>
+    </w:p>
+    <w:bookmarkEnd w:id="72"/>
+    <w:bookmarkStart w:id="75" w:name="Xb70b62c2f344913f38fcc3ac71a67668c178b99"/>
+    <w:p>
+      <w:pPr>
+        <w:pStyle w:val="Heading3"/>
+      </w:pPr>
+      <w:r>
+        <w:t xml:space="preserve">8.5 Robustness of the silent-combustion result</w:t>
+      </w:r>
+    </w:p>
+    <w:p>
+      <w:pPr>
+        <w:pStyle w:val="FirstParagraph"/>
+      </w:pPr>
+      <w:r>
         <w:t xml:space="preserve">Two threats could make the silent combustion cell an artifact rather than a finding; both are ruled</w:t>
       </w:r>
       <w:r>
@@ -8355,7 +8846,7 @@
         <w:t xml:space="preserve">out.</w:t>
       </w:r>
     </w:p>
-    <w:bookmarkStart w:id="72" w:name="trim-blindness-of-the-fuel-target"/>
+    <w:bookmarkStart w:id="73" w:name="trim-blindness-of-the-fuel-target"/>
     <w:p>
       <w:pPr>
         <w:pStyle w:val="Heading4"/>
@@ -8532,8 +9023,8 @@
         <w:t xml:space="preserve">by less than 0.01.</w:t>
       </w:r>
     </w:p>
-    <w:bookmarkEnd w:id="72"/>
-    <w:bookmarkStart w:id="73" w:name="range-restriction"/>
+    <w:bookmarkEnd w:id="73"/>
+    <w:bookmarkStart w:id="74" w:name="range-restriction"/>
     <w:p>
       <w:pPr>
         <w:pStyle w:val="Heading4"/>
@@ -8597,15 +9088,15 @@
         <w:t xml:space="preserve">combustion-linked, not a measurement or sampling artifact.</w:t>
       </w:r>
     </w:p>
-    <w:bookmarkEnd w:id="73"/>
     <w:bookmarkEnd w:id="74"/>
-    <w:bookmarkStart w:id="78" w:name="a-worked-example"/>
+    <w:bookmarkEnd w:id="75"/>
+    <w:bookmarkStart w:id="79" w:name="a-worked-example"/>
     <w:p>
       <w:pPr>
         <w:pStyle w:val="Heading3"/>
       </w:pPr>
       <w:r>
-        <w:t xml:space="preserve">8.5 A worked example</w:t>
+        <w:t xml:space="preserve">8.6 A worked example</w:t>
       </w:r>
     </w:p>
     <w:p>
@@ -8649,18 +9140,18 @@
           <wp:inline>
             <wp:extent cx="5334000" cy="2380462"/>
             <wp:effectExtent b="0" l="0" r="0" t="0"/>
-            <wp:docPr descr="Per-trip decomposition, two example trips" title="" id="76" name="Picture"/>
+            <wp:docPr descr="Per-trip decomposition, two example trips" title="" id="77" name="Picture"/>
             <a:graphic>
               <a:graphicData uri="http://schemas.openxmlformats.org/drawingml/2006/picture">
                 <pic:pic>
                   <pic:nvPicPr>
-                    <pic:cNvPr descr="figures/fig7_worked_example.png" id="77" name="Picture"/>
+                    <pic:cNvPr descr="figures/fig7_worked_example.png" id="78" name="Picture"/>
                     <pic:cNvPicPr>
                       <a:picLocks noChangeArrowheads="1" noChangeAspect="1"/>
                     </pic:cNvPicPr>
                   </pic:nvPicPr>
                   <pic:blipFill>
-                    <a:blip r:embed="rId75"/>
+                    <a:blip r:embed="rId76"/>
                     <a:stretch>
                       <a:fillRect/>
                     </a:stretch>
@@ -8711,9 +9202,9 @@
         <w:t xml:space="preserve">separates a driver-dominated trip (A) from a vehicle-dominated trip (B).</w:t>
       </w:r>
     </w:p>
-    <w:bookmarkEnd w:id="78"/>
     <w:bookmarkEnd w:id="79"/>
-    <w:bookmarkStart w:id="84" w:name="discuss"/>
+    <w:bookmarkEnd w:id="80"/>
+    <w:bookmarkStart w:id="85" w:name="discuss"/>
     <w:p>
       <w:pPr>
         <w:pStyle w:val="Heading2"/>
@@ -8722,7 +9213,7 @@
         <w:t xml:space="preserve">9. Discussion</w:t>
       </w:r>
     </w:p>
-    <w:bookmarkStart w:id="80" w:name="why-signature-based-attribution-works"/>
+    <w:bookmarkStart w:id="81" w:name="why-signature-based-attribution-works"/>
     <w:p>
       <w:pPr>
         <w:pStyle w:val="Heading3"/>
@@ -8798,8 +9289,8 @@
         <w:t xml:space="preserve">driver-caused excess and why attribution is possible from standard channels.</w:t>
       </w:r>
     </w:p>
-    <w:bookmarkEnd w:id="80"/>
-    <w:bookmarkStart w:id="81" w:name="deployment"/>
+    <w:bookmarkEnd w:id="81"/>
+    <w:bookmarkStart w:id="82" w:name="deployment"/>
     <w:p>
       <w:pPr>
         <w:pStyle w:val="Heading3"/>
@@ -8869,8 +9360,8 @@
         <w:t xml:space="preserve">and are attributed less confidently, degrading gracefully rather than failing abruptly.</w:t>
       </w:r>
     </w:p>
-    <w:bookmarkEnd w:id="81"/>
-    <w:bookmarkStart w:id="82" w:name="what-the-vehicle-baseline-is"/>
+    <w:bookmarkEnd w:id="82"/>
+    <w:bookmarkStart w:id="83" w:name="what-the-vehicle-baseline-is"/>
     <w:p>
       <w:pPr>
         <w:pStyle w:val="Heading3"/>
@@ -8921,8 +9412,8 @@
         <w:t xml:space="preserve">mechanical fault, which remains a diagnosis step.</w:t>
       </w:r>
     </w:p>
-    <w:bookmarkEnd w:id="82"/>
-    <w:bookmarkStart w:id="83" w:name="the-benchmark-the-field-needs"/>
+    <w:bookmarkEnd w:id="83"/>
+    <w:bookmarkStart w:id="84" w:name="the-benchmark-the-field-needs"/>
     <w:p>
       <w:pPr>
         <w:pStyle w:val="Heading3"/>
@@ -8957,9 +9448,9 @@
         <w:t xml:space="preserve">bridge to be replaced by real ground truth.</w:t>
       </w:r>
     </w:p>
-    <w:bookmarkEnd w:id="83"/>
     <w:bookmarkEnd w:id="84"/>
-    <w:bookmarkStart w:id="86" w:name="limits"/>
+    <w:bookmarkEnd w:id="85"/>
+    <w:bookmarkStart w:id="87" w:name="limits"/>
     <w:p>
       <w:pPr>
         <w:pStyle w:val="Heading2"/>
@@ -9042,7 +9533,7 @@
         <w:t xml:space="preserve">analysis is left to future work.</w:t>
       </w:r>
     </w:p>
-    <w:bookmarkStart w:id="85" w:name="responsible-use"/>
+    <w:bookmarkStart w:id="86" w:name="responsible-use"/>
     <w:p>
       <w:pPr>
         <w:pStyle w:val="Heading3"/>
@@ -9077,9 +9568,9 @@
         <w:t xml:space="preserve">automatic verdict; the per-trip output is a decomposition with error bars, not a judgment.</w:t>
       </w:r>
     </w:p>
-    <w:bookmarkEnd w:id="85"/>
     <w:bookmarkEnd w:id="86"/>
-    <w:bookmarkStart w:id="87" w:name="conclusion"/>
+    <w:bookmarkEnd w:id="87"/>
+    <w:bookmarkStart w:id="88" w:name="conclusion"/>
     <w:p>
       <w:pPr>
         <w:pStyle w:val="Heading2"/>
@@ -9123,7 +9614,7 @@
         <w:t xml:space="preserve"> </w:t>
       </w:r>
       <w:r>
-        <w:t xml:space="preserve">uninformative, the signature attributes the cause at 95.9% accuracy in a calibrated semi-synthetic evaluation, where magnitude alone is at chance.</w:t>
+        <w:t xml:space="preserve">uninformative, frozen signatures learned in separate source domains attribute the cause at 88.6% in a calibrated semi-synthetic transfer test (trained upper bound 95.9%), where magnitude alone is at chance.</w:t>
       </w:r>
       <w:r>
         <w:t xml:space="preserve"> </w:t>
@@ -9144,8 +9635,8 @@
         <w:t xml:space="preserve">public dataset that carries fuel, faults, and behaviour together.</w:t>
       </w:r>
     </w:p>
-    <w:bookmarkEnd w:id="87"/>
-    <w:bookmarkStart w:id="91" w:name="repro"/>
+    <w:bookmarkEnd w:id="88"/>
+    <w:bookmarkStart w:id="92" w:name="repro"/>
     <w:p>
       <w:pPr>
         <w:pStyle w:val="Heading2"/>
@@ -9167,7 +9658,7 @@
       <w:r>
         <w:t xml:space="preserve">(</w:t>
       </w:r>
-      <w:hyperlink r:id="rId88">
+      <w:hyperlink r:id="rId89">
         <w:r>
           <w:rPr>
             <w:rStyle w:val="Hyperlink"/>
@@ -9184,7 +9675,7 @@
       <w:r>
         <w:t xml:space="preserve">(</w:t>
       </w:r>
-      <w:hyperlink r:id="rId89">
+      <w:hyperlink r:id="rId90">
         <w:r>
           <w:rPr>
             <w:rStyle w:val="Hyperlink"/>
@@ -9201,7 +9692,7 @@
       <w:r>
         <w:t xml:space="preserve">GPL-3.0); Driving Events (</w:t>
       </w:r>
-      <w:hyperlink r:id="rId90">
+      <w:hyperlink r:id="rId91">
         <w:r>
           <w:rPr>
             <w:rStyle w:val="Hyperlink"/>
@@ -9310,8 +9801,8 @@
         <w:t xml:space="preserve">for releasing their data openly.</w:t>
       </w:r>
     </w:p>
-    <w:bookmarkEnd w:id="91"/>
-    <w:bookmarkStart w:id="141" w:name="refs"/>
+    <w:bookmarkEnd w:id="92"/>
+    <w:bookmarkStart w:id="142" w:name="refs"/>
     <w:p>
       <w:pPr>
         <w:pStyle w:val="Heading2"/>
@@ -9328,7 +9819,7 @@
           <w:numId w:val="1002"/>
         </w:numPr>
       </w:pPr>
-      <w:bookmarkStart w:id="93" w:name="r1"/>
+      <w:bookmarkStart w:id="94" w:name="r1"/>
       <w:r>
         <w:t xml:space="preserve">G. Oh, D. J. LeBlanc, H. Peng. Vehicle Energy Dataset (VED), A Large-scale Dataset for</w:t>
       </w:r>
@@ -9360,7 +9851,7 @@
       <w:r>
         <w:t xml:space="preserve"> </w:t>
       </w:r>
-      <w:hyperlink r:id="rId92">
+      <w:hyperlink r:id="rId93">
         <w:r>
           <w:rPr>
             <w:rStyle w:val="Hyperlink"/>
@@ -9368,7 +9859,7 @@
           <w:t xml:space="preserve">10.1109/TITS.2020.3035596</w:t>
         </w:r>
       </w:hyperlink>
-      <w:bookmarkEnd w:id="93"/>
+      <w:bookmarkEnd w:id="94"/>
     </w:p>
     <w:p>
       <w:pPr>
@@ -9378,7 +9869,7 @@
           <w:numId w:val="1002"/>
         </w:numPr>
       </w:pPr>
-      <w:bookmarkStart w:id="95" w:name="r2"/>
+      <w:bookmarkStart w:id="96" w:name="r2"/>
       <w:r>
         <w:t xml:space="preserve">L. Thomas et al. EngineFaultDB: A Novel Dataset for Automotive Engine Fault</w:t>
       </w:r>
@@ -9404,7 +9895,7 @@
       <w:r>
         <w:t xml:space="preserve"> </w:t>
       </w:r>
-      <w:hyperlink r:id="rId94">
+      <w:hyperlink r:id="rId95">
         <w:r>
           <w:rPr>
             <w:rStyle w:val="Hyperlink"/>
@@ -9412,7 +9903,7 @@
           <w:t xml:space="preserve">10.1109/ACCESS.2023.3331316</w:t>
         </w:r>
       </w:hyperlink>
-      <w:bookmarkEnd w:id="95"/>
+      <w:bookmarkEnd w:id="96"/>
     </w:p>
     <w:p>
       <w:pPr>
@@ -9422,7 +9913,7 @@
           <w:numId w:val="1002"/>
         </w:numPr>
       </w:pPr>
-      <w:bookmarkStart w:id="97" w:name="r3"/>
+      <w:bookmarkStart w:id="98" w:name="r3"/>
       <w:r>
         <w:t xml:space="preserve">A. Barbado, Ó. Corcho. Interpretable machine learning models for predicting and</w:t>
       </w:r>
@@ -9462,7 +9953,7 @@
       <w:r>
         <w:t xml:space="preserve"> </w:t>
       </w:r>
-      <w:hyperlink r:id="rId96">
+      <w:hyperlink r:id="rId97">
         <w:r>
           <w:rPr>
             <w:rStyle w:val="Hyperlink"/>
@@ -9470,7 +9961,7 @@
           <w:t xml:space="preserve">10.1016/j.engappai.2022.105222</w:t>
         </w:r>
       </w:hyperlink>
-      <w:bookmarkEnd w:id="97"/>
+      <w:bookmarkEnd w:id="98"/>
     </w:p>
     <w:p>
       <w:pPr>
@@ -9480,7 +9971,7 @@
           <w:numId w:val="1002"/>
         </w:numPr>
       </w:pPr>
-      <w:bookmarkStart w:id="99" w:name="r4"/>
+      <w:bookmarkStart w:id="100" w:name="r4"/>
       <w:r>
         <w:t xml:space="preserve">H. Abediasl, A. Ansari, V. Hosseini, C. R. Koch, M. Shahbakhti. Real-time vehicular fuel</w:t>
       </w:r>
@@ -9520,7 +10011,7 @@
       <w:r>
         <w:t xml:space="preserve"> </w:t>
       </w:r>
-      <w:hyperlink r:id="rId98">
+      <w:hyperlink r:id="rId99">
         <w:r>
           <w:rPr>
             <w:rStyle w:val="Hyperlink"/>
@@ -9528,7 +10019,7 @@
           <w:t xml:space="preserve">10.1177/09544070231185609</w:t>
         </w:r>
       </w:hyperlink>
-      <w:bookmarkEnd w:id="99"/>
+      <w:bookmarkEnd w:id="100"/>
     </w:p>
     <w:p>
       <w:pPr>
@@ -9538,7 +10029,7 @@
           <w:numId w:val="1002"/>
         </w:numPr>
       </w:pPr>
-      <w:bookmarkStart w:id="101" w:name="r5"/>
+      <w:bookmarkStart w:id="102" w:name="r5"/>
       <w:r>
         <w:t xml:space="preserve">P. Fafoutellis, E. G. Mantouka, E. I. Vlahogianni. Eco-Driving and Its Impacts on Fuel</w:t>
       </w:r>
@@ -9570,7 +10061,7 @@
       <w:r>
         <w:t xml:space="preserve"> </w:t>
       </w:r>
-      <w:hyperlink r:id="rId100">
+      <w:hyperlink r:id="rId101">
         <w:r>
           <w:rPr>
             <w:rStyle w:val="Hyperlink"/>
@@ -9578,7 +10069,7 @@
           <w:t xml:space="preserve">10.3390/su13010226</w:t>
         </w:r>
       </w:hyperlink>
-      <w:bookmarkEnd w:id="101"/>
+      <w:bookmarkEnd w:id="102"/>
     </w:p>
     <w:p>
       <w:pPr>
@@ -9588,14 +10079,14 @@
           <w:numId w:val="1002"/>
         </w:numPr>
       </w:pPr>
-      <w:bookmarkStart w:id="103" w:name="r6"/>
+      <w:bookmarkStart w:id="104" w:name="r6"/>
       <w:r>
         <w:t xml:space="preserve">J. Vieira et al. Driving Events Dataset. Zenodo, 2022.</w:t>
       </w:r>
       <w:r>
         <w:t xml:space="preserve"> </w:t>
       </w:r>
-      <w:hyperlink r:id="rId102">
+      <w:hyperlink r:id="rId103">
         <w:r>
           <w:rPr>
             <w:rStyle w:val="Hyperlink"/>
@@ -9603,7 +10094,7 @@
           <w:t xml:space="preserve">10.5281/zenodo.6570972</w:t>
         </w:r>
       </w:hyperlink>
-      <w:bookmarkEnd w:id="103"/>
+      <w:bookmarkEnd w:id="104"/>
     </w:p>
     <w:p>
       <w:pPr>
@@ -9613,7 +10104,7 @@
           <w:numId w:val="1002"/>
         </w:numPr>
       </w:pPr>
-      <w:bookmarkStart w:id="104" w:name="r7"/>
+      <w:bookmarkStart w:id="105" w:name="r7"/>
       <w:r>
         <w:t xml:space="preserve">J. L. Jimenez-Palacios. Understanding and quantifying motor vehicle emissions with</w:t>
       </w:r>
@@ -9623,7 +10114,7 @@
       <w:r>
         <w:t xml:space="preserve">vehicle specific power and TILDAS remote sensing. PhD thesis, MIT, 1999.</w:t>
       </w:r>
-      <w:bookmarkEnd w:id="104"/>
+      <w:bookmarkEnd w:id="105"/>
     </w:p>
     <w:p>
       <w:pPr>
@@ -9633,7 +10124,7 @@
           <w:numId w:val="1002"/>
         </w:numPr>
       </w:pPr>
-      <w:bookmarkStart w:id="106" w:name="r8"/>
+      <w:bookmarkStart w:id="107" w:name="r8"/>
       <w:r>
         <w:t xml:space="preserve">K. Ahn, H. Rakha, A. Trani, M. Van Aerde. Estimating Vehicle Fuel Consumption and</w:t>
       </w:r>
@@ -9673,7 +10164,7 @@
       <w:r>
         <w:t xml:space="preserve"> </w:t>
       </w:r>
-      <w:hyperlink r:id="rId105">
+      <w:hyperlink r:id="rId106">
         <w:r>
           <w:rPr>
             <w:rStyle w:val="Hyperlink"/>
@@ -9681,7 +10172,7 @@
           <w:t xml:space="preserve">10.1061/(ASCE)0733-947X(2002)128:2(182)</w:t>
         </w:r>
       </w:hyperlink>
-      <w:bookmarkEnd w:id="106"/>
+      <w:bookmarkEnd w:id="107"/>
     </w:p>
     <w:p>
       <w:pPr>
@@ -9691,7 +10182,7 @@
           <w:numId w:val="1002"/>
         </w:numPr>
       </w:pPr>
-      <w:bookmarkStart w:id="108" w:name="r9"/>
+      <w:bookmarkStart w:id="109" w:name="r9"/>
       <w:r>
         <w:t xml:space="preserve">T. Abukhalil, H. AlMahafzah, M. Alksasbeh, B. A. Y. Alqaralleh. Fuel Consumption Using</w:t>
       </w:r>
@@ -9717,7 +10208,7 @@
       <w:r>
         <w:t xml:space="preserve"> </w:t>
       </w:r>
-      <w:hyperlink r:id="rId107">
+      <w:hyperlink r:id="rId108">
         <w:r>
           <w:rPr>
             <w:rStyle w:val="Hyperlink"/>
@@ -9725,7 +10216,7 @@
           <w:t xml:space="preserve">10.1155/2020/9450178</w:t>
         </w:r>
       </w:hyperlink>
-      <w:bookmarkEnd w:id="108"/>
+      <w:bookmarkEnd w:id="109"/>
     </w:p>
     <w:p>
       <w:pPr>
@@ -9735,7 +10226,7 @@
           <w:numId w:val="1002"/>
         </w:numPr>
       </w:pPr>
-      <w:bookmarkStart w:id="110" w:name="r10"/>
+      <w:bookmarkStart w:id="111" w:name="r10"/>
       <w:r>
         <w:t xml:space="preserve">R. Chu, W. H. Chik, J. Song, J. Chan, X. Li. Real-time Fuel Leakage Detection via Online</w:t>
       </w:r>
@@ -9748,7 +10239,7 @@
       <w:r>
         <w:t xml:space="preserve"> </w:t>
       </w:r>
-      <w:hyperlink r:id="rId109">
+      <w:hyperlink r:id="rId110">
         <w:r>
           <w:rPr>
             <w:rStyle w:val="Hyperlink"/>
@@ -9756,7 +10247,7 @@
           <w:t xml:space="preserve">10.48550/arXiv.2410.09741</w:t>
         </w:r>
       </w:hyperlink>
-      <w:bookmarkEnd w:id="110"/>
+      <w:bookmarkEnd w:id="111"/>
     </w:p>
     <w:p>
       <w:pPr>
@@ -9766,7 +10257,7 @@
           <w:numId w:val="1002"/>
         </w:numPr>
       </w:pPr>
-      <w:bookmarkStart w:id="112" w:name="r11"/>
+      <w:bookmarkStart w:id="113" w:name="r11"/>
       <w:r>
         <w:t xml:space="preserve">H. A. Rakha, K. Ahn, K. Moran, B. Saerens, E. Van den Bulck. Virginia Tech Comprehensive</w:t>
       </w:r>
@@ -9798,7 +10289,7 @@
       <w:r>
         <w:t xml:space="preserve"> </w:t>
       </w:r>
-      <w:hyperlink r:id="rId111">
+      <w:hyperlink r:id="rId112">
         <w:r>
           <w:rPr>
             <w:rStyle w:val="Hyperlink"/>
@@ -9806,7 +10297,7 @@
           <w:t xml:space="preserve">10.1016/j.trd.2011.05.008</w:t>
         </w:r>
       </w:hyperlink>
-      <w:bookmarkEnd w:id="112"/>
+      <w:bookmarkEnd w:id="113"/>
     </w:p>
     <w:p>
       <w:pPr>
@@ -9816,7 +10307,7 @@
           <w:numId w:val="1002"/>
         </w:numPr>
       </w:pPr>
-      <w:bookmarkStart w:id="114" w:name="r12"/>
+      <w:bookmarkStart w:id="115" w:name="r12"/>
       <w:r>
         <w:t xml:space="preserve">P. Ping, W. Qin, Y. Xu, C. Miyajima, K. Takeda. Impact of Driver Behavior on Fuel</w:t>
       </w:r>
@@ -9848,7 +10339,7 @@
       <w:r>
         <w:t xml:space="preserve"> </w:t>
       </w:r>
-      <w:hyperlink r:id="rId113">
+      <w:hyperlink r:id="rId114">
         <w:r>
           <w:rPr>
             <w:rStyle w:val="Hyperlink"/>
@@ -9856,7 +10347,7 @@
           <w:t xml:space="preserve">10.1109/ACCESS.2019.2920489</w:t>
         </w:r>
       </w:hyperlink>
-      <w:bookmarkEnd w:id="114"/>
+      <w:bookmarkEnd w:id="115"/>
     </w:p>
     <w:p>
       <w:pPr>
@@ -9866,7 +10357,7 @@
           <w:numId w:val="1002"/>
         </w:numPr>
       </w:pPr>
-      <w:bookmarkStart w:id="116" w:name="r13"/>
+      <w:bookmarkStart w:id="117" w:name="r13"/>
       <w:r>
         <w:t xml:space="preserve">A. Mohammadnazar, Z. H. Khattak, A. J. Khattak. Assessing driving behavior influence on</w:t>
       </w:r>
@@ -9906,7 +10397,7 @@
       <w:r>
         <w:t xml:space="preserve"> </w:t>
       </w:r>
-      <w:hyperlink r:id="rId115">
+      <w:hyperlink r:id="rId116">
         <w:r>
           <w:rPr>
             <w:rStyle w:val="Hyperlink"/>
@@ -9914,7 +10405,7 @@
           <w:t xml:space="preserve">10.1016/j.trd.2023.104025</w:t>
         </w:r>
       </w:hyperlink>
-      <w:bookmarkEnd w:id="116"/>
+      <w:bookmarkEnd w:id="117"/>
     </w:p>
     <w:p>
       <w:pPr>
@@ -9924,7 +10415,7 @@
           <w:numId w:val="1002"/>
         </w:numPr>
       </w:pPr>
-      <w:bookmarkStart w:id="118" w:name="r14"/>
+      <w:bookmarkStart w:id="119" w:name="r14"/>
       <w:r>
         <w:t xml:space="preserve">D. A. Johnson, M. M. Trivedi. Driving style recognition using a smartphone as a sensor</w:t>
       </w:r>
@@ -9950,7 +10441,7 @@
       <w:r>
         <w:t xml:space="preserve"> </w:t>
       </w:r>
-      <w:hyperlink r:id="rId117">
+      <w:hyperlink r:id="rId118">
         <w:r>
           <w:rPr>
             <w:rStyle w:val="Hyperlink"/>
@@ -9958,7 +10449,7 @@
           <w:t xml:space="preserve">10.1109/ITSC.2011.6083078</w:t>
         </w:r>
       </w:hyperlink>
-      <w:bookmarkEnd w:id="118"/>
+      <w:bookmarkEnd w:id="119"/>
     </w:p>
     <w:p>
       <w:pPr>
@@ -9968,7 +10459,7 @@
           <w:numId w:val="1002"/>
         </w:numPr>
       </w:pPr>
-      <w:bookmarkStart w:id="120" w:name="r15"/>
+      <w:bookmarkStart w:id="121" w:name="r15"/>
       <w:r>
         <w:t xml:space="preserve">S. S. Haghshenas, A. Kouvelas, V. Astarita, S. S. Haghshenas, G. Guido. Driver behavior</w:t>
       </w:r>
@@ -9994,7 +10485,7 @@
       <w:r>
         <w:t xml:space="preserve"> </w:t>
       </w:r>
-      <w:hyperlink r:id="rId119">
+      <w:hyperlink r:id="rId120">
         <w:r>
           <w:rPr>
             <w:rStyle w:val="Hyperlink"/>
@@ -10002,7 +10493,7 @@
           <w:t xml:space="preserve">10.1016/j.treng.2026.100436</w:t>
         </w:r>
       </w:hyperlink>
-      <w:bookmarkEnd w:id="120"/>
+      <w:bookmarkEnd w:id="121"/>
     </w:p>
     <w:p>
       <w:pPr>
@@ -10012,7 +10503,7 @@
           <w:numId w:val="1002"/>
         </w:numPr>
       </w:pPr>
-      <w:bookmarkStart w:id="122" w:name="r16"/>
+      <w:bookmarkStart w:id="123" w:name="r16"/>
       <w:r>
         <w:t xml:space="preserve">M. Cervantes-Bobadilla et al. Multiple fault detection and isolation using artificial</w:t>
       </w:r>
@@ -10044,7 +10535,7 @@
       <w:r>
         <w:t xml:space="preserve"> </w:t>
       </w:r>
-      <w:hyperlink r:id="rId121">
+      <w:hyperlink r:id="rId122">
         <w:r>
           <w:rPr>
             <w:rStyle w:val="Hyperlink"/>
@@ -10052,7 +10543,7 @@
           <w:t xml:space="preserve">10.1016/j.engappai.2022.105524</w:t>
         </w:r>
       </w:hyperlink>
-      <w:bookmarkEnd w:id="122"/>
+      <w:bookmarkEnd w:id="123"/>
     </w:p>
     <w:p>
       <w:pPr>
@@ -10062,7 +10553,7 @@
           <w:numId w:val="1002"/>
         </w:numPr>
       </w:pPr>
-      <w:bookmarkStart w:id="124" w:name="r17"/>
+      <w:bookmarkStart w:id="125" w:name="r17"/>
       <w:r>
         <w:t xml:space="preserve">P. Gutiérrez León et al. Implementation of a fault tolerant system for</w:t>
       </w:r>
@@ -10088,7 +10579,7 @@
       <w:r>
         <w:t xml:space="preserve"> </w:t>
       </w:r>
-      <w:hyperlink r:id="rId123">
+      <w:hyperlink r:id="rId124">
         <w:r>
           <w:rPr>
             <w:rStyle w:val="Hyperlink"/>
@@ -10096,7 +10587,7 @@
           <w:t xml:space="preserve">10.1016/j.measurement.2018.03.006</w:t>
         </w:r>
       </w:hyperlink>
-      <w:bookmarkEnd w:id="124"/>
+      <w:bookmarkEnd w:id="125"/>
     </w:p>
     <w:p>
       <w:pPr>
@@ -10106,7 +10597,7 @@
           <w:numId w:val="1002"/>
         </w:numPr>
       </w:pPr>
-      <w:bookmarkStart w:id="126" w:name="r18"/>
+      <w:bookmarkStart w:id="127" w:name="r18"/>
       <w:r>
         <w:t xml:space="preserve">C.-S. A. Gong, C.-H. S. Su, Y.-E. Liu, D.-Y. Guu, Y.-H. Chen. Deep Learning with LPC and</w:t>
       </w:r>
@@ -10132,7 +10623,7 @@
       <w:r>
         <w:t xml:space="preserve"> </w:t>
       </w:r>
-      <w:hyperlink r:id="rId125">
+      <w:hyperlink r:id="rId126">
         <w:r>
           <w:rPr>
             <w:rStyle w:val="Hyperlink"/>
@@ -10140,7 +10631,7 @@
           <w:t xml:space="preserve">10.3390/s22187072</w:t>
         </w:r>
       </w:hyperlink>
-      <w:bookmarkEnd w:id="126"/>
+      <w:bookmarkEnd w:id="127"/>
     </w:p>
     <w:p>
       <w:pPr>
@@ -10150,7 +10641,7 @@
           <w:numId w:val="1002"/>
         </w:numPr>
       </w:pPr>
-      <w:bookmarkStart w:id="128" w:name="r19"/>
+      <w:bookmarkStart w:id="129" w:name="r19"/>
       <w:r>
         <w:t xml:space="preserve">F. T. Liu, K. M. Ting, Z.-H. Zhou. Isolation Forest.</w:t>
       </w:r>
@@ -10170,7 +10661,7 @@
       <w:r>
         <w:t xml:space="preserve"> </w:t>
       </w:r>
-      <w:hyperlink r:id="rId127">
+      <w:hyperlink r:id="rId128">
         <w:r>
           <w:rPr>
             <w:rStyle w:val="Hyperlink"/>
@@ -10178,7 +10669,7 @@
           <w:t xml:space="preserve">10.1109/ICDM.2008.17</w:t>
         </w:r>
       </w:hyperlink>
-      <w:bookmarkEnd w:id="128"/>
+      <w:bookmarkEnd w:id="129"/>
     </w:p>
     <w:p>
       <w:pPr>
@@ -10188,7 +10679,7 @@
           <w:numId w:val="1002"/>
         </w:numPr>
       </w:pPr>
-      <w:bookmarkStart w:id="130" w:name="r20"/>
+      <w:bookmarkStart w:id="131" w:name="r20"/>
       <w:r>
         <w:t xml:space="preserve">S. Longari, D. H. Nova Valcarcel, M. Zago, M. Carminati, S. Zanero. CANnolo: An Anomaly</w:t>
       </w:r>
@@ -10228,7 +10719,7 @@
       <w:r>
         <w:t xml:space="preserve"> </w:t>
       </w:r>
-      <w:hyperlink r:id="rId129">
+      <w:hyperlink r:id="rId130">
         <w:r>
           <w:rPr>
             <w:rStyle w:val="Hyperlink"/>
@@ -10236,7 +10727,7 @@
           <w:t xml:space="preserve">10.1109/TNSM.2020.3038991</w:t>
         </w:r>
       </w:hyperlink>
-      <w:bookmarkEnd w:id="130"/>
+      <w:bookmarkEnd w:id="131"/>
     </w:p>
     <w:p>
       <w:pPr>
@@ -10246,7 +10737,7 @@
           <w:numId w:val="1002"/>
         </w:numPr>
       </w:pPr>
-      <w:bookmarkStart w:id="132" w:name="r21"/>
+      <w:bookmarkStart w:id="133" w:name="r21"/>
       <w:r>
         <w:t xml:space="preserve">V. K. Kukkala, S. V. Thiruloga, S. Pasricha. INDRA: Intrusion Detection Using Recurrent</w:t>
       </w:r>
@@ -10286,7 +10777,7 @@
       <w:r>
         <w:t xml:space="preserve"> </w:t>
       </w:r>
-      <w:hyperlink r:id="rId131">
+      <w:hyperlink r:id="rId132">
         <w:r>
           <w:rPr>
             <w:rStyle w:val="Hyperlink"/>
@@ -10294,7 +10785,7 @@
           <w:t xml:space="preserve">10.1109/TCAD.2020.3012749</w:t>
         </w:r>
       </w:hyperlink>
-      <w:bookmarkEnd w:id="132"/>
+      <w:bookmarkEnd w:id="133"/>
     </w:p>
     <w:p>
       <w:pPr>
@@ -10304,7 +10795,7 @@
           <w:numId w:val="1002"/>
         </w:numPr>
       </w:pPr>
-      <w:bookmarkStart w:id="134" w:name="r22"/>
+      <w:bookmarkStart w:id="135" w:name="r22"/>
       <w:r>
         <w:t xml:space="preserve">P. Mansourian, N. Zhang, A. Jaekel, M. Kneppers. Deep Learning-Based Anomaly Detection for</w:t>
       </w:r>
@@ -10344,7 +10835,7 @@
       <w:r>
         <w:t xml:space="preserve"> </w:t>
       </w:r>
-      <w:hyperlink r:id="rId133">
+      <w:hyperlink r:id="rId134">
         <w:r>
           <w:rPr>
             <w:rStyle w:val="Hyperlink"/>
@@ -10352,7 +10843,7 @@
           <w:t xml:space="preserve">10.1109/TITS.2023.3286611</w:t>
         </w:r>
       </w:hyperlink>
-      <w:bookmarkEnd w:id="134"/>
+      <w:bookmarkEnd w:id="135"/>
     </w:p>
     <w:p>
       <w:pPr>
@@ -10362,7 +10853,7 @@
           <w:numId w:val="1002"/>
         </w:numPr>
       </w:pPr>
-      <w:bookmarkStart w:id="136" w:name="r23"/>
+      <w:bookmarkStart w:id="137" w:name="r23"/>
       <w:r>
         <w:t xml:space="preserve">S. M. Lundberg, S.-I. Lee. A Unified Approach to Interpreting Model Predictions (SHAP).</w:t>
       </w:r>
@@ -10375,7 +10866,7 @@
       <w:r>
         <w:t xml:space="preserve"> </w:t>
       </w:r>
-      <w:hyperlink r:id="rId135">
+      <w:hyperlink r:id="rId136">
         <w:r>
           <w:rPr>
             <w:rStyle w:val="Hyperlink"/>
@@ -10383,7 +10874,7 @@
           <w:t xml:space="preserve">10.48550/arXiv.1705.07874</w:t>
         </w:r>
       </w:hyperlink>
-      <w:bookmarkEnd w:id="136"/>
+      <w:bookmarkEnd w:id="137"/>
     </w:p>
     <w:p>
       <w:pPr>
@@ -10393,7 +10884,7 @@
           <w:numId w:val="1002"/>
         </w:numPr>
       </w:pPr>
-      <w:bookmarkStart w:id="138" w:name="r24"/>
+      <w:bookmarkStart w:id="139" w:name="r24"/>
       <w:r>
         <w:t xml:space="preserve">V. Vučinić et al. Anomaly Detection for Vehicle Diagnostics Based on OBD</w:t>
       </w:r>
@@ -10419,7 +10910,7 @@
       <w:r>
         <w:t xml:space="preserve"> </w:t>
       </w:r>
-      <w:hyperlink r:id="rId137">
+      <w:hyperlink r:id="rId138">
         <w:r>
           <w:rPr>
             <w:rStyle w:val="Hyperlink"/>
@@ -10427,7 +10918,7 @@
           <w:t xml:space="preserve">10.1109/ACCESS.2026.3664118</w:t>
         </w:r>
       </w:hyperlink>
-      <w:bookmarkEnd w:id="138"/>
+      <w:bookmarkEnd w:id="139"/>
     </w:p>
     <w:p>
       <w:pPr>
@@ -10437,7 +10928,7 @@
           <w:numId w:val="1002"/>
         </w:numPr>
       </w:pPr>
-      <w:bookmarkStart w:id="140" w:name="r25"/>
+      <w:bookmarkStart w:id="141" w:name="r25"/>
       <w:r>
         <w:t xml:space="preserve">Z.-H. Zhou. A brief introduction to weakly supervised learning.</w:t>
       </w:r>
@@ -10471,7 +10962,7 @@
       <w:r>
         <w:t xml:space="preserve"> </w:t>
       </w:r>
-      <w:hyperlink r:id="rId139">
+      <w:hyperlink r:id="rId140">
         <w:r>
           <w:rPr>
             <w:rStyle w:val="Hyperlink"/>
@@ -10479,7 +10970,7 @@
           <w:t xml:space="preserve">10.1093/nsr/nwx106</w:t>
         </w:r>
       </w:hyperlink>
-      <w:bookmarkEnd w:id="140"/>
+      <w:bookmarkEnd w:id="141"/>
     </w:p>
     <w:p>
       <w:pPr>
@@ -10489,7 +10980,7 @@
         <w:t xml:space="preserve">© 2026 Alexander Apartsin and Yehudit Aperstein.</w:t>
       </w:r>
     </w:p>
-    <w:bookmarkEnd w:id="141"/>
+    <w:bookmarkEnd w:id="142"/>
     <w:sectPr/>
   </w:body>
 </w:document>

</xml_diff>

<commit_message>
E4 stress tests + E5 task-aligned baselines
E4 (scripts/p14): mixed-cause 2D dominant-cause grid (Figure 8); graceful
degradation under score noise (0.886->0.74@1.5SD), combustion bias, and missing
trim (->0.80@50%); probabilistic metrics AUROC 0.951 / AUPRC 0.945 / Brier 0.092.
E5: task-aligned baselines all ~0.89 zero-shot (rule 0.891, LR-prototype 0.886,
frozen 0.886), trained-full upper bound 0.952, fuel-only 0.51 (Table 8) -> signature
carries the result, not the attributor choice (addresses W10).
New Sec 8.4 stress+baselines content, Table 8, Figure 8; worked example -> Figure 9.
RESULTS.md P14; results.json updated.
</commit_message>
<xml_diff>
--- a/FuelAnomalies.docx
+++ b/FuelAnomalies.docx
@@ -7288,7 +7288,7 @@
       </w:r>
     </w:p>
     <w:bookmarkEnd w:id="62"/>
-    <w:bookmarkStart w:id="80" w:name="attrib"/>
+    <w:bookmarkStart w:id="83" w:name="attrib"/>
     <w:p>
       <w:pPr>
         <w:pStyle w:val="Heading2"/>
@@ -8344,7 +8344,7 @@
       </w:r>
     </w:p>
     <w:bookmarkEnd w:id="71"/>
-    <w:bookmarkStart w:id="72" w:name="X0770e934613aa954cded40406b703862608b6b5"/>
+    <w:bookmarkStart w:id="75" w:name="X0770e934613aa954cded40406b703862608b6b5"/>
     <w:p>
       <w:pPr>
         <w:pStyle w:val="Heading3"/>
@@ -8822,8 +8822,489 @@
         <w:t xml:space="preserve">(no injection-label training) matches the trained upper bound; fuel magnitude alone stays at chance.</w:t>
       </w:r>
     </w:p>
-    <w:bookmarkEnd w:id="72"/>
-    <w:bookmarkStart w:id="75" w:name="Xb70b62c2f344913f38fcc3ac71a67668c178b99"/>
+    <w:p>
+      <w:pPr>
+        <w:pStyle w:val="BodyText"/>
+      </w:pPr>
+      <w:r>
+        <w:t xml:space="preserve">The real world does not present pure one-axis changes, so we stress the frozen rule. When both causes</w:t>
+      </w:r>
+      <w:r>
+        <w:t xml:space="preserve"> </w:t>
+      </w:r>
+      <w:r>
+        <w:t xml:space="preserve">act at once, we score dominant-cause accuracy over a grid of driver and fault effect sizes (Figure 8):</w:t>
+      </w:r>
+      <w:r>
+        <w:t xml:space="preserve"> </w:t>
+      </w:r>
+      <w:r>
+        <w:t xml:space="preserve">attribution is accurate off the diagonal and degrades to chance only where the two effects are equal</w:t>
+      </w:r>
+      <w:r>
+        <w:t xml:space="preserve"> </w:t>
+      </w:r>
+      <w:r>
+        <w:t xml:space="preserve">and the cause is genuinely ambiguous. The rule degrades gracefully under departures from ideal</w:t>
+      </w:r>
+      <w:r>
+        <w:t xml:space="preserve"> </w:t>
+      </w:r>
+      <w:r>
+        <w:t xml:space="preserve">conditions at the bench magnitude: additive Gaussian score noise takes accuracy from 0.886 to 0.80</w:t>
+      </w:r>
+      <w:r>
+        <w:t xml:space="preserve"> </w:t>
+      </w:r>
+      <w:r>
+        <w:t xml:space="preserve">(1 SD) and 0.74 (1.5 SD); a systematic combustion-score bias to 0.83 (1 SD); and dropping the</w:t>
+      </w:r>
+      <w:r>
+        <w:t xml:space="preserve"> </w:t>
+      </w:r>
+      <w:r>
+        <w:t xml:space="preserve">fuel-trim channel for a fraction of trips to 0.85 (20% missing) and 0.80 (50%). As a probabilistic</w:t>
+      </w:r>
+      <w:r>
+        <w:t xml:space="preserve"> </w:t>
+      </w:r>
+      <w:r>
+        <w:t xml:space="preserve">scorer (the sigmoid of the score margin) the frozen rule reaches AUROC 0.951, average precision 0.945,</w:t>
+      </w:r>
+      <w:r>
+        <w:t xml:space="preserve"> </w:t>
+      </w:r>
+      <w:r>
+        <w:t xml:space="preserve">and a Brier score of 0.092 at the bench magnitude.</w:t>
+      </w:r>
+    </w:p>
+    <w:p>
+      <w:pPr>
+        <w:pStyle w:val="CaptionedFigure"/>
+      </w:pPr>
+      <w:r>
+        <w:drawing>
+          <wp:inline>
+            <wp:extent cx="4261104" cy="3608832"/>
+            <wp:effectExtent b="0" l="0" r="0" t="0"/>
+            <wp:docPr descr="Mixed-cause dominant-cause accuracy grid" title="" id="73" name="Picture"/>
+            <a:graphic>
+              <a:graphicData uri="http://schemas.openxmlformats.org/drawingml/2006/picture">
+                <pic:pic>
+                  <pic:nvPicPr>
+                    <pic:cNvPr descr="figures/mixed_cause_grid.png" id="74" name="Picture"/>
+                    <pic:cNvPicPr>
+                      <a:picLocks noChangeArrowheads="1" noChangeAspect="1"/>
+                    </pic:cNvPicPr>
+                  </pic:nvPicPr>
+                  <pic:blipFill>
+                    <a:blip r:embed="rId72"/>
+                    <a:stretch>
+                      <a:fillRect/>
+                    </a:stretch>
+                  </pic:blipFill>
+                  <pic:spPr bwMode="auto">
+                    <a:xfrm>
+                      <a:off x="0" y="0"/>
+                      <a:ext cx="4261104" cy="3608832"/>
+                    </a:xfrm>
+                    <a:prstGeom prst="rect">
+                      <a:avLst/>
+                    </a:prstGeom>
+                    <a:noFill/>
+                    <a:ln w="9525">
+                      <a:noFill/>
+                      <a:headEnd/>
+                      <a:tailEnd/>
+                    </a:ln>
+                  </pic:spPr>
+                </pic:pic>
+              </a:graphicData>
+            </a:graphic>
+          </wp:inline>
+        </w:drawing>
+      </w:r>
+    </w:p>
+    <w:p>
+      <w:pPr>
+        <w:pStyle w:val="ImageCaption"/>
+      </w:pPr>
+      <w:r>
+        <w:rPr>
+          <w:b/>
+          <w:bCs/>
+        </w:rPr>
+        <w:t xml:space="preserve">Figure 8.</w:t>
+      </w:r>
+      <w:r>
+        <w:t xml:space="preserve"> </w:t>
+      </w:r>
+      <w:r>
+        <w:t xml:space="preserve">Dominant-cause accuracy when both causes act, over driver effect</w:t>
+      </w:r>
+      <w:r>
+        <w:t xml:space="preserve"> </w:t>
+      </w:r>
+      <m:oMath>
+        <m:sSub>
+          <m:e>
+            <m:r>
+              <m:t>S</m:t>
+            </m:r>
+          </m:e>
+          <m:sub>
+            <m:r>
+              <m:t>d</m:t>
+            </m:r>
+          </m:sub>
+        </m:sSub>
+      </m:oMath>
+      <w:r>
+        <w:t xml:space="preserve"> </w:t>
+      </w:r>
+      <w:r>
+        <w:t xml:space="preserve">and fault effect</w:t>
+      </w:r>
+      <w:r>
+        <w:t xml:space="preserve"> </w:t>
+      </w:r>
+      <m:oMath>
+        <m:sSub>
+          <m:e>
+            <m:r>
+              <m:t>S</m:t>
+            </m:r>
+          </m:e>
+          <m:sub>
+            <m:r>
+              <m:t>f</m:t>
+            </m:r>
+          </m:sub>
+        </m:sSub>
+      </m:oMath>
+      <w:r>
+        <w:t xml:space="preserve">. Attribution is reliable off the diagonal and falls to chance only</w:t>
+      </w:r>
+      <w:r>
+        <w:t xml:space="preserve"> </w:t>
+      </w:r>
+      <w:r>
+        <w:t xml:space="preserve">where the two effects are equal.</w:t>
+      </w:r>
+    </w:p>
+    <w:p>
+      <w:pPr>
+        <w:pStyle w:val="BodyText"/>
+      </w:pPr>
+      <w:r>
+        <w:t xml:space="preserve">Attribution is not an artifact of one classifier. At the bench magnitude, task-aligned baselines all</w:t>
+      </w:r>
+      <w:r>
+        <w:t xml:space="preserve"> </w:t>
+      </w:r>
+      <w:r>
+        <w:t xml:space="preserve">cluster near the frozen rule and far above chance (Table 8): a raw-threshold rule on harsh-event rate</w:t>
+      </w:r>
+      <w:r>
+        <w:t xml:space="preserve"> </w:t>
+      </w:r>
+      <w:r>
+        <w:t xml:space="preserve">versus fuel trim reaches 0.89, a likelihood-ratio prototype against source-calibrated signature</w:t>
+      </w:r>
+      <w:r>
+        <w:t xml:space="preserve"> </w:t>
+      </w:r>
+      <w:r>
+        <w:t xml:space="preserve">distributions 0.89, and a classifier trained on all features and the injection labels sets the upper</w:t>
+      </w:r>
+      <w:r>
+        <w:t xml:space="preserve"> </w:t>
+      </w:r>
+      <w:r>
+        <w:t xml:space="preserve">bound at 0.95, while the fuel-only baseline stays at 0.51. The signature separation, not the choice of</w:t>
+      </w:r>
+      <w:r>
+        <w:t xml:space="preserve"> </w:t>
+      </w:r>
+      <w:r>
+        <w:t xml:space="preserve">attributor, is what carries the result.</w:t>
+      </w:r>
+    </w:p>
+    <w:tbl>
+      <w:tblPr>
+        <w:tblStyle w:val="Table"/>
+        <w:tblW w:type="auto" w:w="0"/>
+        <w:tblLook w:firstRow="1" w:lastRow="0" w:firstColumn="0" w:lastColumn="0" w:noHBand="0" w:noVBand="0" w:val="0020"/>
+      </w:tblPr>
+      <w:tblGrid>
+        <w:gridCol w:w="2640"/>
+        <w:gridCol w:w="2640"/>
+        <w:gridCol w:w="2640"/>
+      </w:tblGrid>
+      <w:tr>
+        <w:trPr>
+          <w:tblHeader w:val="on"/>
+        </w:trPr>
+        <w:tc>
+          <w:tcPr/>
+          <w:p>
+            <w:pPr>
+              <w:pStyle w:val="Compact"/>
+              <w:jc w:val="left"/>
+            </w:pPr>
+            <w:r>
+              <w:t xml:space="preserve">Attributor (at bench magnitude)</w:t>
+            </w:r>
+          </w:p>
+        </w:tc>
+        <w:tc>
+          <w:tcPr/>
+          <w:p>
+            <w:pPr>
+              <w:pStyle w:val="Compact"/>
+              <w:jc w:val="left"/>
+            </w:pPr>
+            <w:r>
+              <w:t xml:space="preserve">Accuracy</w:t>
+            </w:r>
+          </w:p>
+        </w:tc>
+        <w:tc>
+          <w:tcPr/>
+          <w:p>
+            <w:pPr>
+              <w:pStyle w:val="Compact"/>
+              <w:jc w:val="left"/>
+            </w:pPr>
+            <w:r>
+              <w:t xml:space="preserve">Uses injection labels?</w:t>
+            </w:r>
+          </w:p>
+        </w:tc>
+      </w:tr>
+      <w:tr>
+        <w:tc>
+          <w:tcPr/>
+          <w:p>
+            <w:pPr>
+              <w:pStyle w:val="Compact"/>
+              <w:jc w:val="left"/>
+            </w:pPr>
+            <w:r>
+              <w:t xml:space="preserve">Fuel magnitude only</w:t>
+            </w:r>
+          </w:p>
+        </w:tc>
+        <w:tc>
+          <w:tcPr/>
+          <w:p>
+            <w:pPr>
+              <w:pStyle w:val="Compact"/>
+              <w:jc w:val="left"/>
+            </w:pPr>
+            <w:r>
+              <w:t xml:space="preserve">0.51</w:t>
+            </w:r>
+          </w:p>
+        </w:tc>
+        <w:tc>
+          <w:tcPr/>
+          <w:p>
+            <w:pPr>
+              <w:pStyle w:val="Compact"/>
+              <w:jc w:val="left"/>
+            </w:pPr>
+            <w:r>
+              <w:t xml:space="preserve">n/a (chance)</w:t>
+            </w:r>
+          </w:p>
+        </w:tc>
+      </w:tr>
+      <w:tr>
+        <w:tc>
+          <w:tcPr/>
+          <w:p>
+            <w:pPr>
+              <w:pStyle w:val="Compact"/>
+              <w:jc w:val="left"/>
+            </w:pPr>
+            <w:r>
+              <w:t xml:space="preserve">Frozen source-derived argmax</w:t>
+            </w:r>
+          </w:p>
+        </w:tc>
+        <w:tc>
+          <w:tcPr/>
+          <w:p>
+            <w:pPr>
+              <w:pStyle w:val="Compact"/>
+              <w:jc w:val="left"/>
+            </w:pPr>
+            <w:r>
+              <w:t xml:space="preserve">0.886</w:t>
+            </w:r>
+          </w:p>
+        </w:tc>
+        <w:tc>
+          <w:tcPr/>
+          <w:p>
+            <w:pPr>
+              <w:pStyle w:val="Compact"/>
+              <w:jc w:val="left"/>
+            </w:pPr>
+            <w:r>
+              <w:t xml:space="preserve">no</w:t>
+            </w:r>
+          </w:p>
+        </w:tc>
+      </w:tr>
+      <w:tr>
+        <w:tc>
+          <w:tcPr/>
+          <w:p>
+            <w:pPr>
+              <w:pStyle w:val="Compact"/>
+              <w:jc w:val="left"/>
+            </w:pPr>
+            <w:r>
+              <w:t xml:space="preserve">Raw-threshold rule (harsh rate vs trim)</w:t>
+            </w:r>
+          </w:p>
+        </w:tc>
+        <w:tc>
+          <w:tcPr/>
+          <w:p>
+            <w:pPr>
+              <w:pStyle w:val="Compact"/>
+              <w:jc w:val="left"/>
+            </w:pPr>
+            <w:r>
+              <w:t xml:space="preserve">0.891</w:t>
+            </w:r>
+          </w:p>
+        </w:tc>
+        <w:tc>
+          <w:tcPr/>
+          <w:p>
+            <w:pPr>
+              <w:pStyle w:val="Compact"/>
+              <w:jc w:val="left"/>
+            </w:pPr>
+            <w:r>
+              <w:t xml:space="preserve">no</w:t>
+            </w:r>
+          </w:p>
+        </w:tc>
+      </w:tr>
+      <w:tr>
+        <w:tc>
+          <w:tcPr/>
+          <w:p>
+            <w:pPr>
+              <w:pStyle w:val="Compact"/>
+              <w:jc w:val="left"/>
+            </w:pPr>
+            <w:r>
+              <w:t xml:space="preserve">Likelihood-ratio prototype (source-calibrated)</w:t>
+            </w:r>
+          </w:p>
+        </w:tc>
+        <w:tc>
+          <w:tcPr/>
+          <w:p>
+            <w:pPr>
+              <w:pStyle w:val="Compact"/>
+              <w:jc w:val="left"/>
+            </w:pPr>
+            <w:r>
+              <w:t xml:space="preserve">0.886</w:t>
+            </w:r>
+          </w:p>
+        </w:tc>
+        <w:tc>
+          <w:tcPr/>
+          <w:p>
+            <w:pPr>
+              <w:pStyle w:val="Compact"/>
+              <w:jc w:val="left"/>
+            </w:pPr>
+            <w:r>
+              <w:t xml:space="preserve">no</w:t>
+            </w:r>
+          </w:p>
+        </w:tc>
+      </w:tr>
+      <w:tr>
+        <w:tc>
+          <w:tcPr/>
+          <w:p>
+            <w:pPr>
+              <w:pStyle w:val="Compact"/>
+              <w:jc w:val="left"/>
+            </w:pPr>
+            <w:r>
+              <w:t xml:space="preserve">Trained full-feature logistic (upper bound)</w:t>
+            </w:r>
+          </w:p>
+        </w:tc>
+        <w:tc>
+          <w:tcPr/>
+          <w:p>
+            <w:pPr>
+              <w:pStyle w:val="Compact"/>
+              <w:jc w:val="left"/>
+            </w:pPr>
+            <w:r>
+              <w:t xml:space="preserve">0.952</w:t>
+            </w:r>
+          </w:p>
+        </w:tc>
+        <w:tc>
+          <w:tcPr/>
+          <w:p>
+            <w:pPr>
+              <w:pStyle w:val="Compact"/>
+              <w:jc w:val="left"/>
+            </w:pPr>
+            <w:r>
+              <w:t xml:space="preserve">yes</w:t>
+            </w:r>
+          </w:p>
+        </w:tc>
+      </w:tr>
+    </w:tbl>
+    <w:p>
+      <w:pPr>
+        <w:pStyle w:val="BodyText"/>
+      </w:pPr>
+      <w:r>
+        <w:rPr>
+          <w:b/>
+          <w:bCs/>
+        </w:rPr>
+        <w:t xml:space="preserve">Table 8.</w:t>
+      </w:r>
+      <w:r>
+        <w:t xml:space="preserve"> </w:t>
+      </w:r>
+      <w:r>
+        <w:t xml:space="preserve">Task-aligned attribution baselines. Every signature-based attributor</w:t>
+      </w:r>
+      <w:r>
+        <w:t xml:space="preserve"> </w:t>
+      </w:r>
+      <w:r>
+        <w:t xml:space="preserve">reaches ~0.89 without injection labels; only the trained upper bound uses them; fuel magnitude is at</w:t>
+      </w:r>
+      <w:r>
+        <w:t xml:space="preserve"> </w:t>
+      </w:r>
+      <w:r>
+        <w:t xml:space="preserve">chance.</w:t>
+      </w:r>
+    </w:p>
+    <w:bookmarkEnd w:id="75"/>
+    <w:bookmarkStart w:id="78" w:name="Xb70b62c2f344913f38fcc3ac71a67668c178b99"/>
     <w:p>
       <w:pPr>
         <w:pStyle w:val="Heading3"/>
@@ -8846,7 +9327,7 @@
         <w:t xml:space="preserve">out.</w:t>
       </w:r>
     </w:p>
-    <w:bookmarkStart w:id="73" w:name="trim-blindness-of-the-fuel-target"/>
+    <w:bookmarkStart w:id="76" w:name="trim-blindness-of-the-fuel-target"/>
     <w:p>
       <w:pPr>
         <w:pStyle w:val="Heading4"/>
@@ -9023,8 +9504,8 @@
         <w:t xml:space="preserve">by less than 0.01.</w:t>
       </w:r>
     </w:p>
-    <w:bookmarkEnd w:id="73"/>
-    <w:bookmarkStart w:id="74" w:name="range-restriction"/>
+    <w:bookmarkEnd w:id="76"/>
+    <w:bookmarkStart w:id="77" w:name="range-restriction"/>
     <w:p>
       <w:pPr>
         <w:pStyle w:val="Heading4"/>
@@ -9088,9 +9569,9 @@
         <w:t xml:space="preserve">combustion-linked, not a measurement or sampling artifact.</w:t>
       </w:r>
     </w:p>
-    <w:bookmarkEnd w:id="74"/>
-    <w:bookmarkEnd w:id="75"/>
-    <w:bookmarkStart w:id="79" w:name="a-worked-example"/>
+    <w:bookmarkEnd w:id="77"/>
+    <w:bookmarkEnd w:id="78"/>
+    <w:bookmarkStart w:id="82" w:name="a-worked-example"/>
     <w:p>
       <w:pPr>
         <w:pStyle w:val="Heading3"/>
@@ -9104,7 +9585,7 @@
         <w:pStyle w:val="FirstParagraph"/>
       </w:pPr>
       <w:r>
-        <w:t xml:space="preserve">Figure 8 shows the method's per-trip product on two real trips with the same symptom and opposite</w:t>
+        <w:t xml:space="preserve">Figure 9 shows the method's per-trip product on two real trips with the same symptom and opposite</w:t>
       </w:r>
       <w:r>
         <w:t xml:space="preserve"> </w:t>
@@ -9140,18 +9621,18 @@
           <wp:inline>
             <wp:extent cx="5334000" cy="2380462"/>
             <wp:effectExtent b="0" l="0" r="0" t="0"/>
-            <wp:docPr descr="Per-trip decomposition, two example trips" title="" id="77" name="Picture"/>
+            <wp:docPr descr="Per-trip decomposition, two example trips" title="" id="80" name="Picture"/>
             <a:graphic>
               <a:graphicData uri="http://schemas.openxmlformats.org/drawingml/2006/picture">
                 <pic:pic>
                   <pic:nvPicPr>
-                    <pic:cNvPr descr="figures/fig7_worked_example.png" id="78" name="Picture"/>
+                    <pic:cNvPr descr="figures/fig7_worked_example.png" id="81" name="Picture"/>
                     <pic:cNvPicPr>
                       <a:picLocks noChangeArrowheads="1" noChangeAspect="1"/>
                     </pic:cNvPicPr>
                   </pic:nvPicPr>
                   <pic:blipFill>
-                    <a:blip r:embed="rId76"/>
+                    <a:blip r:embed="rId79"/>
                     <a:stretch>
                       <a:fillRect/>
                     </a:stretch>
@@ -9187,7 +9668,7 @@
           <w:b/>
           <w:bCs/>
         </w:rPr>
-        <w:t xml:space="preserve">Figure 8.</w:t>
+        <w:t xml:space="preserve">Figure 9.</w:t>
       </w:r>
       <w:r>
         <w:t xml:space="preserve"> </w:t>
@@ -9202,9 +9683,9 @@
         <w:t xml:space="preserve">separates a driver-dominated trip (A) from a vehicle-dominated trip (B).</w:t>
       </w:r>
     </w:p>
-    <w:bookmarkEnd w:id="79"/>
-    <w:bookmarkEnd w:id="80"/>
-    <w:bookmarkStart w:id="85" w:name="discuss"/>
+    <w:bookmarkEnd w:id="82"/>
+    <w:bookmarkEnd w:id="83"/>
+    <w:bookmarkStart w:id="88" w:name="discuss"/>
     <w:p>
       <w:pPr>
         <w:pStyle w:val="Heading2"/>
@@ -9213,7 +9694,7 @@
         <w:t xml:space="preserve">9. Discussion</w:t>
       </w:r>
     </w:p>
-    <w:bookmarkStart w:id="81" w:name="why-signature-based-attribution-works"/>
+    <w:bookmarkStart w:id="84" w:name="why-signature-based-attribution-works"/>
     <w:p>
       <w:pPr>
         <w:pStyle w:val="Heading3"/>
@@ -9289,8 +9770,8 @@
         <w:t xml:space="preserve">driver-caused excess and why attribution is possible from standard channels.</w:t>
       </w:r>
     </w:p>
-    <w:bookmarkEnd w:id="81"/>
-    <w:bookmarkStart w:id="82" w:name="deployment"/>
+    <w:bookmarkEnd w:id="84"/>
+    <w:bookmarkStart w:id="85" w:name="deployment"/>
     <w:p>
       <w:pPr>
         <w:pStyle w:val="Heading3"/>
@@ -9360,8 +9841,8 @@
         <w:t xml:space="preserve">and are attributed less confidently, degrading gracefully rather than failing abruptly.</w:t>
       </w:r>
     </w:p>
-    <w:bookmarkEnd w:id="82"/>
-    <w:bookmarkStart w:id="83" w:name="what-the-vehicle-baseline-is"/>
+    <w:bookmarkEnd w:id="85"/>
+    <w:bookmarkStart w:id="86" w:name="what-the-vehicle-baseline-is"/>
     <w:p>
       <w:pPr>
         <w:pStyle w:val="Heading3"/>
@@ -9412,8 +9893,8 @@
         <w:t xml:space="preserve">mechanical fault, which remains a diagnosis step.</w:t>
       </w:r>
     </w:p>
-    <w:bookmarkEnd w:id="83"/>
-    <w:bookmarkStart w:id="84" w:name="the-benchmark-the-field-needs"/>
+    <w:bookmarkEnd w:id="86"/>
+    <w:bookmarkStart w:id="87" w:name="the-benchmark-the-field-needs"/>
     <w:p>
       <w:pPr>
         <w:pStyle w:val="Heading3"/>
@@ -9448,9 +9929,9 @@
         <w:t xml:space="preserve">bridge to be replaced by real ground truth.</w:t>
       </w:r>
     </w:p>
-    <w:bookmarkEnd w:id="84"/>
-    <w:bookmarkEnd w:id="85"/>
-    <w:bookmarkStart w:id="87" w:name="limits"/>
+    <w:bookmarkEnd w:id="87"/>
+    <w:bookmarkEnd w:id="88"/>
+    <w:bookmarkStart w:id="90" w:name="limits"/>
     <w:p>
       <w:pPr>
         <w:pStyle w:val="Heading2"/>
@@ -9533,7 +10014,7 @@
         <w:t xml:space="preserve">analysis is left to future work.</w:t>
       </w:r>
     </w:p>
-    <w:bookmarkStart w:id="86" w:name="responsible-use"/>
+    <w:bookmarkStart w:id="89" w:name="responsible-use"/>
     <w:p>
       <w:pPr>
         <w:pStyle w:val="Heading3"/>
@@ -9568,9 +10049,9 @@
         <w:t xml:space="preserve">automatic verdict; the per-trip output is a decomposition with error bars, not a judgment.</w:t>
       </w:r>
     </w:p>
-    <w:bookmarkEnd w:id="86"/>
-    <w:bookmarkEnd w:id="87"/>
-    <w:bookmarkStart w:id="88" w:name="conclusion"/>
+    <w:bookmarkEnd w:id="89"/>
+    <w:bookmarkEnd w:id="90"/>
+    <w:bookmarkStart w:id="91" w:name="conclusion"/>
     <w:p>
       <w:pPr>
         <w:pStyle w:val="Heading2"/>
@@ -9635,8 +10116,8 @@
         <w:t xml:space="preserve">public dataset that carries fuel, faults, and behaviour together.</w:t>
       </w:r>
     </w:p>
-    <w:bookmarkEnd w:id="88"/>
-    <w:bookmarkStart w:id="92" w:name="repro"/>
+    <w:bookmarkEnd w:id="91"/>
+    <w:bookmarkStart w:id="95" w:name="repro"/>
     <w:p>
       <w:pPr>
         <w:pStyle w:val="Heading2"/>
@@ -9658,7 +10139,7 @@
       <w:r>
         <w:t xml:space="preserve">(</w:t>
       </w:r>
-      <w:hyperlink r:id="rId89">
+      <w:hyperlink r:id="rId92">
         <w:r>
           <w:rPr>
             <w:rStyle w:val="Hyperlink"/>
@@ -9675,7 +10156,7 @@
       <w:r>
         <w:t xml:space="preserve">(</w:t>
       </w:r>
-      <w:hyperlink r:id="rId90">
+      <w:hyperlink r:id="rId93">
         <w:r>
           <w:rPr>
             <w:rStyle w:val="Hyperlink"/>
@@ -9692,7 +10173,7 @@
       <w:r>
         <w:t xml:space="preserve">GPL-3.0); Driving Events (</w:t>
       </w:r>
-      <w:hyperlink r:id="rId91">
+      <w:hyperlink r:id="rId94">
         <w:r>
           <w:rPr>
             <w:rStyle w:val="Hyperlink"/>
@@ -9801,8 +10282,8 @@
         <w:t xml:space="preserve">for releasing their data openly.</w:t>
       </w:r>
     </w:p>
-    <w:bookmarkEnd w:id="92"/>
-    <w:bookmarkStart w:id="142" w:name="refs"/>
+    <w:bookmarkEnd w:id="95"/>
+    <w:bookmarkStart w:id="145" w:name="refs"/>
     <w:p>
       <w:pPr>
         <w:pStyle w:val="Heading2"/>
@@ -9819,7 +10300,7 @@
           <w:numId w:val="1002"/>
         </w:numPr>
       </w:pPr>
-      <w:bookmarkStart w:id="94" w:name="r1"/>
+      <w:bookmarkStart w:id="97" w:name="r1"/>
       <w:r>
         <w:t xml:space="preserve">G. Oh, D. J. LeBlanc, H. Peng. Vehicle Energy Dataset (VED), A Large-scale Dataset for</w:t>
       </w:r>
@@ -9851,7 +10332,7 @@
       <w:r>
         <w:t xml:space="preserve"> </w:t>
       </w:r>
-      <w:hyperlink r:id="rId93">
+      <w:hyperlink r:id="rId96">
         <w:r>
           <w:rPr>
             <w:rStyle w:val="Hyperlink"/>
@@ -9859,7 +10340,7 @@
           <w:t xml:space="preserve">10.1109/TITS.2020.3035596</w:t>
         </w:r>
       </w:hyperlink>
-      <w:bookmarkEnd w:id="94"/>
+      <w:bookmarkEnd w:id="97"/>
     </w:p>
     <w:p>
       <w:pPr>
@@ -9869,7 +10350,7 @@
           <w:numId w:val="1002"/>
         </w:numPr>
       </w:pPr>
-      <w:bookmarkStart w:id="96" w:name="r2"/>
+      <w:bookmarkStart w:id="99" w:name="r2"/>
       <w:r>
         <w:t xml:space="preserve">L. Thomas et al. EngineFaultDB: A Novel Dataset for Automotive Engine Fault</w:t>
       </w:r>
@@ -9895,7 +10376,7 @@
       <w:r>
         <w:t xml:space="preserve"> </w:t>
       </w:r>
-      <w:hyperlink r:id="rId95">
+      <w:hyperlink r:id="rId98">
         <w:r>
           <w:rPr>
             <w:rStyle w:val="Hyperlink"/>
@@ -9903,7 +10384,7 @@
           <w:t xml:space="preserve">10.1109/ACCESS.2023.3331316</w:t>
         </w:r>
       </w:hyperlink>
-      <w:bookmarkEnd w:id="96"/>
+      <w:bookmarkEnd w:id="99"/>
     </w:p>
     <w:p>
       <w:pPr>
@@ -9913,7 +10394,7 @@
           <w:numId w:val="1002"/>
         </w:numPr>
       </w:pPr>
-      <w:bookmarkStart w:id="98" w:name="r3"/>
+      <w:bookmarkStart w:id="101" w:name="r3"/>
       <w:r>
         <w:t xml:space="preserve">A. Barbado, Ó. Corcho. Interpretable machine learning models for predicting and</w:t>
       </w:r>
@@ -9953,7 +10434,7 @@
       <w:r>
         <w:t xml:space="preserve"> </w:t>
       </w:r>
-      <w:hyperlink r:id="rId97">
+      <w:hyperlink r:id="rId100">
         <w:r>
           <w:rPr>
             <w:rStyle w:val="Hyperlink"/>
@@ -9961,7 +10442,7 @@
           <w:t xml:space="preserve">10.1016/j.engappai.2022.105222</w:t>
         </w:r>
       </w:hyperlink>
-      <w:bookmarkEnd w:id="98"/>
+      <w:bookmarkEnd w:id="101"/>
     </w:p>
     <w:p>
       <w:pPr>
@@ -9971,7 +10452,7 @@
           <w:numId w:val="1002"/>
         </w:numPr>
       </w:pPr>
-      <w:bookmarkStart w:id="100" w:name="r4"/>
+      <w:bookmarkStart w:id="103" w:name="r4"/>
       <w:r>
         <w:t xml:space="preserve">H. Abediasl, A. Ansari, V. Hosseini, C. R. Koch, M. Shahbakhti. Real-time vehicular fuel</w:t>
       </w:r>
@@ -10011,7 +10492,7 @@
       <w:r>
         <w:t xml:space="preserve"> </w:t>
       </w:r>
-      <w:hyperlink r:id="rId99">
+      <w:hyperlink r:id="rId102">
         <w:r>
           <w:rPr>
             <w:rStyle w:val="Hyperlink"/>
@@ -10019,7 +10500,7 @@
           <w:t xml:space="preserve">10.1177/09544070231185609</w:t>
         </w:r>
       </w:hyperlink>
-      <w:bookmarkEnd w:id="100"/>
+      <w:bookmarkEnd w:id="103"/>
     </w:p>
     <w:p>
       <w:pPr>
@@ -10029,7 +10510,7 @@
           <w:numId w:val="1002"/>
         </w:numPr>
       </w:pPr>
-      <w:bookmarkStart w:id="102" w:name="r5"/>
+      <w:bookmarkStart w:id="105" w:name="r5"/>
       <w:r>
         <w:t xml:space="preserve">P. Fafoutellis, E. G. Mantouka, E. I. Vlahogianni. Eco-Driving and Its Impacts on Fuel</w:t>
       </w:r>
@@ -10061,7 +10542,7 @@
       <w:r>
         <w:t xml:space="preserve"> </w:t>
       </w:r>
-      <w:hyperlink r:id="rId101">
+      <w:hyperlink r:id="rId104">
         <w:r>
           <w:rPr>
             <w:rStyle w:val="Hyperlink"/>
@@ -10069,7 +10550,7 @@
           <w:t xml:space="preserve">10.3390/su13010226</w:t>
         </w:r>
       </w:hyperlink>
-      <w:bookmarkEnd w:id="102"/>
+      <w:bookmarkEnd w:id="105"/>
     </w:p>
     <w:p>
       <w:pPr>
@@ -10079,14 +10560,14 @@
           <w:numId w:val="1002"/>
         </w:numPr>
       </w:pPr>
-      <w:bookmarkStart w:id="104" w:name="r6"/>
+      <w:bookmarkStart w:id="107" w:name="r6"/>
       <w:r>
         <w:t xml:space="preserve">J. Vieira et al. Driving Events Dataset. Zenodo, 2022.</w:t>
       </w:r>
       <w:r>
         <w:t xml:space="preserve"> </w:t>
       </w:r>
-      <w:hyperlink r:id="rId103">
+      <w:hyperlink r:id="rId106">
         <w:r>
           <w:rPr>
             <w:rStyle w:val="Hyperlink"/>
@@ -10094,7 +10575,7 @@
           <w:t xml:space="preserve">10.5281/zenodo.6570972</w:t>
         </w:r>
       </w:hyperlink>
-      <w:bookmarkEnd w:id="104"/>
+      <w:bookmarkEnd w:id="107"/>
     </w:p>
     <w:p>
       <w:pPr>
@@ -10104,7 +10585,7 @@
           <w:numId w:val="1002"/>
         </w:numPr>
       </w:pPr>
-      <w:bookmarkStart w:id="105" w:name="r7"/>
+      <w:bookmarkStart w:id="108" w:name="r7"/>
       <w:r>
         <w:t xml:space="preserve">J. L. Jimenez-Palacios. Understanding and quantifying motor vehicle emissions with</w:t>
       </w:r>
@@ -10114,7 +10595,7 @@
       <w:r>
         <w:t xml:space="preserve">vehicle specific power and TILDAS remote sensing. PhD thesis, MIT, 1999.</w:t>
       </w:r>
-      <w:bookmarkEnd w:id="105"/>
+      <w:bookmarkEnd w:id="108"/>
     </w:p>
     <w:p>
       <w:pPr>
@@ -10124,7 +10605,7 @@
           <w:numId w:val="1002"/>
         </w:numPr>
       </w:pPr>
-      <w:bookmarkStart w:id="107" w:name="r8"/>
+      <w:bookmarkStart w:id="110" w:name="r8"/>
       <w:r>
         <w:t xml:space="preserve">K. Ahn, H. Rakha, A. Trani, M. Van Aerde. Estimating Vehicle Fuel Consumption and</w:t>
       </w:r>
@@ -10164,7 +10645,7 @@
       <w:r>
         <w:t xml:space="preserve"> </w:t>
       </w:r>
-      <w:hyperlink r:id="rId106">
+      <w:hyperlink r:id="rId109">
         <w:r>
           <w:rPr>
             <w:rStyle w:val="Hyperlink"/>
@@ -10172,7 +10653,7 @@
           <w:t xml:space="preserve">10.1061/(ASCE)0733-947X(2002)128:2(182)</w:t>
         </w:r>
       </w:hyperlink>
-      <w:bookmarkEnd w:id="107"/>
+      <w:bookmarkEnd w:id="110"/>
     </w:p>
     <w:p>
       <w:pPr>
@@ -10182,7 +10663,7 @@
           <w:numId w:val="1002"/>
         </w:numPr>
       </w:pPr>
-      <w:bookmarkStart w:id="109" w:name="r9"/>
+      <w:bookmarkStart w:id="112" w:name="r9"/>
       <w:r>
         <w:t xml:space="preserve">T. Abukhalil, H. AlMahafzah, M. Alksasbeh, B. A. Y. Alqaralleh. Fuel Consumption Using</w:t>
       </w:r>
@@ -10208,7 +10689,7 @@
       <w:r>
         <w:t xml:space="preserve"> </w:t>
       </w:r>
-      <w:hyperlink r:id="rId108">
+      <w:hyperlink r:id="rId111">
         <w:r>
           <w:rPr>
             <w:rStyle w:val="Hyperlink"/>
@@ -10216,7 +10697,7 @@
           <w:t xml:space="preserve">10.1155/2020/9450178</w:t>
         </w:r>
       </w:hyperlink>
-      <w:bookmarkEnd w:id="109"/>
+      <w:bookmarkEnd w:id="112"/>
     </w:p>
     <w:p>
       <w:pPr>
@@ -10226,7 +10707,7 @@
           <w:numId w:val="1002"/>
         </w:numPr>
       </w:pPr>
-      <w:bookmarkStart w:id="111" w:name="r10"/>
+      <w:bookmarkStart w:id="114" w:name="r10"/>
       <w:r>
         <w:t xml:space="preserve">R. Chu, W. H. Chik, J. Song, J. Chan, X. Li. Real-time Fuel Leakage Detection via Online</w:t>
       </w:r>
@@ -10239,7 +10720,7 @@
       <w:r>
         <w:t xml:space="preserve"> </w:t>
       </w:r>
-      <w:hyperlink r:id="rId110">
+      <w:hyperlink r:id="rId113">
         <w:r>
           <w:rPr>
             <w:rStyle w:val="Hyperlink"/>
@@ -10247,7 +10728,7 @@
           <w:t xml:space="preserve">10.48550/arXiv.2410.09741</w:t>
         </w:r>
       </w:hyperlink>
-      <w:bookmarkEnd w:id="111"/>
+      <w:bookmarkEnd w:id="114"/>
     </w:p>
     <w:p>
       <w:pPr>
@@ -10257,7 +10738,7 @@
           <w:numId w:val="1002"/>
         </w:numPr>
       </w:pPr>
-      <w:bookmarkStart w:id="113" w:name="r11"/>
+      <w:bookmarkStart w:id="116" w:name="r11"/>
       <w:r>
         <w:t xml:space="preserve">H. A. Rakha, K. Ahn, K. Moran, B. Saerens, E. Van den Bulck. Virginia Tech Comprehensive</w:t>
       </w:r>
@@ -10289,7 +10770,7 @@
       <w:r>
         <w:t xml:space="preserve"> </w:t>
       </w:r>
-      <w:hyperlink r:id="rId112">
+      <w:hyperlink r:id="rId115">
         <w:r>
           <w:rPr>
             <w:rStyle w:val="Hyperlink"/>
@@ -10297,7 +10778,7 @@
           <w:t xml:space="preserve">10.1016/j.trd.2011.05.008</w:t>
         </w:r>
       </w:hyperlink>
-      <w:bookmarkEnd w:id="113"/>
+      <w:bookmarkEnd w:id="116"/>
     </w:p>
     <w:p>
       <w:pPr>
@@ -10307,7 +10788,7 @@
           <w:numId w:val="1002"/>
         </w:numPr>
       </w:pPr>
-      <w:bookmarkStart w:id="115" w:name="r12"/>
+      <w:bookmarkStart w:id="118" w:name="r12"/>
       <w:r>
         <w:t xml:space="preserve">P. Ping, W. Qin, Y. Xu, C. Miyajima, K. Takeda. Impact of Driver Behavior on Fuel</w:t>
       </w:r>
@@ -10339,7 +10820,7 @@
       <w:r>
         <w:t xml:space="preserve"> </w:t>
       </w:r>
-      <w:hyperlink r:id="rId114">
+      <w:hyperlink r:id="rId117">
         <w:r>
           <w:rPr>
             <w:rStyle w:val="Hyperlink"/>
@@ -10347,7 +10828,7 @@
           <w:t xml:space="preserve">10.1109/ACCESS.2019.2920489</w:t>
         </w:r>
       </w:hyperlink>
-      <w:bookmarkEnd w:id="115"/>
+      <w:bookmarkEnd w:id="118"/>
     </w:p>
     <w:p>
       <w:pPr>
@@ -10357,7 +10838,7 @@
           <w:numId w:val="1002"/>
         </w:numPr>
       </w:pPr>
-      <w:bookmarkStart w:id="117" w:name="r13"/>
+      <w:bookmarkStart w:id="120" w:name="r13"/>
       <w:r>
         <w:t xml:space="preserve">A. Mohammadnazar, Z. H. Khattak, A. J. Khattak. Assessing driving behavior influence on</w:t>
       </w:r>
@@ -10397,7 +10878,7 @@
       <w:r>
         <w:t xml:space="preserve"> </w:t>
       </w:r>
-      <w:hyperlink r:id="rId116">
+      <w:hyperlink r:id="rId119">
         <w:r>
           <w:rPr>
             <w:rStyle w:val="Hyperlink"/>
@@ -10405,7 +10886,7 @@
           <w:t xml:space="preserve">10.1016/j.trd.2023.104025</w:t>
         </w:r>
       </w:hyperlink>
-      <w:bookmarkEnd w:id="117"/>
+      <w:bookmarkEnd w:id="120"/>
     </w:p>
     <w:p>
       <w:pPr>
@@ -10415,7 +10896,7 @@
           <w:numId w:val="1002"/>
         </w:numPr>
       </w:pPr>
-      <w:bookmarkStart w:id="119" w:name="r14"/>
+      <w:bookmarkStart w:id="122" w:name="r14"/>
       <w:r>
         <w:t xml:space="preserve">D. A. Johnson, M. M. Trivedi. Driving style recognition using a smartphone as a sensor</w:t>
       </w:r>
@@ -10441,7 +10922,7 @@
       <w:r>
         <w:t xml:space="preserve"> </w:t>
       </w:r>
-      <w:hyperlink r:id="rId118">
+      <w:hyperlink r:id="rId121">
         <w:r>
           <w:rPr>
             <w:rStyle w:val="Hyperlink"/>
@@ -10449,7 +10930,7 @@
           <w:t xml:space="preserve">10.1109/ITSC.2011.6083078</w:t>
         </w:r>
       </w:hyperlink>
-      <w:bookmarkEnd w:id="119"/>
+      <w:bookmarkEnd w:id="122"/>
     </w:p>
     <w:p>
       <w:pPr>
@@ -10459,7 +10940,7 @@
           <w:numId w:val="1002"/>
         </w:numPr>
       </w:pPr>
-      <w:bookmarkStart w:id="121" w:name="r15"/>
+      <w:bookmarkStart w:id="124" w:name="r15"/>
       <w:r>
         <w:t xml:space="preserve">S. S. Haghshenas, A. Kouvelas, V. Astarita, S. S. Haghshenas, G. Guido. Driver behavior</w:t>
       </w:r>
@@ -10485,7 +10966,7 @@
       <w:r>
         <w:t xml:space="preserve"> </w:t>
       </w:r>
-      <w:hyperlink r:id="rId120">
+      <w:hyperlink r:id="rId123">
         <w:r>
           <w:rPr>
             <w:rStyle w:val="Hyperlink"/>
@@ -10493,7 +10974,7 @@
           <w:t xml:space="preserve">10.1016/j.treng.2026.100436</w:t>
         </w:r>
       </w:hyperlink>
-      <w:bookmarkEnd w:id="121"/>
+      <w:bookmarkEnd w:id="124"/>
     </w:p>
     <w:p>
       <w:pPr>
@@ -10503,7 +10984,7 @@
           <w:numId w:val="1002"/>
         </w:numPr>
       </w:pPr>
-      <w:bookmarkStart w:id="123" w:name="r16"/>
+      <w:bookmarkStart w:id="126" w:name="r16"/>
       <w:r>
         <w:t xml:space="preserve">M. Cervantes-Bobadilla et al. Multiple fault detection and isolation using artificial</w:t>
       </w:r>
@@ -10535,7 +11016,7 @@
       <w:r>
         <w:t xml:space="preserve"> </w:t>
       </w:r>
-      <w:hyperlink r:id="rId122">
+      <w:hyperlink r:id="rId125">
         <w:r>
           <w:rPr>
             <w:rStyle w:val="Hyperlink"/>
@@ -10543,7 +11024,7 @@
           <w:t xml:space="preserve">10.1016/j.engappai.2022.105524</w:t>
         </w:r>
       </w:hyperlink>
-      <w:bookmarkEnd w:id="123"/>
+      <w:bookmarkEnd w:id="126"/>
     </w:p>
     <w:p>
       <w:pPr>
@@ -10553,7 +11034,7 @@
           <w:numId w:val="1002"/>
         </w:numPr>
       </w:pPr>
-      <w:bookmarkStart w:id="125" w:name="r17"/>
+      <w:bookmarkStart w:id="128" w:name="r17"/>
       <w:r>
         <w:t xml:space="preserve">P. Gutiérrez León et al. Implementation of a fault tolerant system for</w:t>
       </w:r>
@@ -10579,7 +11060,7 @@
       <w:r>
         <w:t xml:space="preserve"> </w:t>
       </w:r>
-      <w:hyperlink r:id="rId124">
+      <w:hyperlink r:id="rId127">
         <w:r>
           <w:rPr>
             <w:rStyle w:val="Hyperlink"/>
@@ -10587,7 +11068,7 @@
           <w:t xml:space="preserve">10.1016/j.measurement.2018.03.006</w:t>
         </w:r>
       </w:hyperlink>
-      <w:bookmarkEnd w:id="125"/>
+      <w:bookmarkEnd w:id="128"/>
     </w:p>
     <w:p>
       <w:pPr>
@@ -10597,7 +11078,7 @@
           <w:numId w:val="1002"/>
         </w:numPr>
       </w:pPr>
-      <w:bookmarkStart w:id="127" w:name="r18"/>
+      <w:bookmarkStart w:id="130" w:name="r18"/>
       <w:r>
         <w:t xml:space="preserve">C.-S. A. Gong, C.-H. S. Su, Y.-E. Liu, D.-Y. Guu, Y.-H. Chen. Deep Learning with LPC and</w:t>
       </w:r>
@@ -10623,7 +11104,7 @@
       <w:r>
         <w:t xml:space="preserve"> </w:t>
       </w:r>
-      <w:hyperlink r:id="rId126">
+      <w:hyperlink r:id="rId129">
         <w:r>
           <w:rPr>
             <w:rStyle w:val="Hyperlink"/>
@@ -10631,7 +11112,7 @@
           <w:t xml:space="preserve">10.3390/s22187072</w:t>
         </w:r>
       </w:hyperlink>
-      <w:bookmarkEnd w:id="127"/>
+      <w:bookmarkEnd w:id="130"/>
     </w:p>
     <w:p>
       <w:pPr>
@@ -10641,7 +11122,7 @@
           <w:numId w:val="1002"/>
         </w:numPr>
       </w:pPr>
-      <w:bookmarkStart w:id="129" w:name="r19"/>
+      <w:bookmarkStart w:id="132" w:name="r19"/>
       <w:r>
         <w:t xml:space="preserve">F. T. Liu, K. M. Ting, Z.-H. Zhou. Isolation Forest.</w:t>
       </w:r>
@@ -10661,7 +11142,7 @@
       <w:r>
         <w:t xml:space="preserve"> </w:t>
       </w:r>
-      <w:hyperlink r:id="rId128">
+      <w:hyperlink r:id="rId131">
         <w:r>
           <w:rPr>
             <w:rStyle w:val="Hyperlink"/>
@@ -10669,7 +11150,7 @@
           <w:t xml:space="preserve">10.1109/ICDM.2008.17</w:t>
         </w:r>
       </w:hyperlink>
-      <w:bookmarkEnd w:id="129"/>
+      <w:bookmarkEnd w:id="132"/>
     </w:p>
     <w:p>
       <w:pPr>
@@ -10679,7 +11160,7 @@
           <w:numId w:val="1002"/>
         </w:numPr>
       </w:pPr>
-      <w:bookmarkStart w:id="131" w:name="r20"/>
+      <w:bookmarkStart w:id="134" w:name="r20"/>
       <w:r>
         <w:t xml:space="preserve">S. Longari, D. H. Nova Valcarcel, M. Zago, M. Carminati, S. Zanero. CANnolo: An Anomaly</w:t>
       </w:r>
@@ -10719,7 +11200,7 @@
       <w:r>
         <w:t xml:space="preserve"> </w:t>
       </w:r>
-      <w:hyperlink r:id="rId130">
+      <w:hyperlink r:id="rId133">
         <w:r>
           <w:rPr>
             <w:rStyle w:val="Hyperlink"/>
@@ -10727,7 +11208,7 @@
           <w:t xml:space="preserve">10.1109/TNSM.2020.3038991</w:t>
         </w:r>
       </w:hyperlink>
-      <w:bookmarkEnd w:id="131"/>
+      <w:bookmarkEnd w:id="134"/>
     </w:p>
     <w:p>
       <w:pPr>
@@ -10737,7 +11218,7 @@
           <w:numId w:val="1002"/>
         </w:numPr>
       </w:pPr>
-      <w:bookmarkStart w:id="133" w:name="r21"/>
+      <w:bookmarkStart w:id="136" w:name="r21"/>
       <w:r>
         <w:t xml:space="preserve">V. K. Kukkala, S. V. Thiruloga, S. Pasricha. INDRA: Intrusion Detection Using Recurrent</w:t>
       </w:r>
@@ -10777,7 +11258,7 @@
       <w:r>
         <w:t xml:space="preserve"> </w:t>
       </w:r>
-      <w:hyperlink r:id="rId132">
+      <w:hyperlink r:id="rId135">
         <w:r>
           <w:rPr>
             <w:rStyle w:val="Hyperlink"/>
@@ -10785,7 +11266,7 @@
           <w:t xml:space="preserve">10.1109/TCAD.2020.3012749</w:t>
         </w:r>
       </w:hyperlink>
-      <w:bookmarkEnd w:id="133"/>
+      <w:bookmarkEnd w:id="136"/>
     </w:p>
     <w:p>
       <w:pPr>
@@ -10795,7 +11276,7 @@
           <w:numId w:val="1002"/>
         </w:numPr>
       </w:pPr>
-      <w:bookmarkStart w:id="135" w:name="r22"/>
+      <w:bookmarkStart w:id="138" w:name="r22"/>
       <w:r>
         <w:t xml:space="preserve">P. Mansourian, N. Zhang, A. Jaekel, M. Kneppers. Deep Learning-Based Anomaly Detection for</w:t>
       </w:r>
@@ -10835,7 +11316,7 @@
       <w:r>
         <w:t xml:space="preserve"> </w:t>
       </w:r>
-      <w:hyperlink r:id="rId134">
+      <w:hyperlink r:id="rId137">
         <w:r>
           <w:rPr>
             <w:rStyle w:val="Hyperlink"/>
@@ -10843,7 +11324,7 @@
           <w:t xml:space="preserve">10.1109/TITS.2023.3286611</w:t>
         </w:r>
       </w:hyperlink>
-      <w:bookmarkEnd w:id="135"/>
+      <w:bookmarkEnd w:id="138"/>
     </w:p>
     <w:p>
       <w:pPr>
@@ -10853,7 +11334,7 @@
           <w:numId w:val="1002"/>
         </w:numPr>
       </w:pPr>
-      <w:bookmarkStart w:id="137" w:name="r23"/>
+      <w:bookmarkStart w:id="140" w:name="r23"/>
       <w:r>
         <w:t xml:space="preserve">S. M. Lundberg, S.-I. Lee. A Unified Approach to Interpreting Model Predictions (SHAP).</w:t>
       </w:r>
@@ -10866,7 +11347,7 @@
       <w:r>
         <w:t xml:space="preserve"> </w:t>
       </w:r>
-      <w:hyperlink r:id="rId136">
+      <w:hyperlink r:id="rId139">
         <w:r>
           <w:rPr>
             <w:rStyle w:val="Hyperlink"/>
@@ -10874,7 +11355,7 @@
           <w:t xml:space="preserve">10.48550/arXiv.1705.07874</w:t>
         </w:r>
       </w:hyperlink>
-      <w:bookmarkEnd w:id="137"/>
+      <w:bookmarkEnd w:id="140"/>
     </w:p>
     <w:p>
       <w:pPr>
@@ -10884,7 +11365,7 @@
           <w:numId w:val="1002"/>
         </w:numPr>
       </w:pPr>
-      <w:bookmarkStart w:id="139" w:name="r24"/>
+      <w:bookmarkStart w:id="142" w:name="r24"/>
       <w:r>
         <w:t xml:space="preserve">V. Vučinić et al. Anomaly Detection for Vehicle Diagnostics Based on OBD</w:t>
       </w:r>
@@ -10910,7 +11391,7 @@
       <w:r>
         <w:t xml:space="preserve"> </w:t>
       </w:r>
-      <w:hyperlink r:id="rId138">
+      <w:hyperlink r:id="rId141">
         <w:r>
           <w:rPr>
             <w:rStyle w:val="Hyperlink"/>
@@ -10918,7 +11399,7 @@
           <w:t xml:space="preserve">10.1109/ACCESS.2026.3664118</w:t>
         </w:r>
       </w:hyperlink>
-      <w:bookmarkEnd w:id="139"/>
+      <w:bookmarkEnd w:id="142"/>
     </w:p>
     <w:p>
       <w:pPr>
@@ -10928,7 +11409,7 @@
           <w:numId w:val="1002"/>
         </w:numPr>
       </w:pPr>
-      <w:bookmarkStart w:id="141" w:name="r25"/>
+      <w:bookmarkStart w:id="144" w:name="r25"/>
       <w:r>
         <w:t xml:space="preserve">Z.-H. Zhou. A brief introduction to weakly supervised learning.</w:t>
       </w:r>
@@ -10962,7 +11443,7 @@
       <w:r>
         <w:t xml:space="preserve"> </w:t>
       </w:r>
-      <w:hyperlink r:id="rId140">
+      <w:hyperlink r:id="rId143">
         <w:r>
           <w:rPr>
             <w:rStyle w:val="Hyperlink"/>
@@ -10970,7 +11451,7 @@
           <w:t xml:space="preserve">10.1093/nsr/nwx106</w:t>
         </w:r>
       </w:hyperlink>
-      <w:bookmarkEnd w:id="141"/>
+      <w:bookmarkEnd w:id="144"/>
     </w:p>
     <w:p>
       <w:pPr>
@@ -10980,7 +11461,7 @@
         <w:t xml:space="preserve">© 2026 Alexander Apartsin and Yehudit Aperstein.</w:t>
       </w:r>
     </w:p>
-    <w:bookmarkEnd w:id="142"/>
+    <w:bookmarkEnd w:id="145"/>
     <w:sectPr/>
   </w:body>
 </w:document>

</xml_diff>

<commit_message>
Add EAAI elsarticle LaTeX submission build + overview figure as image
scripts/make_latex.py builds latex/FuelAnomalies.tex (elsarticle, single-column) from
index.html; compiles with lualatex to a 29pp PDF (scripts... latex/build_latex.sh).
Replace inline overview SVG with figures/overview.svg (scripts/fig_overview.py) so
Figure 1 renders in web, DOCX, and LaTeX. Strengthen contribution 1 to name the
multi-source-attribution method (Algorithm 1). Root DOCX/PDF rebuilt.
</commit_message>
<xml_diff>
--- a/FuelAnomalies.docx
+++ b/FuelAnomalies.docx
@@ -321,7 +321,35 @@
         </w:numPr>
       </w:pPr>
       <w:r>
-        <w:t xml:space="preserve">A signature-based framework that attributes excess fuel to</w:t>
+        <w:t xml:space="preserve">A method for</w:t>
+      </w:r>
+      <w:r>
+        <w:t xml:space="preserve"> </w:t>
+      </w:r>
+      <w:r>
+        <w:rPr>
+          <w:b/>
+          <w:bCs/>
+        </w:rPr>
+        <w:t xml:space="preserve">multi-source signature attribution under missing joint cause labels</w:t>
+      </w:r>
+      <w:r>
+        <w:t xml:space="preserve"> </w:t>
+      </w:r>
+      <w:r>
+        <w:t xml:space="preserve">(Algorithm 1): when no dataset labels the competing causes jointly, learn a signature for each</w:t>
+      </w:r>
+      <w:r>
+        <w:t xml:space="preserve"> </w:t>
+      </w:r>
+      <w:r>
+        <w:t xml:space="preserve">cause in its own source domain, freeze them, and attribute on the target with abstention. We</w:t>
+      </w:r>
+      <w:r>
+        <w:t xml:space="preserve"> </w:t>
+      </w:r>
+      <w:r>
+        <w:t xml:space="preserve">instantiate it to attribute excess fuel to</w:t>
       </w:r>
       <w:r>
         <w:t xml:space="preserve"> </w:t>
@@ -353,7 +381,7 @@
         <w:t xml:space="preserve"> </w:t>
       </w:r>
       <w:r>
-        <w:t xml:space="preserve">using only public data, resolved into a kinematic and a combustion axis.</w:t>
+        <w:t xml:space="preserve">from public data, resolved into a kinematic and a combustion axis.</w:t>
       </w:r>
     </w:p>
     <w:p>
@@ -499,29 +527,20 @@
       <w:r>
         <w:drawing>
           <wp:inline>
-            <wp:extent cx="3810000" cy="2540000"/>
+            <wp:extent cx="5334000" cy="1909703"/>
             <wp:effectExtent b="0" l="0" r="0" t="0"/>
-            <wp:docPr descr="" title="" id="22" name="Picture"/>
+            <wp:docPr descr="Overview of the two-arm design" title="" id="22" name="Picture"/>
             <a:graphic>
               <a:graphicData uri="http://schemas.openxmlformats.org/drawingml/2006/picture">
                 <pic:pic>
                   <pic:nvPicPr>
-                    <pic:cNvPr descr="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" id="23" name="Picture"/>
+                    <pic:cNvPr descr="figures/overview.png" id="23" name="Picture"/>
                     <pic:cNvPicPr>
                       <a:picLocks noChangeArrowheads="1" noChangeAspect="1"/>
                     </pic:cNvPicPr>
                   </pic:nvPicPr>
                   <pic:blipFill>
-                    <a:blip>
-                      <a:extLst>
-                        <a:ext uri="{28A0092B-C50C-407E-A947-70E740481C1C}">
-                          <a14:useLocalDpi xmlns:a14="http://schemas.microsoft.com/office/drawing/2010/main" val="0"/>
-                        </a:ext>
-                        <a:ext uri="{96DAC541-7B7A-43D3-8B79-37D633B846F1}">
-                          <asvg:svgBlip xmlns:asvg="http://schemas.microsoft.com/office/drawing/2016/SVG/main" r:embed="rId21"/>
-                        </a:ext>
-                      </a:extLst>
-                    </a:blip>
+                    <a:blip r:embed="rId21"/>
                     <a:stretch>
                       <a:fillRect/>
                     </a:stretch>
@@ -529,7 +548,7 @@
                   <pic:spPr bwMode="auto">
                     <a:xfrm>
                       <a:off x="0" y="0"/>
-                      <a:ext cx="3810000" cy="2540000"/>
+                      <a:ext cx="5334000" cy="1909703"/>
                     </a:xfrm>
                     <a:prstGeom prst="rect">
                       <a:avLst/>
@@ -656,7 +675,7 @@
         <w:t xml:space="preserve"> </w:t>
       </w:r>
       <w:r>
-        <w:t xml:space="preserve">task is to decompose that excess into a driver-behaviour component and a vehicle component (the vehicle-baseline defined in Section 4.3). Raw fuel</w:t>
+        <w:t xml:space="preserve">task is to decompose that excess into a driver-behaviour component and a vehicle component (the vehicle-baseline defined in Section 4.4). Raw fuel</w:t>
       </w:r>
       <w:r>
         <w:t xml:space="preserve"> </w:t>
@@ -2824,7 +2843,7 @@
     </w:p>
     <w:bookmarkEnd w:id="36"/>
     <w:bookmarkEnd w:id="37"/>
-    <w:bookmarkStart w:id="44" w:name="method"/>
+    <w:bookmarkStart w:id="45" w:name="method"/>
     <w:p>
       <w:pPr>
         <w:pStyle w:val="Heading2"/>
@@ -2833,13 +2852,1180 @@
         <w:t xml:space="preserve">4. Method</w:t>
       </w:r>
     </w:p>
-    <w:bookmarkStart w:id="38" w:name="fuel-target"/>
+    <w:bookmarkStart w:id="38" w:name="Xfc73d18645ee32fc51755c7ed67c4d9b6b5f9ff"/>
     <w:p>
       <w:pPr>
         <w:pStyle w:val="Heading3"/>
       </w:pPr>
       <w:r>
-        <w:t xml:space="preserve">4.1 Fuel target</w:t>
+        <w:t xml:space="preserve">4.1 Problem formulation: attribution under missing joint cause labels</w:t>
+      </w:r>
+    </w:p>
+    <w:p>
+      <w:pPr>
+        <w:pStyle w:val="FirstParagraph"/>
+      </w:pPr>
+      <w:r>
+        <w:t xml:space="preserve">We state the task abstractly, because the difficulty is general and not specific to fuel. A target</w:t>
+      </w:r>
+      <w:r>
+        <w:t xml:space="preserve"> </w:t>
+      </w:r>
+      <w:r>
+        <w:t xml:space="preserve">domain</w:t>
+      </w:r>
+      <w:r>
+        <w:t xml:space="preserve"> </w:t>
+      </w:r>
+      <m:oMath>
+        <m:sSub>
+          <m:e>
+            <m:r>
+              <m:t>D</m:t>
+            </m:r>
+          </m:e>
+          <m:sub>
+            <m:r>
+              <m:t>T</m:t>
+            </m:r>
+          </m:sub>
+        </m:sSub>
+      </m:oMath>
+      <w:r>
+        <w:t xml:space="preserve"> </w:t>
+      </w:r>
+      <w:r>
+        <w:t xml:space="preserve">contains an engineering outcome</w:t>
+      </w:r>
+      <w:r>
+        <w:t xml:space="preserve"> </w:t>
+      </w:r>
+      <m:oMath>
+        <m:r>
+          <m:t>y</m:t>
+        </m:r>
+      </m:oMath>
+      <w:r>
+        <w:t xml:space="preserve"> </w:t>
+      </w:r>
+      <w:r>
+        <w:t xml:space="preserve">and telemetry</w:t>
+      </w:r>
+      <w:r>
+        <w:t xml:space="preserve"> </w:t>
+      </w:r>
+      <m:oMath>
+        <m:r>
+          <m:t>x</m:t>
+        </m:r>
+      </m:oMath>
+      <w:r>
+        <w:t xml:space="preserve"> </w:t>
+      </w:r>
+      <w:r>
+        <w:t xml:space="preserve">but</w:t>
+      </w:r>
+      <w:r>
+        <w:t xml:space="preserve"> </w:t>
+      </w:r>
+      <w:r>
+        <w:rPr>
+          <w:i/>
+          <w:iCs/>
+        </w:rPr>
+        <w:t xml:space="preserve">no</w:t>
+      </w:r>
+      <w:r>
+        <w:t xml:space="preserve"> </w:t>
+      </w:r>
+      <w:r>
+        <w:t xml:space="preserve">labels for the</w:t>
+      </w:r>
+      <w:r>
+        <w:t xml:space="preserve"> </w:t>
+      </w:r>
+      <w:r>
+        <w:t xml:space="preserve">competing causes. Two competing causes, A (driver behaviour) and B (a vehicle fault), are each</w:t>
+      </w:r>
+      <w:r>
+        <w:t xml:space="preserve"> </w:t>
+      </w:r>
+      <w:r>
+        <w:t xml:space="preserve">labelled only in a separate source domain,</w:t>
+      </w:r>
+      <w:r>
+        <w:t xml:space="preserve"> </w:t>
+      </w:r>
+      <m:oMath>
+        <m:sSub>
+          <m:e>
+            <m:r>
+              <m:t>D</m:t>
+            </m:r>
+          </m:e>
+          <m:sub>
+            <m:r>
+              <m:t>A</m:t>
+            </m:r>
+          </m:sub>
+        </m:sSub>
+      </m:oMath>
+      <w:r>
+        <w:t xml:space="preserve"> </w:t>
+      </w:r>
+      <w:r>
+        <w:t xml:space="preserve">and</w:t>
+      </w:r>
+      <w:r>
+        <w:t xml:space="preserve"> </w:t>
+      </w:r>
+      <m:oMath>
+        <m:sSub>
+          <m:e>
+            <m:r>
+              <m:t>D</m:t>
+            </m:r>
+          </m:e>
+          <m:sub>
+            <m:r>
+              <m:t>B</m:t>
+            </m:r>
+          </m:sub>
+        </m:sSub>
+      </m:oMath>
+      <w:r>
+        <w:t xml:space="preserve">, which do not share the target's raw</w:t>
+      </w:r>
+      <w:r>
+        <w:t xml:space="preserve"> </w:t>
+      </w:r>
+      <w:r>
+        <w:t xml:space="preserve">feature space. The goal is to attribute a target-domain excess to A or B, or to abstain, without any</w:t>
+      </w:r>
+      <w:r>
+        <w:t xml:space="preserve"> </w:t>
+      </w:r>
+      <w:r>
+        <w:t xml:space="preserve">jointly labelled example ever existing. Domain knowledge supplies, for each cause, a transferable</w:t>
+      </w:r>
+      <w:r>
+        <w:t xml:space="preserve"> </w:t>
+      </w:r>
+      <w:r>
+        <w:rPr>
+          <w:i/>
+          <w:iCs/>
+        </w:rPr>
+        <w:t xml:space="preserve">signature</w:t>
+      </w:r>
+      <w:r>
+        <w:t xml:space="preserve">: a scoring function of the observables that rises when that cause is present. The</w:t>
+      </w:r>
+      <w:r>
+        <w:t xml:space="preserve"> </w:t>
+      </w:r>
+      <w:r>
+        <w:t xml:space="preserve">method (Algorithm 1) fits an expected-outcome model to define excess on the target, learns each</w:t>
+      </w:r>
+      <w:r>
+        <w:t xml:space="preserve"> </w:t>
+      </w:r>
+      <w:r>
+        <w:t xml:space="preserve">signature in its own source domain and freezes it, places the two signatures on a common standardized</w:t>
+      </w:r>
+      <w:r>
+        <w:t xml:space="preserve"> </w:t>
+      </w:r>
+      <w:r>
+        <w:t xml:space="preserve">scale on the target, validates each against its source, and attributes by comparing the two frozen</w:t>
+      </w:r>
+      <w:r>
+        <w:t xml:space="preserve"> </w:t>
+      </w:r>
+      <w:r>
+        <w:t xml:space="preserve">scores with an abstention margin. The remaining subsections instantiate each step for excess fuel; the</w:t>
+      </w:r>
+      <w:r>
+        <w:t xml:space="preserve"> </w:t>
+      </w:r>
+      <w:r>
+        <w:t xml:space="preserve">formulation itself is a form of weak supervision across heterogeneous sources</w:t>
+      </w:r>
+      <w:r>
+        <w:t xml:space="preserve"> </w:t>
+      </w:r>
+      <w:r>
+        <w:t xml:space="preserve">[</w:t>
+      </w:r>
+      <w:hyperlink w:anchor="r25">
+        <w:r>
+          <w:rPr>
+            <w:rStyle w:val="Hyperlink"/>
+          </w:rPr>
+          <w:t xml:space="preserve">25</w:t>
+        </w:r>
+      </w:hyperlink>
+      <w:r>
+        <w:t xml:space="preserve">].</w:t>
+      </w:r>
+    </w:p>
+    <w:p>
+      <w:pPr>
+        <w:pStyle w:val="BodyText"/>
+      </w:pPr>
+      <w:r>
+        <w:t xml:space="preserve">Algorithm 1 — Multi-source signature attribution under missing joint labels</w:t>
+      </w:r>
+    </w:p>
+    <w:p>
+      <w:pPr>
+        <w:pStyle w:val="BodyText"/>
+      </w:pPr>
+      <w:r>
+        <w:rPr>
+          <w:b/>
+          <w:bCs/>
+        </w:rPr>
+        <w:t xml:space="preserve">Input:</w:t>
+      </w:r>
+      <w:r>
+        <w:t xml:space="preserve"> </w:t>
+      </w:r>
+      <w:r>
+        <w:t xml:space="preserve">target</w:t>
+      </w:r>
+      <w:r>
+        <w:t xml:space="preserve"> </w:t>
+      </w:r>
+      <m:oMath>
+        <m:sSub>
+          <m:e>
+            <m:r>
+              <m:t>D</m:t>
+            </m:r>
+          </m:e>
+          <m:sub>
+            <m:r>
+              <m:t>T</m:t>
+            </m:r>
+          </m:sub>
+        </m:sSub>
+        <m:r>
+          <m:rPr>
+            <m:sty m:val="p"/>
+          </m:rPr>
+          <m:t>=</m:t>
+        </m:r>
+        <m:r>
+          <m:rPr>
+            <m:sty m:val="p"/>
+          </m:rPr>
+          <m:t>{</m:t>
+        </m:r>
+        <m:d>
+          <m:dPr>
+            <m:begChr m:val="("/>
+            <m:endChr m:val=")"/>
+            <m:sepChr m:val=""/>
+            <m:grow/>
+          </m:dPr>
+          <m:e>
+            <m:sSub>
+              <m:e>
+                <m:r>
+                  <m:t>x</m:t>
+                </m:r>
+              </m:e>
+              <m:sub>
+                <m:r>
+                  <m:t>i</m:t>
+                </m:r>
+              </m:sub>
+            </m:sSub>
+            <m:r>
+              <m:rPr>
+                <m:sty m:val="p"/>
+              </m:rPr>
+              <m:t>,</m:t>
+            </m:r>
+            <m:sSub>
+              <m:e>
+                <m:r>
+                  <m:t>y</m:t>
+                </m:r>
+              </m:e>
+              <m:sub>
+                <m:r>
+                  <m:t>i</m:t>
+                </m:r>
+              </m:sub>
+            </m:sSub>
+          </m:e>
+        </m:d>
+        <m:r>
+          <m:rPr>
+            <m:sty m:val="p"/>
+          </m:rPr>
+          <m:t>}</m:t>
+        </m:r>
+      </m:oMath>
+      <w:r>
+        <w:t xml:space="preserve"> </w:t>
+      </w:r>
+      <w:r>
+        <w:t xml:space="preserve">(no cause labels); sources</w:t>
+      </w:r>
+      <w:r>
+        <w:t xml:space="preserve"> </w:t>
+      </w:r>
+      <m:oMath>
+        <m:sSub>
+          <m:e>
+            <m:r>
+              <m:t>D</m:t>
+            </m:r>
+          </m:e>
+          <m:sub>
+            <m:r>
+              <m:t>A</m:t>
+            </m:r>
+          </m:sub>
+        </m:sSub>
+        <m:r>
+          <m:rPr>
+            <m:sty m:val="p"/>
+          </m:rPr>
+          <m:t>,</m:t>
+        </m:r>
+        <m:sSub>
+          <m:e>
+            <m:r>
+              <m:t>D</m:t>
+            </m:r>
+          </m:e>
+          <m:sub>
+            <m:r>
+              <m:t>B</m:t>
+            </m:r>
+          </m:sub>
+        </m:sSub>
+      </m:oMath>
+      <w:r>
+        <w:t xml:space="preserve"> </w:t>
+      </w:r>
+      <w:r>
+        <w:t xml:space="preserve">labelling causes A, B;</w:t>
+      </w:r>
+      <w:r>
+        <w:t xml:space="preserve"> </w:t>
+      </w:r>
+      <w:r>
+        <w:t xml:space="preserve">signature families</w:t>
+      </w:r>
+      <w:r>
+        <w:t xml:space="preserve"> </w:t>
+      </w:r>
+      <m:oMath>
+        <m:sSub>
+          <m:e>
+            <m:r>
+              <m:t>s</m:t>
+            </m:r>
+          </m:e>
+          <m:sub>
+            <m:r>
+              <m:t>A</m:t>
+            </m:r>
+          </m:sub>
+        </m:sSub>
+        <m:r>
+          <m:rPr>
+            <m:sty m:val="p"/>
+          </m:rPr>
+          <m:t>,</m:t>
+        </m:r>
+        <m:sSub>
+          <m:e>
+            <m:r>
+              <m:t>s</m:t>
+            </m:r>
+          </m:e>
+          <m:sub>
+            <m:r>
+              <m:t>B</m:t>
+            </m:r>
+          </m:sub>
+        </m:sSub>
+      </m:oMath>
+      <w:r>
+        <w:t xml:space="preserve">; abstention margin</w:t>
+      </w:r>
+      <w:r>
+        <w:t xml:space="preserve"> </w:t>
+      </w:r>
+      <m:oMath>
+        <m:r>
+          <m:t>τ</m:t>
+        </m:r>
+      </m:oMath>
+      <w:r>
+        <w:t xml:space="preserve">.</w:t>
+      </w:r>
+      <w:r>
+        <w:br/>
+      </w:r>
+      <w:r>
+        <w:rPr>
+          <w:b/>
+          <w:bCs/>
+        </w:rPr>
+        <w:t xml:space="preserve">Output:</w:t>
+      </w:r>
+      <w:r>
+        <w:t xml:space="preserve"> </w:t>
+      </w:r>
+      <w:r>
+        <w:t xml:space="preserve">per-unit cause</w:t>
+      </w:r>
+      <w:r>
+        <w:t xml:space="preserve"> </w:t>
+      </w:r>
+      <m:oMath>
+        <m:r>
+          <m:rPr>
+            <m:sty m:val="p"/>
+          </m:rPr>
+          <m:t>∈</m:t>
+        </m:r>
+        <m:r>
+          <m:rPr>
+            <m:sty m:val="p"/>
+          </m:rPr>
+          <m:t>{</m:t>
+        </m:r>
+        <m:r>
+          <m:t>A</m:t>
+        </m:r>
+        <m:r>
+          <m:rPr>
+            <m:sty m:val="p"/>
+          </m:rPr>
+          <m:t>,</m:t>
+        </m:r>
+        <m:r>
+          <m:t>B</m:t>
+        </m:r>
+        <m:r>
+          <m:rPr>
+            <m:sty m:val="p"/>
+          </m:rPr>
+          <m:t>,</m:t>
+        </m:r>
+        <m:r>
+          <m:rPr>
+            <m:nor/>
+            <m:sty m:val="p"/>
+          </m:rPr>
+          <m:t>abstain</m:t>
+        </m:r>
+        <m:r>
+          <m:rPr>
+            <m:sty m:val="p"/>
+          </m:rPr>
+          <m:t>}</m:t>
+        </m:r>
+      </m:oMath>
+      <w:r>
+        <w:t xml:space="preserve"> </w:t>
+      </w:r>
+      <w:r>
+        <w:t xml:space="preserve">with a confidence.</w:t>
+      </w:r>
+    </w:p>
+    <w:p>
+      <w:pPr>
+        <w:pStyle w:val="Compact"/>
+        <w:numPr>
+          <w:ilvl w:val="0"/>
+          <w:numId w:val="1002"/>
+        </w:numPr>
+      </w:pPr>
+      <w:r>
+        <w:t xml:space="preserve">Fit expected-outcome model</w:t>
+      </w:r>
+      <w:r>
+        <w:t xml:space="preserve"> </w:t>
+      </w:r>
+      <m:oMath>
+        <m:r>
+          <m:t>M</m:t>
+        </m:r>
+      </m:oMath>
+      <w:r>
+        <w:t xml:space="preserve"> </w:t>
+      </w:r>
+      <w:r>
+        <w:t xml:space="preserve">on</w:t>
+      </w:r>
+      <w:r>
+        <w:t xml:space="preserve"> </w:t>
+      </w:r>
+      <m:oMath>
+        <m:sSub>
+          <m:e>
+            <m:r>
+              <m:t>D</m:t>
+            </m:r>
+          </m:e>
+          <m:sub>
+            <m:r>
+              <m:t>T</m:t>
+            </m:r>
+          </m:sub>
+        </m:sSub>
+      </m:oMath>
+      <w:r>
+        <w:t xml:space="preserve"> </w:t>
+      </w:r>
+      <w:r>
+        <w:t xml:space="preserve">(grouped OOF); excess</w:t>
+      </w:r>
+      <w:r>
+        <w:t xml:space="preserve"> </w:t>
+      </w:r>
+      <m:oMath>
+        <m:sSub>
+          <m:e>
+            <m:r>
+              <m:t>e</m:t>
+            </m:r>
+          </m:e>
+          <m:sub>
+            <m:r>
+              <m:t>i</m:t>
+            </m:r>
+          </m:sub>
+        </m:sSub>
+        <m:r>
+          <m:rPr>
+            <m:sty m:val="p"/>
+          </m:rPr>
+          <m:t>=</m:t>
+        </m:r>
+        <m:sSub>
+          <m:e>
+            <m:r>
+              <m:t>y</m:t>
+            </m:r>
+          </m:e>
+          <m:sub>
+            <m:r>
+              <m:t>i</m:t>
+            </m:r>
+          </m:sub>
+        </m:sSub>
+        <m:r>
+          <m:rPr>
+            <m:sty m:val="p"/>
+          </m:rPr>
+          <m:t>−</m:t>
+        </m:r>
+        <m:r>
+          <m:t>M</m:t>
+        </m:r>
+        <m:d>
+          <m:dPr>
+            <m:begChr m:val="("/>
+            <m:endChr m:val=")"/>
+            <m:sepChr m:val=""/>
+            <m:grow/>
+          </m:dPr>
+          <m:e>
+            <m:sSub>
+              <m:e>
+                <m:r>
+                  <m:t>x</m:t>
+                </m:r>
+              </m:e>
+              <m:sub>
+                <m:r>
+                  <m:t>i</m:t>
+                </m:r>
+              </m:sub>
+            </m:sSub>
+          </m:e>
+        </m:d>
+      </m:oMath>
+      <w:r>
+        <w:t xml:space="preserve">.</w:t>
+      </w:r>
+    </w:p>
+    <w:p>
+      <w:pPr>
+        <w:pStyle w:val="Compact"/>
+        <w:numPr>
+          <w:ilvl w:val="0"/>
+          <w:numId w:val="1002"/>
+        </w:numPr>
+      </w:pPr>
+      <w:r>
+        <w:t xml:space="preserve">Learn signature</w:t>
+      </w:r>
+      <w:r>
+        <w:t xml:space="preserve"> </w:t>
+      </w:r>
+      <m:oMath>
+        <m:sSub>
+          <m:e>
+            <m:r>
+              <m:t>s</m:t>
+            </m:r>
+          </m:e>
+          <m:sub>
+            <m:r>
+              <m:t>A</m:t>
+            </m:r>
+          </m:sub>
+        </m:sSub>
+      </m:oMath>
+      <w:r>
+        <w:t xml:space="preserve"> </w:t>
+      </w:r>
+      <w:r>
+        <w:t xml:space="preserve">on</w:t>
+      </w:r>
+      <w:r>
+        <w:t xml:space="preserve"> </w:t>
+      </w:r>
+      <m:oMath>
+        <m:sSub>
+          <m:e>
+            <m:r>
+              <m:t>D</m:t>
+            </m:r>
+          </m:e>
+          <m:sub>
+            <m:r>
+              <m:t>A</m:t>
+            </m:r>
+          </m:sub>
+        </m:sSub>
+      </m:oMath>
+      <w:r>
+        <w:t xml:space="preserve"> </w:t>
+      </w:r>
+      <w:r>
+        <w:t xml:space="preserve">and</w:t>
+      </w:r>
+      <w:r>
+        <w:t xml:space="preserve"> </w:t>
+      </w:r>
+      <m:oMath>
+        <m:sSub>
+          <m:e>
+            <m:r>
+              <m:t>s</m:t>
+            </m:r>
+          </m:e>
+          <m:sub>
+            <m:r>
+              <m:t>B</m:t>
+            </m:r>
+          </m:sub>
+        </m:sSub>
+      </m:oMath>
+      <w:r>
+        <w:t xml:space="preserve"> </w:t>
+      </w:r>
+      <w:r>
+        <w:t xml:space="preserve">on</w:t>
+      </w:r>
+      <w:r>
+        <w:t xml:space="preserve"> </w:t>
+      </w:r>
+      <m:oMath>
+        <m:sSub>
+          <m:e>
+            <m:r>
+              <m:t>D</m:t>
+            </m:r>
+          </m:e>
+          <m:sub>
+            <m:r>
+              <m:t>B</m:t>
+            </m:r>
+          </m:sub>
+        </m:sSub>
+      </m:oMath>
+      <w:r>
+        <w:t xml:space="preserve">;</w:t>
+      </w:r>
+      <w:r>
+        <w:t xml:space="preserve"> </w:t>
+      </w:r>
+      <w:r>
+        <w:rPr>
+          <w:b/>
+          <w:bCs/>
+        </w:rPr>
+        <w:t xml:space="preserve">freeze</w:t>
+      </w:r>
+      <w:r>
+        <w:t xml:space="preserve"> </w:t>
+      </w:r>
+      <w:r>
+        <w:t xml:space="preserve">both (no target labels used).</w:t>
+      </w:r>
+    </w:p>
+    <w:p>
+      <w:pPr>
+        <w:pStyle w:val="Compact"/>
+        <w:numPr>
+          <w:ilvl w:val="0"/>
+          <w:numId w:val="1002"/>
+        </w:numPr>
+      </w:pPr>
+      <w:r>
+        <w:t xml:space="preserve">Score each target unit and standardize within the target:</w:t>
+      </w:r>
+      <w:r>
+        <w:t xml:space="preserve"> </w:t>
+      </w:r>
+      <m:oMath>
+        <m:sSubSup>
+          <m:e>
+            <m:r>
+              <m:t>z</m:t>
+            </m:r>
+          </m:e>
+          <m:sub>
+            <m:r>
+              <m:t>i</m:t>
+            </m:r>
+          </m:sub>
+          <m:sup>
+            <m:r>
+              <m:t>A</m:t>
+            </m:r>
+          </m:sup>
+        </m:sSubSup>
+        <m:r>
+          <m:rPr>
+            <m:sty m:val="p"/>
+          </m:rPr>
+          <m:t>,</m:t>
+        </m:r>
+        <m:sSubSup>
+          <m:e>
+            <m:r>
+              <m:t>z</m:t>
+            </m:r>
+          </m:e>
+          <m:sub>
+            <m:r>
+              <m:t>i</m:t>
+            </m:r>
+          </m:sub>
+          <m:sup>
+            <m:r>
+              <m:t>B</m:t>
+            </m:r>
+          </m:sup>
+        </m:sSubSup>
+      </m:oMath>
+      <w:r>
+        <w:t xml:space="preserve"> </w:t>
+      </w:r>
+      <w:r>
+        <w:t xml:space="preserve">(unsupervised).</w:t>
+      </w:r>
+    </w:p>
+    <w:p>
+      <w:pPr>
+        <w:pStyle w:val="Compact"/>
+        <w:numPr>
+          <w:ilvl w:val="0"/>
+          <w:numId w:val="1002"/>
+        </w:numPr>
+      </w:pPr>
+      <w:r>
+        <w:t xml:space="preserve">Validate: confirm</w:t>
+      </w:r>
+      <w:r>
+        <w:t xml:space="preserve"> </w:t>
+      </w:r>
+      <m:oMath>
+        <m:sSub>
+          <m:e>
+            <m:r>
+              <m:t>s</m:t>
+            </m:r>
+          </m:e>
+          <m:sub>
+            <m:r>
+              <m:t>A</m:t>
+            </m:r>
+          </m:sub>
+        </m:sSub>
+      </m:oMath>
+      <w:r>
+        <w:t xml:space="preserve"> </w:t>
+      </w:r>
+      <w:r>
+        <w:t xml:space="preserve">separates cause A in</w:t>
+      </w:r>
+      <w:r>
+        <w:t xml:space="preserve"> </w:t>
+      </w:r>
+      <m:oMath>
+        <m:sSub>
+          <m:e>
+            <m:r>
+              <m:t>D</m:t>
+            </m:r>
+          </m:e>
+          <m:sub>
+            <m:r>
+              <m:t>A</m:t>
+            </m:r>
+          </m:sub>
+        </m:sSub>
+      </m:oMath>
+      <w:r>
+        <w:t xml:space="preserve"> </w:t>
+      </w:r>
+      <w:r>
+        <w:t xml:space="preserve">and</w:t>
+      </w:r>
+      <w:r>
+        <w:t xml:space="preserve"> </w:t>
+      </w:r>
+      <m:oMath>
+        <m:sSub>
+          <m:e>
+            <m:r>
+              <m:t>s</m:t>
+            </m:r>
+          </m:e>
+          <m:sub>
+            <m:r>
+              <m:t>B</m:t>
+            </m:r>
+          </m:sub>
+        </m:sSub>
+      </m:oMath>
+      <w:r>
+        <w:t xml:space="preserve"> </w:t>
+      </w:r>
+      <w:r>
+        <w:t xml:space="preserve">separates cause B in</w:t>
+      </w:r>
+      <w:r>
+        <w:t xml:space="preserve"> </w:t>
+      </w:r>
+      <m:oMath>
+        <m:sSub>
+          <m:e>
+            <m:r>
+              <m:t>D</m:t>
+            </m:r>
+          </m:e>
+          <m:sub>
+            <m:r>
+              <m:t>B</m:t>
+            </m:r>
+          </m:sub>
+        </m:sSub>
+      </m:oMath>
+      <w:r>
+        <w:t xml:space="preserve">.</w:t>
+      </w:r>
+    </w:p>
+    <w:p>
+      <w:pPr>
+        <w:pStyle w:val="Compact"/>
+        <w:numPr>
+          <w:ilvl w:val="0"/>
+          <w:numId w:val="1002"/>
+        </w:numPr>
+      </w:pPr>
+      <w:r>
+        <w:t xml:space="preserve">Attribute:</w:t>
+      </w:r>
+      <w:r>
+        <w:t xml:space="preserve"> </w:t>
+      </w:r>
+      <m:oMath>
+        <m:r>
+          <m:t>A</m:t>
+        </m:r>
+      </m:oMath>
+      <w:r>
+        <w:t xml:space="preserve"> </w:t>
+      </w:r>
+      <w:r>
+        <w:t xml:space="preserve">if</w:t>
+      </w:r>
+      <w:r>
+        <w:t xml:space="preserve"> </w:t>
+      </w:r>
+      <m:oMath>
+        <m:sSubSup>
+          <m:e>
+            <m:r>
+              <m:t>z</m:t>
+            </m:r>
+          </m:e>
+          <m:sub>
+            <m:r>
+              <m:t>i</m:t>
+            </m:r>
+          </m:sub>
+          <m:sup>
+            <m:r>
+              <m:t>A</m:t>
+            </m:r>
+          </m:sup>
+        </m:sSubSup>
+        <m:r>
+          <m:rPr>
+            <m:sty m:val="p"/>
+          </m:rPr>
+          <m:t>−</m:t>
+        </m:r>
+        <m:sSubSup>
+          <m:e>
+            <m:r>
+              <m:t>z</m:t>
+            </m:r>
+          </m:e>
+          <m:sub>
+            <m:r>
+              <m:t>i</m:t>
+            </m:r>
+          </m:sub>
+          <m:sup>
+            <m:r>
+              <m:t>B</m:t>
+            </m:r>
+          </m:sup>
+        </m:sSubSup>
+        <m:r>
+          <m:rPr>
+            <m:sty m:val="p"/>
+          </m:rPr>
+          <m:t>&gt;</m:t>
+        </m:r>
+        <m:r>
+          <m:t>τ</m:t>
+        </m:r>
+      </m:oMath>
+      <w:r>
+        <w:t xml:space="preserve">;</w:t>
+      </w:r>
+      <w:r>
+        <w:t xml:space="preserve"> </w:t>
+      </w:r>
+      <m:oMath>
+        <m:r>
+          <m:t>B</m:t>
+        </m:r>
+      </m:oMath>
+      <w:r>
+        <w:t xml:space="preserve"> </w:t>
+      </w:r>
+      <w:r>
+        <w:t xml:space="preserve">if</w:t>
+      </w:r>
+      <w:r>
+        <w:t xml:space="preserve"> </w:t>
+      </w:r>
+      <m:oMath>
+        <m:sSubSup>
+          <m:e>
+            <m:r>
+              <m:t>z</m:t>
+            </m:r>
+          </m:e>
+          <m:sub>
+            <m:r>
+              <m:t>i</m:t>
+            </m:r>
+          </m:sub>
+          <m:sup>
+            <m:r>
+              <m:t>B</m:t>
+            </m:r>
+          </m:sup>
+        </m:sSubSup>
+        <m:r>
+          <m:rPr>
+            <m:sty m:val="p"/>
+          </m:rPr>
+          <m:t>−</m:t>
+        </m:r>
+        <m:sSubSup>
+          <m:e>
+            <m:r>
+              <m:t>z</m:t>
+            </m:r>
+          </m:e>
+          <m:sub>
+            <m:r>
+              <m:t>i</m:t>
+            </m:r>
+          </m:sub>
+          <m:sup>
+            <m:r>
+              <m:t>A</m:t>
+            </m:r>
+          </m:sup>
+        </m:sSubSup>
+        <m:r>
+          <m:rPr>
+            <m:sty m:val="p"/>
+          </m:rPr>
+          <m:t>&gt;</m:t>
+        </m:r>
+        <m:r>
+          <m:t>τ</m:t>
+        </m:r>
+      </m:oMath>
+      <w:r>
+        <w:t xml:space="preserve">; else</w:t>
+      </w:r>
+      <w:r>
+        <w:t xml:space="preserve"> </w:t>
+      </w:r>
+      <w:r>
+        <w:rPr>
+          <w:b/>
+          <w:bCs/>
+        </w:rPr>
+        <w:t xml:space="preserve">abstain</w:t>
+      </w:r>
+      <w:r>
+        <w:t xml:space="preserve">.</w:t>
+      </w:r>
+      <w:r>
+        <w:t xml:space="preserve"> </w:t>
+      </w:r>
+      <w:r>
+        <w:t xml:space="preserve">Confidence</w:t>
+      </w:r>
+      <w:r>
+        <w:t xml:space="preserve"> </w:t>
+      </w:r>
+      <m:oMath>
+        <m:r>
+          <m:rPr>
+            <m:sty m:val="p"/>
+          </m:rPr>
+          <m:t>=</m:t>
+        </m:r>
+        <m:d>
+          <m:dPr>
+            <m:begChr m:val="|"/>
+            <m:endChr m:val="|"/>
+            <m:sepChr m:val=""/>
+            <m:grow/>
+          </m:dPr>
+          <m:e>
+            <m:sSubSup>
+              <m:e>
+                <m:r>
+                  <m:t>z</m:t>
+                </m:r>
+              </m:e>
+              <m:sub>
+                <m:r>
+                  <m:t>i</m:t>
+                </m:r>
+              </m:sub>
+              <m:sup>
+                <m:r>
+                  <m:t>A</m:t>
+                </m:r>
+              </m:sup>
+            </m:sSubSup>
+            <m:r>
+              <m:rPr>
+                <m:sty m:val="p"/>
+              </m:rPr>
+              <m:t>−</m:t>
+            </m:r>
+            <m:sSubSup>
+              <m:e>
+                <m:r>
+                  <m:t>z</m:t>
+                </m:r>
+              </m:e>
+              <m:sub>
+                <m:r>
+                  <m:t>i</m:t>
+                </m:r>
+              </m:sub>
+              <m:sup>
+                <m:r>
+                  <m:t>B</m:t>
+                </m:r>
+              </m:sup>
+            </m:sSubSup>
+          </m:e>
+        </m:d>
+      </m:oMath>
+      <w:r>
+        <w:t xml:space="preserve">.</w:t>
+      </w:r>
+    </w:p>
+    <w:p>
+      <w:pPr>
+        <w:pStyle w:val="FirstParagraph"/>
+      </w:pPr>
+      <w:r>
+        <w:t xml:space="preserve">For excess fuel,</w:t>
+      </w:r>
+      <w:r>
+        <w:t xml:space="preserve"> </w:t>
+      </w:r>
+      <m:oMath>
+        <m:r>
+          <m:t>M</m:t>
+        </m:r>
+      </m:oMath>
+      <w:r>
+        <w:t xml:space="preserve"> </w:t>
+      </w:r>
+      <w:r>
+        <w:t xml:space="preserve">is the expected-fuel model (Section 4.3), cause A is aggressive driving with a</w:t>
+      </w:r>
+      <w:r>
+        <w:t xml:space="preserve"> </w:t>
+      </w:r>
+      <w:r>
+        <w:t xml:space="preserve">kinematic signature validated on labelled driving (Section 6.3), and cause B is a rich-mixture fault</w:t>
+      </w:r>
+      <w:r>
+        <w:t xml:space="preserve"> </w:t>
+      </w:r>
+      <w:r>
+        <w:t xml:space="preserve">with a fueling/combustion signature validated on the engine bench (Section 7). The frozen attribution</w:t>
+      </w:r>
+      <w:r>
+        <w:t xml:space="preserve"> </w:t>
+      </w:r>
+      <w:r>
+        <w:t xml:space="preserve">and its abstention behaviour are evaluated in Section 8.4.</w:t>
+      </w:r>
+    </w:p>
+    <w:bookmarkEnd w:id="38"/>
+    <w:bookmarkStart w:id="39" w:name="fuel-target"/>
+    <w:p>
+      <w:pPr>
+        <w:pStyle w:val="Heading3"/>
+      </w:pPr>
+      <w:r>
+        <w:t xml:space="preserve">4.2 Fuel target</w:t>
       </w:r>
     </w:p>
     <w:p>
@@ -3194,14 +4380,14 @@
         <w:t xml:space="preserve">where STFT and LTFT are the short- and long-term fuel trims in percent.</w:t>
       </w:r>
     </w:p>
-    <w:bookmarkEnd w:id="38"/>
-    <w:bookmarkStart w:id="39" w:name="expected-fuel-model-and-excess"/>
+    <w:bookmarkEnd w:id="39"/>
+    <w:bookmarkStart w:id="40" w:name="expected-fuel-model-and-excess"/>
     <w:p>
       <w:pPr>
         <w:pStyle w:val="Heading3"/>
       </w:pPr>
       <w:r>
-        <w:t xml:space="preserve">4.2 Expected-fuel model and excess</w:t>
+        <w:t xml:space="preserve">4.3 Expected-fuel model and excess</w:t>
       </w:r>
     </w:p>
     <w:p>
@@ -3813,14 +4999,14 @@
         <w:t xml:space="preserve">from the expected-fuel model so that the residual is free to reflect vehicle condition.</w:t>
       </w:r>
     </w:p>
-    <w:bookmarkEnd w:id="39"/>
-    <w:bookmarkStart w:id="40" w:name="decomposition"/>
+    <w:bookmarkEnd w:id="40"/>
+    <w:bookmarkStart w:id="41" w:name="decomposition"/>
     <w:p>
       <w:pPr>
         <w:pStyle w:val="Heading3"/>
       </w:pPr>
       <w:r>
-        <w:t xml:space="preserve">4.3 Decomposition</w:t>
+        <w:t xml:space="preserve">4.4 Decomposition</w:t>
       </w:r>
     </w:p>
     <w:p>
@@ -4671,14 +5857,14 @@
         <w:t xml:space="preserve">are the fleet-mean residual and fleet-mean trip fuel.</w:t>
       </w:r>
     </w:p>
-    <w:bookmarkEnd w:id="40"/>
-    <w:bookmarkStart w:id="41" w:name="the-two-axes-and-the-signature-contrast"/>
+    <w:bookmarkEnd w:id="41"/>
+    <w:bookmarkStart w:id="42" w:name="the-two-axes-and-the-signature-contrast"/>
     <w:p>
       <w:pPr>
         <w:pStyle w:val="Heading3"/>
       </w:pPr>
       <w:r>
-        <w:t xml:space="preserve">4.4 The two axes and the signature contrast</w:t>
+        <w:t xml:space="preserve">4.5 The two axes and the signature contrast</w:t>
       </w:r>
     </w:p>
     <w:p>
@@ -4890,14 +6076,14 @@
         <w:t xml:space="preserve">fault-caused excess, also tracks driver-caused excess; the claim is that it does not.</w:t>
       </w:r>
     </w:p>
-    <w:bookmarkEnd w:id="41"/>
-    <w:bookmarkStart w:id="42" w:name="semi-synthetic-attribution"/>
+    <w:bookmarkEnd w:id="42"/>
+    <w:bookmarkStart w:id="43" w:name="semi-synthetic-attribution"/>
     <w:p>
       <w:pPr>
         <w:pStyle w:val="Heading3"/>
       </w:pPr>
       <w:r>
-        <w:t xml:space="preserve">4.5 Semi-synthetic attribution</w:t>
+        <w:t xml:space="preserve">4.6 Semi-synthetic attribution</w:t>
       </w:r>
     </w:p>
     <w:p>
@@ -5311,14 +6497,14 @@
         <w:t xml:space="preserve">is the chance baseline.</w:t>
       </w:r>
     </w:p>
-    <w:bookmarkEnd w:id="42"/>
-    <w:bookmarkStart w:id="43" w:name="baselines"/>
+    <w:bookmarkEnd w:id="43"/>
+    <w:bookmarkStart w:id="44" w:name="baselines"/>
     <w:p>
       <w:pPr>
         <w:pStyle w:val="Heading3"/>
       </w:pPr>
       <w:r>
-        <w:t xml:space="preserve">4.6 Baselines</w:t>
+        <w:t xml:space="preserve">4.7 Baselines</w:t>
       </w:r>
     </w:p>
     <w:p>
@@ -5375,9 +6561,9 @@
         <w:t xml:space="preserve">systematic effect is left unattributed when the vehicle is not modelled.</w:t>
       </w:r>
     </w:p>
-    <w:bookmarkEnd w:id="43"/>
     <w:bookmarkEnd w:id="44"/>
-    <w:bookmarkStart w:id="45" w:name="setup"/>
+    <w:bookmarkEnd w:id="45"/>
+    <w:bookmarkStart w:id="46" w:name="setup"/>
     <w:p>
       <w:pPr>
         <w:pStyle w:val="Heading2"/>
@@ -5551,8 +6737,8 @@
         <w:t xml:space="preserve">their inclusion would let the predictor absorb part of the diagnostic signature we aim to isolate.</w:t>
       </w:r>
     </w:p>
-    <w:bookmarkEnd w:id="45"/>
-    <w:bookmarkStart w:id="58" w:name="arm1"/>
+    <w:bookmarkEnd w:id="46"/>
+    <w:bookmarkStart w:id="59" w:name="arm1"/>
     <w:p>
       <w:pPr>
         <w:pStyle w:val="Heading2"/>
@@ -5561,7 +6747,7 @@
         <w:t xml:space="preserve">6. Results: driver arm (VED)</w:t>
       </w:r>
     </w:p>
-    <w:bookmarkStart w:id="46" w:name="expected-fuel-model"/>
+    <w:bookmarkStart w:id="47" w:name="expected-fuel-model"/>
     <w:p>
       <w:pPr>
         <w:pStyle w:val="Heading3"/>
@@ -5646,8 +6832,8 @@
         <w:t xml:space="preserve">measured, not to set a new accuracy record.</w:t>
       </w:r>
     </w:p>
-    <w:bookmarkEnd w:id="46"/>
-    <w:bookmarkStart w:id="53" w:name="X0c9c6a5585f3441bffbba7f54edeae90ceeedfb"/>
+    <w:bookmarkEnd w:id="47"/>
+    <w:bookmarkStart w:id="54" w:name="X0c9c6a5585f3441bffbba7f54edeae90ceeedfb"/>
     <w:p>
       <w:pPr>
         <w:pStyle w:val="Heading3"/>
@@ -6356,18 +7542,18 @@
           <wp:inline>
             <wp:extent cx="5334000" cy="1201444"/>
             <wp:effectExtent b="0" l="0" r="0" t="0"/>
-            <wp:docPr descr="Variance decomposition of trip fuel" title="" id="48" name="Picture"/>
+            <wp:docPr descr="Variance decomposition of trip fuel" title="" id="49" name="Picture"/>
             <a:graphic>
               <a:graphicData uri="http://schemas.openxmlformats.org/drawingml/2006/picture">
                 <pic:pic>
                   <pic:nvPicPr>
-                    <pic:cNvPr descr="figures/fig1_variance_decomposition.png" id="49" name="Picture"/>
+                    <pic:cNvPr descr="figures/fig1_variance_decomposition.png" id="50" name="Picture"/>
                     <pic:cNvPicPr>
                       <a:picLocks noChangeArrowheads="1" noChangeAspect="1"/>
                     </pic:cNvPicPr>
                   </pic:nvPicPr>
                   <pic:blipFill>
-                    <a:blip r:embed="rId47"/>
+                    <a:blip r:embed="rId48"/>
                     <a:stretch>
                       <a:fillRect/>
                     </a:stretch>
@@ -6427,18 +7613,18 @@
           <wp:inline>
             <wp:extent cx="5004816" cy="2804160"/>
             <wp:effectExtent b="0" l="0" r="0" t="0"/>
-            <wp:docPr descr="Behaviour component by aggression decile" title="" id="51" name="Picture"/>
+            <wp:docPr descr="Behaviour component by aggression decile" title="" id="52" name="Picture"/>
             <a:graphic>
               <a:graphicData uri="http://schemas.openxmlformats.org/drawingml/2006/picture">
                 <pic:pic>
                   <pic:nvPicPr>
-                    <pic:cNvPr descr="figures/fig3_behaviour_monotonicity.png" id="52" name="Picture"/>
+                    <pic:cNvPr descr="figures/fig3_behaviour_monotonicity.png" id="53" name="Picture"/>
                     <pic:cNvPicPr>
                       <a:picLocks noChangeArrowheads="1" noChangeAspect="1"/>
                     </pic:cNvPicPr>
                   </pic:nvPicPr>
                   <pic:blipFill>
-                    <a:blip r:embed="rId50"/>
+                    <a:blip r:embed="rId51"/>
                     <a:stretch>
                       <a:fillRect/>
                     </a:stretch>
@@ -6509,8 +7695,8 @@
         <w:t xml:space="preserve">).</w:t>
       </w:r>
     </w:p>
-    <w:bookmarkEnd w:id="53"/>
-    <w:bookmarkStart w:id="57" w:name="behaviour-axis-external-validation"/>
+    <w:bookmarkEnd w:id="54"/>
+    <w:bookmarkStart w:id="58" w:name="behaviour-axis-external-validation"/>
     <w:p>
       <w:pPr>
         <w:pStyle w:val="Heading3"/>
@@ -6652,18 +7838,18 @@
           <wp:inline>
             <wp:extent cx="3907536" cy="3706367"/>
             <wp:effectExtent b="0" l="0" r="0" t="0"/>
-            <wp:docPr descr="Behaviour-axis ROC curve" title="" id="55" name="Picture"/>
+            <wp:docPr descr="Behaviour-axis ROC curve" title="" id="56" name="Picture"/>
             <a:graphic>
               <a:graphicData uri="http://schemas.openxmlformats.org/drawingml/2006/picture">
                 <pic:pic>
                   <pic:nvPicPr>
-                    <pic:cNvPr descr="figures/fig4_behaviour_roc.png" id="56" name="Picture"/>
+                    <pic:cNvPr descr="figures/fig4_behaviour_roc.png" id="57" name="Picture"/>
                     <pic:cNvPicPr>
                       <a:picLocks noChangeArrowheads="1" noChangeAspect="1"/>
                     </pic:cNvPicPr>
                   </pic:nvPicPr>
                   <pic:blipFill>
-                    <a:blip r:embed="rId54"/>
+                    <a:blip r:embed="rId55"/>
                     <a:stretch>
                       <a:fillRect/>
                     </a:stretch>
@@ -6714,9 +7900,9 @@
         <w:t xml:space="preserve">independent dataset with the driver held out (AUC 0.958, 95% CI [0.927, 0.981]).</w:t>
       </w:r>
     </w:p>
-    <w:bookmarkEnd w:id="57"/>
     <w:bookmarkEnd w:id="58"/>
-    <w:bookmarkStart w:id="62" w:name="arm2"/>
+    <w:bookmarkEnd w:id="59"/>
+    <w:bookmarkStart w:id="63" w:name="arm2"/>
     <w:p>
       <w:pPr>
         <w:pStyle w:val="Heading2"/>
@@ -7225,18 +8411,18 @@
           <wp:inline>
             <wp:extent cx="5077968" cy="2980944"/>
             <wp:effectExtent b="0" l="0" r="0" t="0"/>
-            <wp:docPr descr="Excess fuel by fault class" title="" id="60" name="Picture"/>
+            <wp:docPr descr="Excess fuel by fault class" title="" id="61" name="Picture"/>
             <a:graphic>
               <a:graphicData uri="http://schemas.openxmlformats.org/drawingml/2006/picture">
                 <pic:pic>
                   <pic:nvPicPr>
-                    <pic:cNvPr descr="figures/fig5_fault_signature.png" id="61" name="Picture"/>
+                    <pic:cNvPr descr="figures/fig5_fault_signature.png" id="62" name="Picture"/>
                     <pic:cNvPicPr>
                       <a:picLocks noChangeArrowheads="1" noChangeAspect="1"/>
                     </pic:cNvPicPr>
                   </pic:nvPicPr>
                   <pic:blipFill>
-                    <a:blip r:embed="rId59"/>
+                    <a:blip r:embed="rId60"/>
                     <a:stretch>
                       <a:fillRect/>
                     </a:stretch>
@@ -7287,8 +8473,8 @@
         <w:t xml:space="preserve">mixture (low air-fuel ratio) burns measurably more.</w:t>
       </w:r>
     </w:p>
-    <w:bookmarkEnd w:id="62"/>
-    <w:bookmarkStart w:id="83" w:name="attrib"/>
+    <w:bookmarkEnd w:id="63"/>
+    <w:bookmarkStart w:id="84" w:name="attrib"/>
     <w:p>
       <w:pPr>
         <w:pStyle w:val="Heading2"/>
@@ -7297,7 +8483,7 @@
         <w:t xml:space="preserve">8. Attribution</w:t>
       </w:r>
     </w:p>
-    <w:bookmarkStart w:id="66" w:name="signature-contrast"/>
+    <w:bookmarkStart w:id="67" w:name="signature-contrast"/>
     <w:p>
       <w:pPr>
         <w:pStyle w:val="Heading3"/>
@@ -7856,18 +9042,18 @@
           <wp:inline>
             <wp:extent cx="5004816" cy="3169920"/>
             <wp:effectExtent b="0" l="0" r="0" t="0"/>
-            <wp:docPr descr="Signature contrast" title="" id="64" name="Picture"/>
+            <wp:docPr descr="Signature contrast" title="" id="65" name="Picture"/>
             <a:graphic>
               <a:graphicData uri="http://schemas.openxmlformats.org/drawingml/2006/picture">
                 <pic:pic>
                   <pic:nvPicPr>
-                    <pic:cNvPr descr="figures/signature_contrast.png" id="65" name="Picture"/>
+                    <pic:cNvPr descr="figures/signature_contrast.png" id="66" name="Picture"/>
                     <pic:cNvPicPr>
                       <a:picLocks noChangeArrowheads="1" noChangeAspect="1"/>
                     </pic:cNvPicPr>
                   </pic:nvPicPr>
                   <pic:blipFill>
-                    <a:blip r:embed="rId63"/>
+                    <a:blip r:embed="rId64"/>
                     <a:stretch>
                       <a:fillRect/>
                     </a:stretch>
@@ -7918,8 +9104,8 @@
         <w:t xml:space="preserve">excess while the kinematic axis carries it; the starred bench cell is physically expected.</w:t>
       </w:r>
     </w:p>
-    <w:bookmarkEnd w:id="66"/>
-    <w:bookmarkStart w:id="67" w:name="Xd6fc0166739812c3871d7dee08ed8f862b94f1f"/>
+    <w:bookmarkEnd w:id="67"/>
+    <w:bookmarkStart w:id="68" w:name="Xd6fc0166739812c3871d7dee08ed8f862b94f1f"/>
     <w:p>
       <w:pPr>
         <w:pStyle w:val="Heading3"/>
@@ -7992,8 +9178,8 @@
         <w:t xml:space="preserve">the quantitative evaluation is next.</w:t>
       </w:r>
     </w:p>
-    <w:bookmarkEnd w:id="67"/>
-    <w:bookmarkStart w:id="71" w:name="Xb1501bb4601b4931c307d9f0cff37d918ea1833"/>
+    <w:bookmarkEnd w:id="68"/>
+    <w:bookmarkStart w:id="72" w:name="Xb1501bb4601b4931c307d9f0cff37d918ea1833"/>
     <w:p>
       <w:pPr>
         <w:pStyle w:val="Heading3"/>
@@ -8269,18 +9455,18 @@
           <wp:inline>
             <wp:extent cx="5187696" cy="3176016"/>
             <wp:effectExtent b="0" l="0" r="0" t="0"/>
-            <wp:docPr descr="Attribution accuracy vs signature strength" title="" id="69" name="Picture"/>
+            <wp:docPr descr="Attribution accuracy vs signature strength" title="" id="70" name="Picture"/>
             <a:graphic>
               <a:graphicData uri="http://schemas.openxmlformats.org/drawingml/2006/picture">
                 <pic:pic>
                   <pic:nvPicPr>
-                    <pic:cNvPr descr="figures/fig6_attribution_accuracy.png" id="70" name="Picture"/>
+                    <pic:cNvPr descr="figures/fig6_attribution_accuracy.png" id="71" name="Picture"/>
                     <pic:cNvPicPr>
                       <a:picLocks noChangeArrowheads="1" noChangeAspect="1"/>
                     </pic:cNvPicPr>
                   </pic:nvPicPr>
                   <pic:blipFill>
-                    <a:blip r:embed="rId68"/>
+                    <a:blip r:embed="rId69"/>
                     <a:stretch>
                       <a:fillRect/>
                     </a:stretch>
@@ -8343,8 +9529,8 @@
         <w:t xml:space="preserve">result that does not use them.</w:t>
       </w:r>
     </w:p>
-    <w:bookmarkEnd w:id="71"/>
-    <w:bookmarkStart w:id="75" w:name="X0770e934613aa954cded40406b703862608b6b5"/>
+    <w:bookmarkEnd w:id="72"/>
+    <w:bookmarkStart w:id="76" w:name="X0770e934613aa954cded40406b703862608b6b5"/>
     <w:p>
       <w:pPr>
         <w:pStyle w:val="Heading3"/>
@@ -8887,18 +10073,18 @@
           <wp:inline>
             <wp:extent cx="4261104" cy="3608832"/>
             <wp:effectExtent b="0" l="0" r="0" t="0"/>
-            <wp:docPr descr="Mixed-cause dominant-cause accuracy grid" title="" id="73" name="Picture"/>
+            <wp:docPr descr="Mixed-cause dominant-cause accuracy grid" title="" id="74" name="Picture"/>
             <a:graphic>
               <a:graphicData uri="http://schemas.openxmlformats.org/drawingml/2006/picture">
                 <pic:pic>
                   <pic:nvPicPr>
-                    <pic:cNvPr descr="figures/mixed_cause_grid.png" id="74" name="Picture"/>
+                    <pic:cNvPr descr="figures/mixed_cause_grid.png" id="75" name="Picture"/>
                     <pic:cNvPicPr>
                       <a:picLocks noChangeArrowheads="1" noChangeAspect="1"/>
                     </pic:cNvPicPr>
                   </pic:nvPicPr>
                   <pic:blipFill>
-                    <a:blip r:embed="rId72"/>
+                    <a:blip r:embed="rId73"/>
                     <a:stretch>
                       <a:fillRect/>
                     </a:stretch>
@@ -9303,8 +10489,8 @@
         <w:t xml:space="preserve">chance.</w:t>
       </w:r>
     </w:p>
-    <w:bookmarkEnd w:id="75"/>
-    <w:bookmarkStart w:id="78" w:name="Xb70b62c2f344913f38fcc3ac71a67668c178b99"/>
+    <w:bookmarkEnd w:id="76"/>
+    <w:bookmarkStart w:id="79" w:name="Xb70b62c2f344913f38fcc3ac71a67668c178b99"/>
     <w:p>
       <w:pPr>
         <w:pStyle w:val="Heading3"/>
@@ -9327,7 +10513,7 @@
         <w:t xml:space="preserve">out.</w:t>
       </w:r>
     </w:p>
-    <w:bookmarkStart w:id="76" w:name="trim-blindness-of-the-fuel-target"/>
+    <w:bookmarkStart w:id="77" w:name="trim-blindness-of-the-fuel-target"/>
     <w:p>
       <w:pPr>
         <w:pStyle w:val="Heading4"/>
@@ -9504,8 +10690,8 @@
         <w:t xml:space="preserve">by less than 0.01.</w:t>
       </w:r>
     </w:p>
-    <w:bookmarkEnd w:id="76"/>
-    <w:bookmarkStart w:id="77" w:name="range-restriction"/>
+    <w:bookmarkEnd w:id="77"/>
+    <w:bookmarkStart w:id="78" w:name="range-restriction"/>
     <w:p>
       <w:pPr>
         <w:pStyle w:val="Heading4"/>
@@ -9569,9 +10755,9 @@
         <w:t xml:space="preserve">combustion-linked, not a measurement or sampling artifact.</w:t>
       </w:r>
     </w:p>
-    <w:bookmarkEnd w:id="77"/>
     <w:bookmarkEnd w:id="78"/>
-    <w:bookmarkStart w:id="82" w:name="a-worked-example"/>
+    <w:bookmarkEnd w:id="79"/>
+    <w:bookmarkStart w:id="83" w:name="a-worked-example"/>
     <w:p>
       <w:pPr>
         <w:pStyle w:val="Heading3"/>
@@ -9621,18 +10807,18 @@
           <wp:inline>
             <wp:extent cx="5334000" cy="2380462"/>
             <wp:effectExtent b="0" l="0" r="0" t="0"/>
-            <wp:docPr descr="Per-trip decomposition, two example trips" title="" id="80" name="Picture"/>
+            <wp:docPr descr="Per-trip decomposition, two example trips" title="" id="81" name="Picture"/>
             <a:graphic>
               <a:graphicData uri="http://schemas.openxmlformats.org/drawingml/2006/picture">
                 <pic:pic>
                   <pic:nvPicPr>
-                    <pic:cNvPr descr="figures/fig7_worked_example.png" id="81" name="Picture"/>
+                    <pic:cNvPr descr="figures/fig7_worked_example.png" id="82" name="Picture"/>
                     <pic:cNvPicPr>
                       <a:picLocks noChangeArrowheads="1" noChangeAspect="1"/>
                     </pic:cNvPicPr>
                   </pic:nvPicPr>
                   <pic:blipFill>
-                    <a:blip r:embed="rId79"/>
+                    <a:blip r:embed="rId80"/>
                     <a:stretch>
                       <a:fillRect/>
                     </a:stretch>
@@ -9683,9 +10869,9 @@
         <w:t xml:space="preserve">separates a driver-dominated trip (A) from a vehicle-dominated trip (B).</w:t>
       </w:r>
     </w:p>
-    <w:bookmarkEnd w:id="82"/>
     <w:bookmarkEnd w:id="83"/>
-    <w:bookmarkStart w:id="88" w:name="discuss"/>
+    <w:bookmarkEnd w:id="84"/>
+    <w:bookmarkStart w:id="89" w:name="discuss"/>
     <w:p>
       <w:pPr>
         <w:pStyle w:val="Heading2"/>
@@ -9694,7 +10880,7 @@
         <w:t xml:space="preserve">9. Discussion</w:t>
       </w:r>
     </w:p>
-    <w:bookmarkStart w:id="84" w:name="why-signature-based-attribution-works"/>
+    <w:bookmarkStart w:id="85" w:name="why-signature-based-attribution-works"/>
     <w:p>
       <w:pPr>
         <w:pStyle w:val="Heading3"/>
@@ -9770,8 +10956,8 @@
         <w:t xml:space="preserve">driver-caused excess and why attribution is possible from standard channels.</w:t>
       </w:r>
     </w:p>
-    <w:bookmarkEnd w:id="84"/>
-    <w:bookmarkStart w:id="85" w:name="deployment"/>
+    <w:bookmarkEnd w:id="85"/>
+    <w:bookmarkStart w:id="86" w:name="deployment"/>
     <w:p>
       <w:pPr>
         <w:pStyle w:val="Heading3"/>
@@ -9841,8 +11027,8 @@
         <w:t xml:space="preserve">and are attributed less confidently, degrading gracefully rather than failing abruptly.</w:t>
       </w:r>
     </w:p>
-    <w:bookmarkEnd w:id="85"/>
-    <w:bookmarkStart w:id="86" w:name="what-the-vehicle-baseline-is"/>
+    <w:bookmarkEnd w:id="86"/>
+    <w:bookmarkStart w:id="87" w:name="what-the-vehicle-baseline-is"/>
     <w:p>
       <w:pPr>
         <w:pStyle w:val="Heading3"/>
@@ -9893,8 +11079,8 @@
         <w:t xml:space="preserve">mechanical fault, which remains a diagnosis step.</w:t>
       </w:r>
     </w:p>
-    <w:bookmarkEnd w:id="86"/>
-    <w:bookmarkStart w:id="87" w:name="the-benchmark-the-field-needs"/>
+    <w:bookmarkEnd w:id="87"/>
+    <w:bookmarkStart w:id="88" w:name="the-benchmark-the-field-needs"/>
     <w:p>
       <w:pPr>
         <w:pStyle w:val="Heading3"/>
@@ -9929,9 +11115,9 @@
         <w:t xml:space="preserve">bridge to be replaced by real ground truth.</w:t>
       </w:r>
     </w:p>
-    <w:bookmarkEnd w:id="87"/>
     <w:bookmarkEnd w:id="88"/>
-    <w:bookmarkStart w:id="90" w:name="limits"/>
+    <w:bookmarkEnd w:id="89"/>
+    <w:bookmarkStart w:id="91" w:name="limits"/>
     <w:p>
       <w:pPr>
         <w:pStyle w:val="Heading2"/>
@@ -10014,7 +11200,7 @@
         <w:t xml:space="preserve">analysis is left to future work.</w:t>
       </w:r>
     </w:p>
-    <w:bookmarkStart w:id="89" w:name="responsible-use"/>
+    <w:bookmarkStart w:id="90" w:name="responsible-use"/>
     <w:p>
       <w:pPr>
         <w:pStyle w:val="Heading3"/>
@@ -10049,9 +11235,9 @@
         <w:t xml:space="preserve">automatic verdict; the per-trip output is a decomposition with error bars, not a judgment.</w:t>
       </w:r>
     </w:p>
-    <w:bookmarkEnd w:id="89"/>
     <w:bookmarkEnd w:id="90"/>
-    <w:bookmarkStart w:id="91" w:name="conclusion"/>
+    <w:bookmarkEnd w:id="91"/>
+    <w:bookmarkStart w:id="92" w:name="conclusion"/>
     <w:p>
       <w:pPr>
         <w:pStyle w:val="Heading2"/>
@@ -10116,8 +11302,8 @@
         <w:t xml:space="preserve">public dataset that carries fuel, faults, and behaviour together.</w:t>
       </w:r>
     </w:p>
-    <w:bookmarkEnd w:id="91"/>
-    <w:bookmarkStart w:id="95" w:name="repro"/>
+    <w:bookmarkEnd w:id="92"/>
+    <w:bookmarkStart w:id="96" w:name="repro"/>
     <w:p>
       <w:pPr>
         <w:pStyle w:val="Heading2"/>
@@ -10139,7 +11325,7 @@
       <w:r>
         <w:t xml:space="preserve">(</w:t>
       </w:r>
-      <w:hyperlink r:id="rId92">
+      <w:hyperlink r:id="rId93">
         <w:r>
           <w:rPr>
             <w:rStyle w:val="Hyperlink"/>
@@ -10156,7 +11342,7 @@
       <w:r>
         <w:t xml:space="preserve">(</w:t>
       </w:r>
-      <w:hyperlink r:id="rId93">
+      <w:hyperlink r:id="rId94">
         <w:r>
           <w:rPr>
             <w:rStyle w:val="Hyperlink"/>
@@ -10173,7 +11359,7 @@
       <w:r>
         <w:t xml:space="preserve">GPL-3.0); Driving Events (</w:t>
       </w:r>
-      <w:hyperlink r:id="rId94">
+      <w:hyperlink r:id="rId95">
         <w:r>
           <w:rPr>
             <w:rStyle w:val="Hyperlink"/>
@@ -10282,8 +11468,8 @@
         <w:t xml:space="preserve">for releasing their data openly.</w:t>
       </w:r>
     </w:p>
-    <w:bookmarkEnd w:id="95"/>
-    <w:bookmarkStart w:id="145" w:name="refs"/>
+    <w:bookmarkEnd w:id="96"/>
+    <w:bookmarkStart w:id="146" w:name="refs"/>
     <w:p>
       <w:pPr>
         <w:pStyle w:val="Heading2"/>
@@ -10297,10 +11483,10 @@
         <w:pStyle w:val="Compact"/>
         <w:numPr>
           <w:ilvl w:val="0"/>
-          <w:numId w:val="1002"/>
+          <w:numId w:val="1003"/>
         </w:numPr>
       </w:pPr>
-      <w:bookmarkStart w:id="97" w:name="r1"/>
+      <w:bookmarkStart w:id="98" w:name="r1"/>
       <w:r>
         <w:t xml:space="preserve">G. Oh, D. J. LeBlanc, H. Peng. Vehicle Energy Dataset (VED), A Large-scale Dataset for</w:t>
       </w:r>
@@ -10332,7 +11518,7 @@
       <w:r>
         <w:t xml:space="preserve"> </w:t>
       </w:r>
-      <w:hyperlink r:id="rId96">
+      <w:hyperlink r:id="rId97">
         <w:r>
           <w:rPr>
             <w:rStyle w:val="Hyperlink"/>
@@ -10340,17 +11526,17 @@
           <w:t xml:space="preserve">10.1109/TITS.2020.3035596</w:t>
         </w:r>
       </w:hyperlink>
-      <w:bookmarkEnd w:id="97"/>
+      <w:bookmarkEnd w:id="98"/>
     </w:p>
     <w:p>
       <w:pPr>
         <w:pStyle w:val="Compact"/>
         <w:numPr>
           <w:ilvl w:val="0"/>
-          <w:numId w:val="1002"/>
+          <w:numId w:val="1003"/>
         </w:numPr>
       </w:pPr>
-      <w:bookmarkStart w:id="99" w:name="r2"/>
+      <w:bookmarkStart w:id="100" w:name="r2"/>
       <w:r>
         <w:t xml:space="preserve">L. Thomas et al. EngineFaultDB: A Novel Dataset for Automotive Engine Fault</w:t>
       </w:r>
@@ -10376,7 +11562,7 @@
       <w:r>
         <w:t xml:space="preserve"> </w:t>
       </w:r>
-      <w:hyperlink r:id="rId98">
+      <w:hyperlink r:id="rId99">
         <w:r>
           <w:rPr>
             <w:rStyle w:val="Hyperlink"/>
@@ -10384,17 +11570,17 @@
           <w:t xml:space="preserve">10.1109/ACCESS.2023.3331316</w:t>
         </w:r>
       </w:hyperlink>
-      <w:bookmarkEnd w:id="99"/>
+      <w:bookmarkEnd w:id="100"/>
     </w:p>
     <w:p>
       <w:pPr>
         <w:pStyle w:val="Compact"/>
         <w:numPr>
           <w:ilvl w:val="0"/>
-          <w:numId w:val="1002"/>
+          <w:numId w:val="1003"/>
         </w:numPr>
       </w:pPr>
-      <w:bookmarkStart w:id="101" w:name="r3"/>
+      <w:bookmarkStart w:id="102" w:name="r3"/>
       <w:r>
         <w:t xml:space="preserve">A. Barbado, Ó. Corcho. Interpretable machine learning models for predicting and</w:t>
       </w:r>
@@ -10434,7 +11620,7 @@
       <w:r>
         <w:t xml:space="preserve"> </w:t>
       </w:r>
-      <w:hyperlink r:id="rId100">
+      <w:hyperlink r:id="rId101">
         <w:r>
           <w:rPr>
             <w:rStyle w:val="Hyperlink"/>
@@ -10442,17 +11628,17 @@
           <w:t xml:space="preserve">10.1016/j.engappai.2022.105222</w:t>
         </w:r>
       </w:hyperlink>
-      <w:bookmarkEnd w:id="101"/>
+      <w:bookmarkEnd w:id="102"/>
     </w:p>
     <w:p>
       <w:pPr>
         <w:pStyle w:val="Compact"/>
         <w:numPr>
           <w:ilvl w:val="0"/>
-          <w:numId w:val="1002"/>
+          <w:numId w:val="1003"/>
         </w:numPr>
       </w:pPr>
-      <w:bookmarkStart w:id="103" w:name="r4"/>
+      <w:bookmarkStart w:id="104" w:name="r4"/>
       <w:r>
         <w:t xml:space="preserve">H. Abediasl, A. Ansari, V. Hosseini, C. R. Koch, M. Shahbakhti. Real-time vehicular fuel</w:t>
       </w:r>
@@ -10492,7 +11678,7 @@
       <w:r>
         <w:t xml:space="preserve"> </w:t>
       </w:r>
-      <w:hyperlink r:id="rId102">
+      <w:hyperlink r:id="rId103">
         <w:r>
           <w:rPr>
             <w:rStyle w:val="Hyperlink"/>
@@ -10500,17 +11686,17 @@
           <w:t xml:space="preserve">10.1177/09544070231185609</w:t>
         </w:r>
       </w:hyperlink>
-      <w:bookmarkEnd w:id="103"/>
+      <w:bookmarkEnd w:id="104"/>
     </w:p>
     <w:p>
       <w:pPr>
         <w:pStyle w:val="Compact"/>
         <w:numPr>
           <w:ilvl w:val="0"/>
-          <w:numId w:val="1002"/>
+          <w:numId w:val="1003"/>
         </w:numPr>
       </w:pPr>
-      <w:bookmarkStart w:id="105" w:name="r5"/>
+      <w:bookmarkStart w:id="106" w:name="r5"/>
       <w:r>
         <w:t xml:space="preserve">P. Fafoutellis, E. G. Mantouka, E. I. Vlahogianni. Eco-Driving and Its Impacts on Fuel</w:t>
       </w:r>
@@ -10542,7 +11728,7 @@
       <w:r>
         <w:t xml:space="preserve"> </w:t>
       </w:r>
-      <w:hyperlink r:id="rId104">
+      <w:hyperlink r:id="rId105">
         <w:r>
           <w:rPr>
             <w:rStyle w:val="Hyperlink"/>
@@ -10550,24 +11736,24 @@
           <w:t xml:space="preserve">10.3390/su13010226</w:t>
         </w:r>
       </w:hyperlink>
-      <w:bookmarkEnd w:id="105"/>
+      <w:bookmarkEnd w:id="106"/>
     </w:p>
     <w:p>
       <w:pPr>
         <w:pStyle w:val="Compact"/>
         <w:numPr>
           <w:ilvl w:val="0"/>
-          <w:numId w:val="1002"/>
+          <w:numId w:val="1003"/>
         </w:numPr>
       </w:pPr>
-      <w:bookmarkStart w:id="107" w:name="r6"/>
+      <w:bookmarkStart w:id="108" w:name="r6"/>
       <w:r>
         <w:t xml:space="preserve">J. Vieira et al. Driving Events Dataset. Zenodo, 2022.</w:t>
       </w:r>
       <w:r>
         <w:t xml:space="preserve"> </w:t>
       </w:r>
-      <w:hyperlink r:id="rId106">
+      <w:hyperlink r:id="rId107">
         <w:r>
           <w:rPr>
             <w:rStyle w:val="Hyperlink"/>
@@ -10575,17 +11761,17 @@
           <w:t xml:space="preserve">10.5281/zenodo.6570972</w:t>
         </w:r>
       </w:hyperlink>
-      <w:bookmarkEnd w:id="107"/>
+      <w:bookmarkEnd w:id="108"/>
     </w:p>
     <w:p>
       <w:pPr>
         <w:pStyle w:val="Compact"/>
         <w:numPr>
           <w:ilvl w:val="0"/>
-          <w:numId w:val="1002"/>
+          <w:numId w:val="1003"/>
         </w:numPr>
       </w:pPr>
-      <w:bookmarkStart w:id="108" w:name="r7"/>
+      <w:bookmarkStart w:id="109" w:name="r7"/>
       <w:r>
         <w:t xml:space="preserve">J. L. Jimenez-Palacios. Understanding and quantifying motor vehicle emissions with</w:t>
       </w:r>
@@ -10595,17 +11781,17 @@
       <w:r>
         <w:t xml:space="preserve">vehicle specific power and TILDAS remote sensing. PhD thesis, MIT, 1999.</w:t>
       </w:r>
-      <w:bookmarkEnd w:id="108"/>
+      <w:bookmarkEnd w:id="109"/>
     </w:p>
     <w:p>
       <w:pPr>
         <w:pStyle w:val="Compact"/>
         <w:numPr>
           <w:ilvl w:val="0"/>
-          <w:numId w:val="1002"/>
+          <w:numId w:val="1003"/>
         </w:numPr>
       </w:pPr>
-      <w:bookmarkStart w:id="110" w:name="r8"/>
+      <w:bookmarkStart w:id="111" w:name="r8"/>
       <w:r>
         <w:t xml:space="preserve">K. Ahn, H. Rakha, A. Trani, M. Van Aerde. Estimating Vehicle Fuel Consumption and</w:t>
       </w:r>
@@ -10645,7 +11831,7 @@
       <w:r>
         <w:t xml:space="preserve"> </w:t>
       </w:r>
-      <w:hyperlink r:id="rId109">
+      <w:hyperlink r:id="rId110">
         <w:r>
           <w:rPr>
             <w:rStyle w:val="Hyperlink"/>
@@ -10653,17 +11839,17 @@
           <w:t xml:space="preserve">10.1061/(ASCE)0733-947X(2002)128:2(182)</w:t>
         </w:r>
       </w:hyperlink>
-      <w:bookmarkEnd w:id="110"/>
+      <w:bookmarkEnd w:id="111"/>
     </w:p>
     <w:p>
       <w:pPr>
         <w:pStyle w:val="Compact"/>
         <w:numPr>
           <w:ilvl w:val="0"/>
-          <w:numId w:val="1002"/>
+          <w:numId w:val="1003"/>
         </w:numPr>
       </w:pPr>
-      <w:bookmarkStart w:id="112" w:name="r9"/>
+      <w:bookmarkStart w:id="113" w:name="r9"/>
       <w:r>
         <w:t xml:space="preserve">T. Abukhalil, H. AlMahafzah, M. Alksasbeh, B. A. Y. Alqaralleh. Fuel Consumption Using</w:t>
       </w:r>
@@ -10689,7 +11875,7 @@
       <w:r>
         <w:t xml:space="preserve"> </w:t>
       </w:r>
-      <w:hyperlink r:id="rId111">
+      <w:hyperlink r:id="rId112">
         <w:r>
           <w:rPr>
             <w:rStyle w:val="Hyperlink"/>
@@ -10697,17 +11883,17 @@
           <w:t xml:space="preserve">10.1155/2020/9450178</w:t>
         </w:r>
       </w:hyperlink>
-      <w:bookmarkEnd w:id="112"/>
+      <w:bookmarkEnd w:id="113"/>
     </w:p>
     <w:p>
       <w:pPr>
         <w:pStyle w:val="Compact"/>
         <w:numPr>
           <w:ilvl w:val="0"/>
-          <w:numId w:val="1002"/>
+          <w:numId w:val="1003"/>
         </w:numPr>
       </w:pPr>
-      <w:bookmarkStart w:id="114" w:name="r10"/>
+      <w:bookmarkStart w:id="115" w:name="r10"/>
       <w:r>
         <w:t xml:space="preserve">R. Chu, W. H. Chik, J. Song, J. Chan, X. Li. Real-time Fuel Leakage Detection via Online</w:t>
       </w:r>
@@ -10720,7 +11906,7 @@
       <w:r>
         <w:t xml:space="preserve"> </w:t>
       </w:r>
-      <w:hyperlink r:id="rId113">
+      <w:hyperlink r:id="rId114">
         <w:r>
           <w:rPr>
             <w:rStyle w:val="Hyperlink"/>
@@ -10728,17 +11914,17 @@
           <w:t xml:space="preserve">10.48550/arXiv.2410.09741</w:t>
         </w:r>
       </w:hyperlink>
-      <w:bookmarkEnd w:id="114"/>
+      <w:bookmarkEnd w:id="115"/>
     </w:p>
     <w:p>
       <w:pPr>
         <w:pStyle w:val="Compact"/>
         <w:numPr>
           <w:ilvl w:val="0"/>
-          <w:numId w:val="1002"/>
+          <w:numId w:val="1003"/>
         </w:numPr>
       </w:pPr>
-      <w:bookmarkStart w:id="116" w:name="r11"/>
+      <w:bookmarkStart w:id="117" w:name="r11"/>
       <w:r>
         <w:t xml:space="preserve">H. A. Rakha, K. Ahn, K. Moran, B. Saerens, E. Van den Bulck. Virginia Tech Comprehensive</w:t>
       </w:r>
@@ -10770,7 +11956,7 @@
       <w:r>
         <w:t xml:space="preserve"> </w:t>
       </w:r>
-      <w:hyperlink r:id="rId115">
+      <w:hyperlink r:id="rId116">
         <w:r>
           <w:rPr>
             <w:rStyle w:val="Hyperlink"/>
@@ -10778,17 +11964,17 @@
           <w:t xml:space="preserve">10.1016/j.trd.2011.05.008</w:t>
         </w:r>
       </w:hyperlink>
-      <w:bookmarkEnd w:id="116"/>
+      <w:bookmarkEnd w:id="117"/>
     </w:p>
     <w:p>
       <w:pPr>
         <w:pStyle w:val="Compact"/>
         <w:numPr>
           <w:ilvl w:val="0"/>
-          <w:numId w:val="1002"/>
+          <w:numId w:val="1003"/>
         </w:numPr>
       </w:pPr>
-      <w:bookmarkStart w:id="118" w:name="r12"/>
+      <w:bookmarkStart w:id="119" w:name="r12"/>
       <w:r>
         <w:t xml:space="preserve">P. Ping, W. Qin, Y. Xu, C. Miyajima, K. Takeda. Impact of Driver Behavior on Fuel</w:t>
       </w:r>
@@ -10820,7 +12006,7 @@
       <w:r>
         <w:t xml:space="preserve"> </w:t>
       </w:r>
-      <w:hyperlink r:id="rId117">
+      <w:hyperlink r:id="rId118">
         <w:r>
           <w:rPr>
             <w:rStyle w:val="Hyperlink"/>
@@ -10828,17 +12014,17 @@
           <w:t xml:space="preserve">10.1109/ACCESS.2019.2920489</w:t>
         </w:r>
       </w:hyperlink>
-      <w:bookmarkEnd w:id="118"/>
+      <w:bookmarkEnd w:id="119"/>
     </w:p>
     <w:p>
       <w:pPr>
         <w:pStyle w:val="Compact"/>
         <w:numPr>
           <w:ilvl w:val="0"/>
-          <w:numId w:val="1002"/>
+          <w:numId w:val="1003"/>
         </w:numPr>
       </w:pPr>
-      <w:bookmarkStart w:id="120" w:name="r13"/>
+      <w:bookmarkStart w:id="121" w:name="r13"/>
       <w:r>
         <w:t xml:space="preserve">A. Mohammadnazar, Z. H. Khattak, A. J. Khattak. Assessing driving behavior influence on</w:t>
       </w:r>
@@ -10878,7 +12064,7 @@
       <w:r>
         <w:t xml:space="preserve"> </w:t>
       </w:r>
-      <w:hyperlink r:id="rId119">
+      <w:hyperlink r:id="rId120">
         <w:r>
           <w:rPr>
             <w:rStyle w:val="Hyperlink"/>
@@ -10886,17 +12072,17 @@
           <w:t xml:space="preserve">10.1016/j.trd.2023.104025</w:t>
         </w:r>
       </w:hyperlink>
-      <w:bookmarkEnd w:id="120"/>
+      <w:bookmarkEnd w:id="121"/>
     </w:p>
     <w:p>
       <w:pPr>
         <w:pStyle w:val="Compact"/>
         <w:numPr>
           <w:ilvl w:val="0"/>
-          <w:numId w:val="1002"/>
+          <w:numId w:val="1003"/>
         </w:numPr>
       </w:pPr>
-      <w:bookmarkStart w:id="122" w:name="r14"/>
+      <w:bookmarkStart w:id="123" w:name="r14"/>
       <w:r>
         <w:t xml:space="preserve">D. A. Johnson, M. M. Trivedi. Driving style recognition using a smartphone as a sensor</w:t>
       </w:r>
@@ -10922,7 +12108,7 @@
       <w:r>
         <w:t xml:space="preserve"> </w:t>
       </w:r>
-      <w:hyperlink r:id="rId121">
+      <w:hyperlink r:id="rId122">
         <w:r>
           <w:rPr>
             <w:rStyle w:val="Hyperlink"/>
@@ -10930,17 +12116,17 @@
           <w:t xml:space="preserve">10.1109/ITSC.2011.6083078</w:t>
         </w:r>
       </w:hyperlink>
-      <w:bookmarkEnd w:id="122"/>
+      <w:bookmarkEnd w:id="123"/>
     </w:p>
     <w:p>
       <w:pPr>
         <w:pStyle w:val="Compact"/>
         <w:numPr>
           <w:ilvl w:val="0"/>
-          <w:numId w:val="1002"/>
+          <w:numId w:val="1003"/>
         </w:numPr>
       </w:pPr>
-      <w:bookmarkStart w:id="124" w:name="r15"/>
+      <w:bookmarkStart w:id="125" w:name="r15"/>
       <w:r>
         <w:t xml:space="preserve">S. S. Haghshenas, A. Kouvelas, V. Astarita, S. S. Haghshenas, G. Guido. Driver behavior</w:t>
       </w:r>
@@ -10966,7 +12152,7 @@
       <w:r>
         <w:t xml:space="preserve"> </w:t>
       </w:r>
-      <w:hyperlink r:id="rId123">
+      <w:hyperlink r:id="rId124">
         <w:r>
           <w:rPr>
             <w:rStyle w:val="Hyperlink"/>
@@ -10974,17 +12160,17 @@
           <w:t xml:space="preserve">10.1016/j.treng.2026.100436</w:t>
         </w:r>
       </w:hyperlink>
-      <w:bookmarkEnd w:id="124"/>
+      <w:bookmarkEnd w:id="125"/>
     </w:p>
     <w:p>
       <w:pPr>
         <w:pStyle w:val="Compact"/>
         <w:numPr>
           <w:ilvl w:val="0"/>
-          <w:numId w:val="1002"/>
+          <w:numId w:val="1003"/>
         </w:numPr>
       </w:pPr>
-      <w:bookmarkStart w:id="126" w:name="r16"/>
+      <w:bookmarkStart w:id="127" w:name="r16"/>
       <w:r>
         <w:t xml:space="preserve">M. Cervantes-Bobadilla et al. Multiple fault detection and isolation using artificial</w:t>
       </w:r>
@@ -11016,7 +12202,7 @@
       <w:r>
         <w:t xml:space="preserve"> </w:t>
       </w:r>
-      <w:hyperlink r:id="rId125">
+      <w:hyperlink r:id="rId126">
         <w:r>
           <w:rPr>
             <w:rStyle w:val="Hyperlink"/>
@@ -11024,17 +12210,17 @@
           <w:t xml:space="preserve">10.1016/j.engappai.2022.105524</w:t>
         </w:r>
       </w:hyperlink>
-      <w:bookmarkEnd w:id="126"/>
+      <w:bookmarkEnd w:id="127"/>
     </w:p>
     <w:p>
       <w:pPr>
         <w:pStyle w:val="Compact"/>
         <w:numPr>
           <w:ilvl w:val="0"/>
-          <w:numId w:val="1002"/>
+          <w:numId w:val="1003"/>
         </w:numPr>
       </w:pPr>
-      <w:bookmarkStart w:id="128" w:name="r17"/>
+      <w:bookmarkStart w:id="129" w:name="r17"/>
       <w:r>
         <w:t xml:space="preserve">P. Gutiérrez León et al. Implementation of a fault tolerant system for</w:t>
       </w:r>
@@ -11060,7 +12246,7 @@
       <w:r>
         <w:t xml:space="preserve"> </w:t>
       </w:r>
-      <w:hyperlink r:id="rId127">
+      <w:hyperlink r:id="rId128">
         <w:r>
           <w:rPr>
             <w:rStyle w:val="Hyperlink"/>
@@ -11068,17 +12254,17 @@
           <w:t xml:space="preserve">10.1016/j.measurement.2018.03.006</w:t>
         </w:r>
       </w:hyperlink>
-      <w:bookmarkEnd w:id="128"/>
+      <w:bookmarkEnd w:id="129"/>
     </w:p>
     <w:p>
       <w:pPr>
         <w:pStyle w:val="Compact"/>
         <w:numPr>
           <w:ilvl w:val="0"/>
-          <w:numId w:val="1002"/>
+          <w:numId w:val="1003"/>
         </w:numPr>
       </w:pPr>
-      <w:bookmarkStart w:id="130" w:name="r18"/>
+      <w:bookmarkStart w:id="131" w:name="r18"/>
       <w:r>
         <w:t xml:space="preserve">C.-S. A. Gong, C.-H. S. Su, Y.-E. Liu, D.-Y. Guu, Y.-H. Chen. Deep Learning with LPC and</w:t>
       </w:r>
@@ -11104,7 +12290,7 @@
       <w:r>
         <w:t xml:space="preserve"> </w:t>
       </w:r>
-      <w:hyperlink r:id="rId129">
+      <w:hyperlink r:id="rId130">
         <w:r>
           <w:rPr>
             <w:rStyle w:val="Hyperlink"/>
@@ -11112,17 +12298,17 @@
           <w:t xml:space="preserve">10.3390/s22187072</w:t>
         </w:r>
       </w:hyperlink>
-      <w:bookmarkEnd w:id="130"/>
+      <w:bookmarkEnd w:id="131"/>
     </w:p>
     <w:p>
       <w:pPr>
         <w:pStyle w:val="Compact"/>
         <w:numPr>
           <w:ilvl w:val="0"/>
-          <w:numId w:val="1002"/>
+          <w:numId w:val="1003"/>
         </w:numPr>
       </w:pPr>
-      <w:bookmarkStart w:id="132" w:name="r19"/>
+      <w:bookmarkStart w:id="133" w:name="r19"/>
       <w:r>
         <w:t xml:space="preserve">F. T. Liu, K. M. Ting, Z.-H. Zhou. Isolation Forest.</w:t>
       </w:r>
@@ -11142,7 +12328,7 @@
       <w:r>
         <w:t xml:space="preserve"> </w:t>
       </w:r>
-      <w:hyperlink r:id="rId131">
+      <w:hyperlink r:id="rId132">
         <w:r>
           <w:rPr>
             <w:rStyle w:val="Hyperlink"/>
@@ -11150,17 +12336,17 @@
           <w:t xml:space="preserve">10.1109/ICDM.2008.17</w:t>
         </w:r>
       </w:hyperlink>
-      <w:bookmarkEnd w:id="132"/>
+      <w:bookmarkEnd w:id="133"/>
     </w:p>
     <w:p>
       <w:pPr>
         <w:pStyle w:val="Compact"/>
         <w:numPr>
           <w:ilvl w:val="0"/>
-          <w:numId w:val="1002"/>
+          <w:numId w:val="1003"/>
         </w:numPr>
       </w:pPr>
-      <w:bookmarkStart w:id="134" w:name="r20"/>
+      <w:bookmarkStart w:id="135" w:name="r20"/>
       <w:r>
         <w:t xml:space="preserve">S. Longari, D. H. Nova Valcarcel, M. Zago, M. Carminati, S. Zanero. CANnolo: An Anomaly</w:t>
       </w:r>
@@ -11200,7 +12386,7 @@
       <w:r>
         <w:t xml:space="preserve"> </w:t>
       </w:r>
-      <w:hyperlink r:id="rId133">
+      <w:hyperlink r:id="rId134">
         <w:r>
           <w:rPr>
             <w:rStyle w:val="Hyperlink"/>
@@ -11208,17 +12394,17 @@
           <w:t xml:space="preserve">10.1109/TNSM.2020.3038991</w:t>
         </w:r>
       </w:hyperlink>
-      <w:bookmarkEnd w:id="134"/>
+      <w:bookmarkEnd w:id="135"/>
     </w:p>
     <w:p>
       <w:pPr>
         <w:pStyle w:val="Compact"/>
         <w:numPr>
           <w:ilvl w:val="0"/>
-          <w:numId w:val="1002"/>
+          <w:numId w:val="1003"/>
         </w:numPr>
       </w:pPr>
-      <w:bookmarkStart w:id="136" w:name="r21"/>
+      <w:bookmarkStart w:id="137" w:name="r21"/>
       <w:r>
         <w:t xml:space="preserve">V. K. Kukkala, S. V. Thiruloga, S. Pasricha. INDRA: Intrusion Detection Using Recurrent</w:t>
       </w:r>
@@ -11258,7 +12444,7 @@
       <w:r>
         <w:t xml:space="preserve"> </w:t>
       </w:r>
-      <w:hyperlink r:id="rId135">
+      <w:hyperlink r:id="rId136">
         <w:r>
           <w:rPr>
             <w:rStyle w:val="Hyperlink"/>
@@ -11266,17 +12452,17 @@
           <w:t xml:space="preserve">10.1109/TCAD.2020.3012749</w:t>
         </w:r>
       </w:hyperlink>
-      <w:bookmarkEnd w:id="136"/>
+      <w:bookmarkEnd w:id="137"/>
     </w:p>
     <w:p>
       <w:pPr>
         <w:pStyle w:val="Compact"/>
         <w:numPr>
           <w:ilvl w:val="0"/>
-          <w:numId w:val="1002"/>
+          <w:numId w:val="1003"/>
         </w:numPr>
       </w:pPr>
-      <w:bookmarkStart w:id="138" w:name="r22"/>
+      <w:bookmarkStart w:id="139" w:name="r22"/>
       <w:r>
         <w:t xml:space="preserve">P. Mansourian, N. Zhang, A. Jaekel, M. Kneppers. Deep Learning-Based Anomaly Detection for</w:t>
       </w:r>
@@ -11316,7 +12502,7 @@
       <w:r>
         <w:t xml:space="preserve"> </w:t>
       </w:r>
-      <w:hyperlink r:id="rId137">
+      <w:hyperlink r:id="rId138">
         <w:r>
           <w:rPr>
             <w:rStyle w:val="Hyperlink"/>
@@ -11324,17 +12510,17 @@
           <w:t xml:space="preserve">10.1109/TITS.2023.3286611</w:t>
         </w:r>
       </w:hyperlink>
-      <w:bookmarkEnd w:id="138"/>
+      <w:bookmarkEnd w:id="139"/>
     </w:p>
     <w:p>
       <w:pPr>
         <w:pStyle w:val="Compact"/>
         <w:numPr>
           <w:ilvl w:val="0"/>
-          <w:numId w:val="1002"/>
+          <w:numId w:val="1003"/>
         </w:numPr>
       </w:pPr>
-      <w:bookmarkStart w:id="140" w:name="r23"/>
+      <w:bookmarkStart w:id="141" w:name="r23"/>
       <w:r>
         <w:t xml:space="preserve">S. M. Lundberg, S.-I. Lee. A Unified Approach to Interpreting Model Predictions (SHAP).</w:t>
       </w:r>
@@ -11347,7 +12533,7 @@
       <w:r>
         <w:t xml:space="preserve"> </w:t>
       </w:r>
-      <w:hyperlink r:id="rId139">
+      <w:hyperlink r:id="rId140">
         <w:r>
           <w:rPr>
             <w:rStyle w:val="Hyperlink"/>
@@ -11355,17 +12541,17 @@
           <w:t xml:space="preserve">10.48550/arXiv.1705.07874</w:t>
         </w:r>
       </w:hyperlink>
-      <w:bookmarkEnd w:id="140"/>
+      <w:bookmarkEnd w:id="141"/>
     </w:p>
     <w:p>
       <w:pPr>
         <w:pStyle w:val="Compact"/>
         <w:numPr>
           <w:ilvl w:val="0"/>
-          <w:numId w:val="1002"/>
+          <w:numId w:val="1003"/>
         </w:numPr>
       </w:pPr>
-      <w:bookmarkStart w:id="142" w:name="r24"/>
+      <w:bookmarkStart w:id="143" w:name="r24"/>
       <w:r>
         <w:t xml:space="preserve">V. Vučinić et al. Anomaly Detection for Vehicle Diagnostics Based on OBD</w:t>
       </w:r>
@@ -11391,7 +12577,7 @@
       <w:r>
         <w:t xml:space="preserve"> </w:t>
       </w:r>
-      <w:hyperlink r:id="rId141">
+      <w:hyperlink r:id="rId142">
         <w:r>
           <w:rPr>
             <w:rStyle w:val="Hyperlink"/>
@@ -11399,17 +12585,17 @@
           <w:t xml:space="preserve">10.1109/ACCESS.2026.3664118</w:t>
         </w:r>
       </w:hyperlink>
-      <w:bookmarkEnd w:id="142"/>
+      <w:bookmarkEnd w:id="143"/>
     </w:p>
     <w:p>
       <w:pPr>
         <w:pStyle w:val="Compact"/>
         <w:numPr>
           <w:ilvl w:val="0"/>
-          <w:numId w:val="1002"/>
+          <w:numId w:val="1003"/>
         </w:numPr>
       </w:pPr>
-      <w:bookmarkStart w:id="144" w:name="r25"/>
+      <w:bookmarkStart w:id="145" w:name="r25"/>
       <w:r>
         <w:t xml:space="preserve">Z.-H. Zhou. A brief introduction to weakly supervised learning.</w:t>
       </w:r>
@@ -11443,7 +12629,7 @@
       <w:r>
         <w:t xml:space="preserve"> </w:t>
       </w:r>
-      <w:hyperlink r:id="rId143">
+      <w:hyperlink r:id="rId144">
         <w:r>
           <w:rPr>
             <w:rStyle w:val="Hyperlink"/>
@@ -11451,7 +12637,7 @@
           <w:t xml:space="preserve">10.1093/nsr/nwx106</w:t>
         </w:r>
       </w:hyperlink>
-      <w:bookmarkEnd w:id="144"/>
+      <w:bookmarkEnd w:id="145"/>
     </w:p>
     <w:p>
       <w:pPr>
@@ -11461,7 +12647,7 @@
         <w:t xml:space="preserve">© 2026 Alexander Apartsin and Yehudit Aperstein.</w:t>
       </w:r>
     </w:p>
-    <w:bookmarkEnd w:id="145"/>
+    <w:bookmarkEnd w:id="146"/>
     <w:sectPr/>
   </w:body>
 </w:document>
@@ -11736,6 +12922,36 @@
     <w:abstractNumId w:val="991"/>
   </w:num>
   <w:num w:numId="1002">
+    <w:abstractNumId w:val="99201"/>
+    <w:lvlOverride w:ilvl="0">
+      <w:startOverride w:val="1"/>
+    </w:lvlOverride>
+    <w:lvlOverride w:ilvl="1">
+      <w:startOverride w:val="1"/>
+    </w:lvlOverride>
+    <w:lvlOverride w:ilvl="2">
+      <w:startOverride w:val="1"/>
+    </w:lvlOverride>
+    <w:lvlOverride w:ilvl="3">
+      <w:startOverride w:val="1"/>
+    </w:lvlOverride>
+    <w:lvlOverride w:ilvl="4">
+      <w:startOverride w:val="1"/>
+    </w:lvlOverride>
+    <w:lvlOverride w:ilvl="5">
+      <w:startOverride w:val="1"/>
+    </w:lvlOverride>
+    <w:lvlOverride w:ilvl="6">
+      <w:startOverride w:val="1"/>
+    </w:lvlOverride>
+    <w:lvlOverride w:ilvl="7">
+      <w:startOverride w:val="1"/>
+    </w:lvlOverride>
+    <w:lvlOverride w:ilvl="8">
+      <w:startOverride w:val="1"/>
+    </w:lvlOverride>
+  </w:num>
+  <w:num w:numId="1003">
     <w:abstractNumId w:val="99201"/>
     <w:lvlOverride w:ilvl="0">
       <w:startOverride w:val="1"/>

</xml_diff>

<commit_message>
Polish new sections (Fable read): disambiguate upper bounds, cite Table 7, fixes
- Table 7 -> 'Trained on same scores' (vs the 95.9% full-feature upper bound in 8.3)
- intro + Table 1 carry the frozen 88.6% / 95.9% framing; cite Table 7
- Sec 5 config aligned to the one-pass decomposition (300 iters, depth 5)
- data-availability script range -> p14; Algorithm notation bridge (zA=zk, zB=zc);
  grouped out-of-fold; name abstention margin tau. Rebuilt root + LaTeX PDFs.

Co-Authored-By: Claude Opus 4.8 <noreply@anthropic.com>
</commit_message>
<xml_diff>
--- a/FuelAnomalies.docx
+++ b/FuelAnomalies.docx
@@ -867,7 +867,7 @@
         <w:t xml:space="preserve"> </w:t>
       </w:r>
       <w:r>
-        <w:t xml:space="preserve">magnitude is made uninformative, the signature recovers the cause at 95.9% accuracy. The remainder of</w:t>
+        <w:t xml:space="preserve">magnitude is made uninformative, signatures frozen from their source domains recover the cause at 88.6% accuracy (95.9% for a classifier trained on the injected labels), while fuel magnitude alone is at chance. The remainder of</w:t>
       </w:r>
       <w:r>
         <w:t xml:space="preserve"> </w:t>
@@ -2029,7 +2029,7 @@
                 <w:b/>
                 <w:bCs/>
               </w:rPr>
-              <w:t xml:space="preserve">yes (measured, 95.9%)</w:t>
+              <w:t xml:space="preserve">yes (measured, 88.6–95.9%)</w:t>
             </w:r>
           </w:p>
         </w:tc>
@@ -3457,7 +3457,7 @@
         </m:d>
       </m:oMath>
       <w:r>
-        <w:t xml:space="preserve">.</w:t>
+        <w:t xml:space="preserve">, grouped out-of-fold.</w:t>
       </w:r>
     </w:p>
     <w:p>
@@ -3997,19 +3997,86 @@
         <w:t xml:space="preserve"> </w:t>
       </w:r>
       <w:r>
-        <w:t xml:space="preserve">is the expected-fuel model (Section 4.3), cause A is aggressive driving with a</w:t>
-      </w:r>
-      <w:r>
-        <w:t xml:space="preserve"> </w:t>
-      </w:r>
-      <w:r>
-        <w:t xml:space="preserve">kinematic signature validated on labelled driving (Section 6.3), and cause B is a rich-mixture fault</w:t>
-      </w:r>
-      <w:r>
-        <w:t xml:space="preserve"> </w:t>
-      </w:r>
-      <w:r>
-        <w:t xml:space="preserve">with a fueling/combustion signature validated on the engine bench (Section 7). The frozen attribution</w:t>
+        <w:t xml:space="preserve">is the expected-fuel model (Section 4.3), cause A is aggressive driving with a kinematic signature validated on labelled driving (Section 6.3), and cause B is a rich-mixture fault with a fueling/combustion signature validated on the engine bench (Section 7); in the notation of Section 4.6,</w:t>
+      </w:r>
+      <w:r>
+        <w:t xml:space="preserve"> </w:t>
+      </w:r>
+      <m:oMath>
+        <m:sSup>
+          <m:e>
+            <m:r>
+              <m:t>z</m:t>
+            </m:r>
+          </m:e>
+          <m:sup>
+            <m:r>
+              <m:t>A</m:t>
+            </m:r>
+          </m:sup>
+        </m:sSup>
+        <m:r>
+          <m:rPr>
+            <m:sty m:val="p"/>
+          </m:rPr>
+          <m:t>=</m:t>
+        </m:r>
+        <m:sSup>
+          <m:e>
+            <m:r>
+              <m:t>z</m:t>
+            </m:r>
+          </m:e>
+          <m:sup>
+            <m:r>
+              <m:t>k</m:t>
+            </m:r>
+          </m:sup>
+        </m:sSup>
+      </m:oMath>
+      <w:r>
+        <w:t xml:space="preserve"> </w:t>
+      </w:r>
+      <w:r>
+        <w:t xml:space="preserve">and</w:t>
+      </w:r>
+      <w:r>
+        <w:t xml:space="preserve"> </w:t>
+      </w:r>
+      <m:oMath>
+        <m:sSup>
+          <m:e>
+            <m:r>
+              <m:t>z</m:t>
+            </m:r>
+          </m:e>
+          <m:sup>
+            <m:r>
+              <m:t>B</m:t>
+            </m:r>
+          </m:sup>
+        </m:sSup>
+        <m:r>
+          <m:rPr>
+            <m:sty m:val="p"/>
+          </m:rPr>
+          <m:t>=</m:t>
+        </m:r>
+        <m:sSup>
+          <m:e>
+            <m:r>
+              <m:t>z</m:t>
+            </m:r>
+          </m:e>
+          <m:sup>
+            <m:r>
+              <m:t>c</m:t>
+            </m:r>
+          </m:sup>
+        </m:sSup>
+      </m:oMath>
+      <w:r>
+        <w:t xml:space="preserve">. The frozen attribution</w:t>
       </w:r>
       <w:r>
         <w:t xml:space="preserve"> </w:t>
@@ -6577,19 +6644,7 @@
         <w:pStyle w:val="FirstParagraph"/>
       </w:pPr>
       <w:r>
-        <w:t xml:space="preserve">The expected-fuel model is a histogram gradient-boosted regression tree ensemble (400 boosting</w:t>
-      </w:r>
-      <w:r>
-        <w:t xml:space="preserve"> </w:t>
-      </w:r>
-      <w:r>
-        <w:t xml:space="preserve">iterations, learning rate 0.05, maximum depth 6; the auxiliary conditions-only and behaviour-only</w:t>
-      </w:r>
-      <w:r>
-        <w:t xml:space="preserve"> </w:t>
-      </w:r>
-      <w:r>
-        <w:t xml:space="preserve">models use 300 iterations and depth 5), trained under 5-fold GroupKFold by vehicle with a fixed random</w:t>
+        <w:t xml:space="preserve">The expected-fuel model is a histogram gradient-boosted regression tree ensemble (300 boosting iterations, learning rate 0.05, and maximum depth 5; the headline coefficient of determination is unchanged at 400 iterations and depth 6), trained under 5-fold GroupKFold by vehicle with a fixed random</w:t>
       </w:r>
       <w:r>
         <w:t xml:space="preserve"> </w:t>
@@ -9615,13 +9670,10 @@
         <w:t xml:space="preserve">88.6% accuracy</w:t>
       </w:r>
       <w:r>
-        <w:t xml:space="preserve">, essentially equal to the trained upper bound (0.886 vs 0.886) and far above the</w:t>
-      </w:r>
-      <w:r>
-        <w:t xml:space="preserve"> </w:t>
-      </w:r>
-      <w:r>
-        <w:t xml:space="preserve">fuel-only chance level; the two track across effect sizes (0.86 at S = 1.5, 0.92 at S = 2.0). Because</w:t>
+        <w:t xml:space="preserve"> </w:t>
+      </w:r>
+      <w:r>
+        <w:t xml:space="preserve">(Table 7), matching a logistic classifier trained on the injected labels over the same two scores (0.886 vs 0.886) and far above the fuel-only chance level; the full-feature classifier of Section 8.3 sets the upper bound at 95.9%, and the frozen and same-score curves track across effect sizes (0.86 at S = 1.5, 0.92 at S = 2.0). Because</w:t>
       </w:r>
       <w:r>
         <w:t xml:space="preserve"> </w:t>
@@ -9647,13 +9699,18 @@
         <w:pStyle w:val="BodyText"/>
       </w:pPr>
       <w:r>
-        <w:t xml:space="preserve">The frozen rule also supports abstention. Withholding a decision when the two scores are close trades</w:t>
-      </w:r>
-      <w:r>
-        <w:t xml:space="preserve"> </w:t>
-      </w:r>
-      <w:r>
-        <w:t xml:space="preserve">coverage for accuracy: at the bench magnitude, deciding on the 71% of trips with the clearest evidence</w:t>
+        <w:t xml:space="preserve">The frozen rule also supports abstention. Withholding a decision when the two scores are close (a margin</w:t>
+      </w:r>
+      <w:r>
+        <w:t xml:space="preserve"> </w:t>
+      </w:r>
+      <m:oMath>
+        <m:r>
+          <m:t>τ</m:t>
+        </m:r>
+      </m:oMath>
+      <w:r>
+        <w:t xml:space="preserve">) trades coverage for accuracy: at the bench magnitude, deciding on the 71% of trips with the clearest evidence</w:t>
       </w:r>
       <w:r>
         <w:t xml:space="preserve"> </w:t>
@@ -9716,7 +9773,7 @@
               <w:jc w:val="left"/>
             </w:pPr>
             <w:r>
-              <w:t xml:space="preserve">Trained upper bound</w:t>
+              <w:t xml:space="preserve">Trained on same scores</w:t>
             </w:r>
           </w:p>
         </w:tc>
@@ -9999,13 +10056,7 @@
         <w:t xml:space="preserve"> </w:t>
       </w:r>
       <w:r>
-        <w:t xml:space="preserve">Attribution accuracy by signature strength. The frozen source-derived rule</w:t>
-      </w:r>
-      <w:r>
-        <w:t xml:space="preserve"> </w:t>
-      </w:r>
-      <w:r>
-        <w:t xml:space="preserve">(no injection-label training) matches the trained upper bound; fuel magnitude alone stays at chance.</w:t>
+        <w:t xml:space="preserve">Attribution accuracy by signature strength. The frozen source-derived rule (no injection-label training) matches a classifier trained on the same two scores with the injection labels; fuel magnitude alone stays at chance.</w:t>
       </w:r>
     </w:p>
     <w:p>
@@ -11395,7 +11446,7 @@
         <w:rPr>
           <w:rStyle w:val="VerbatimChar"/>
         </w:rPr>
-        <w:t xml:space="preserve">scripts/p10_consolidated.py</w:t>
+        <w:t xml:space="preserve">scripts/p14_stress_baselines.py</w:t>
       </w:r>
       <w:r>
         <w:t xml:space="preserve">), results log (</w:t>

</xml_diff>

<commit_message>
E6: second behaviour dataset (UAH-DriveSet, 6 drivers, 1 Hz)
Kinematic axis validated on a SECOND dataset at VED-like 1 Hz: leave-one-driver-out
AUC 0.829 (logreg)/0.808 (RF), 6 drivers, per-driver 0.76-0.92, permutation p=0.001
(940 windows). Addresses reviewer W7/E6. Data obtained credential-free from a public
mirror (official server down); not redistributed (data/ gitignored); cite UAH-DriveSet
[r26 Romera 2016]. New paragraph in 6.3; scripts/p15_uah_e6.py; RESULTS P15; results.json.
</commit_message>
<xml_diff>
--- a/FuelAnomalies.docx
+++ b/FuelAnomalies.docx
@@ -7955,6 +7955,135 @@
         <w:t xml:space="preserve">independent dataset with the driver held out (AUC 0.958, 95% CI [0.927, 0.981]).</w:t>
       </w:r>
     </w:p>
+    <w:p>
+      <w:pPr>
+        <w:pStyle w:val="BodyText"/>
+      </w:pPr>
+      <w:r>
+        <w:t xml:space="preserve">To test transfer at the fleet's own sampling rate and across more drivers, we repeat the validation</w:t>
+      </w:r>
+      <w:r>
+        <w:t xml:space="preserve"> </w:t>
+      </w:r>
+      <w:r>
+        <w:t xml:space="preserve">on a second, independent behaviour dataset: the UAH-DriveSet [</w:t>
+      </w:r>
+      <w:hyperlink w:anchor="r26">
+        <w:r>
+          <w:rPr>
+            <w:rStyle w:val="Hyperlink"/>
+          </w:rPr>
+          <w:t xml:space="preserve">26</w:t>
+        </w:r>
+      </w:hyperlink>
+      <w:r>
+        <w:t xml:space="preserve">], whose processed streams are logged at</w:t>
+      </w:r>
+      <w:r>
+        <w:t xml:space="preserve"> </w:t>
+      </w:r>
+      <w:r>
+        <w:rPr>
+          <w:b/>
+          <w:bCs/>
+        </w:rPr>
+        <w:t xml:space="preserve">1 Hz</w:t>
+      </w:r>
+      <w:r>
+        <w:t xml:space="preserve"> </w:t>
+      </w:r>
+      <w:r>
+        <w:t xml:space="preserve">(matching VED) for</w:t>
+      </w:r>
+      <w:r>
+        <w:t xml:space="preserve"> </w:t>
+      </w:r>
+      <w:r>
+        <w:rPr>
+          <w:b/>
+          <w:bCs/>
+        </w:rPr>
+        <w:t xml:space="preserve">six drivers</w:t>
+      </w:r>
+      <w:r>
+        <w:t xml:space="preserve"> </w:t>
+      </w:r>
+      <w:r>
+        <w:t xml:space="preserve">with normal, drowsy, and aggressive labels. Over 940</w:t>
+      </w:r>
+      <w:r>
+        <w:t xml:space="preserve"> </w:t>
+      </w:r>
+      <w:r>
+        <w:t xml:space="preserve">thirty-second windows (172 aggressive, 768 normal), kinematic features computed at 1 Hz separate</w:t>
+      </w:r>
+      <w:r>
+        <w:t xml:space="preserve"> </w:t>
+      </w:r>
+      <w:r>
+        <w:t xml:space="preserve">aggressive from normal driving with the driver held out at</w:t>
+      </w:r>
+      <w:r>
+        <w:t xml:space="preserve"> </w:t>
+      </w:r>
+      <w:r>
+        <w:rPr>
+          <w:b/>
+          <w:bCs/>
+        </w:rPr>
+        <w:t xml:space="preserve">AUC 0.829</w:t>
+      </w:r>
+      <w:r>
+        <w:t xml:space="preserve"> </w:t>
+      </w:r>
+      <w:r>
+        <w:t xml:space="preserve">(logistic; 0.808 random</w:t>
+      </w:r>
+      <w:r>
+        <w:t xml:space="preserve"> </w:t>
+      </w:r>
+      <w:r>
+        <w:t xml:space="preserve">forest; per-driver 0.76–0.92; 1,000-permutation</w:t>
+      </w:r>
+      <w:r>
+        <w:t xml:space="preserve"> </w:t>
+      </w:r>
+      <m:oMath>
+        <m:r>
+          <m:t>p</m:t>
+        </m:r>
+        <m:r>
+          <m:rPr>
+            <m:sty m:val="p"/>
+          </m:rPr>
+          <m:t>=</m:t>
+        </m:r>
+        <m:r>
+          <m:t>0.001</m:t>
+        </m:r>
+      </m:oMath>
+      <w:r>
+        <w:t xml:space="preserve">). The lower value than the 400 Hz</w:t>
+      </w:r>
+      <w:r>
+        <w:t xml:space="preserve"> </w:t>
+      </w:r>
+      <w:r>
+        <w:t xml:space="preserve">set is expected for the coarser sampling, and it is the more deployment-relevant result: the behaviour</w:t>
+      </w:r>
+      <w:r>
+        <w:t xml:space="preserve"> </w:t>
+      </w:r>
+      <w:r>
+        <w:t xml:space="preserve">axis transfers to a different fleet, twice as many drivers, at the 1 Hz rate OBD telematics actually</w:t>
+      </w:r>
+      <w:r>
+        <w:t xml:space="preserve"> </w:t>
+      </w:r>
+      <w:r>
+        <w:t xml:space="preserve">provide.</w:t>
+      </w:r>
+    </w:p>
     <w:bookmarkEnd w:id="58"/>
     <w:bookmarkEnd w:id="59"/>
     <w:bookmarkStart w:id="63" w:name="arm2"/>
@@ -11520,7 +11649,7 @@
       </w:r>
     </w:p>
     <w:bookmarkEnd w:id="96"/>
-    <w:bookmarkStart w:id="146" w:name="refs"/>
+    <w:bookmarkStart w:id="148" w:name="refs"/>
     <w:p>
       <w:pPr>
         <w:pStyle w:val="Heading2"/>
@@ -12692,13 +12821,57 @@
     </w:p>
     <w:p>
       <w:pPr>
+        <w:pStyle w:val="Compact"/>
+        <w:numPr>
+          <w:ilvl w:val="0"/>
+          <w:numId w:val="1003"/>
+        </w:numPr>
+      </w:pPr>
+      <w:bookmarkStart w:id="147" w:name="r26"/>
+      <w:r>
+        <w:t xml:space="preserve">E. Romera, L. M. Bergasa, R. Arroyo. Need Data for Driver Behaviour Analysis? Presenting</w:t>
+      </w:r>
+      <w:r>
+        <w:t xml:space="preserve"> </w:t>
+      </w:r>
+      <w:r>
+        <w:t xml:space="preserve">the Public UAH-DriveSet.</w:t>
+      </w:r>
+      <w:r>
+        <w:t xml:space="preserve"> </w:t>
+      </w:r>
+      <w:r>
+        <w:rPr>
+          <w:i/>
+          <w:iCs/>
+        </w:rPr>
+        <w:t xml:space="preserve">IEEE ITSC</w:t>
+      </w:r>
+      <w:r>
+        <w:t xml:space="preserve">, 387–392, 2016.</w:t>
+      </w:r>
+      <w:r>
+        <w:t xml:space="preserve"> </w:t>
+      </w:r>
+      <w:hyperlink r:id="rId146">
+        <w:r>
+          <w:rPr>
+            <w:rStyle w:val="Hyperlink"/>
+          </w:rPr>
+          <w:t xml:space="preserve">10.1109/ITSC.2016.7795584</w:t>
+        </w:r>
+      </w:hyperlink>
+      <w:bookmarkEnd w:id="147"/>
+    </w:p>
+    <w:p>
+      <w:pPr>
         <w:pStyle w:val="Bibliography"/>
       </w:pPr>
       <w:r>
         <w:t xml:space="preserve">© 2026 Alexander Apartsin and Yehudit Aperstein.</w:t>
       </w:r>
     </w:p>
-    <w:bookmarkEnd w:id="146"/>
+    <w:bookmarkEnd w:id="148"/>
     <w:sectPr/>
   </w:body>
 </w:document>

</xml_diff>

<commit_message>
E6 consistency pass (Fable): 'two datasets' phrasing, UAH in Table 2 + provenance
Co-Authored-By: Claude Opus 4.8 <noreply@anthropic.com>
</commit_message>
<xml_diff>
--- a/FuelAnomalies.docx
+++ b/FuelAnomalies.docx
@@ -191,7 +191,7 @@
         <w:t xml:space="preserve"> </w:t>
       </w:r>
       <w:r>
-        <w:t xml:space="preserve">EngineFaultDB, with the behaviour axis externally validated on an independent labelled driving dataset.</w:t>
+        <w:t xml:space="preserve">EngineFaultDB, with the behaviour axis externally validated on two independent labelled driving datasets.</w:t>
       </w:r>
       <w:r>
         <w:t xml:space="preserve"> </w:t>
@@ -588,7 +588,7 @@
         <w:t xml:space="preserve"> </w:t>
       </w:r>
       <w:r>
-        <w:t xml:space="preserve">behaviour in VED, engine faults on the bench); an independent dataset validates the behaviour axis.</w:t>
+        <w:t xml:space="preserve">behaviour in VED, engine faults on the bench); two independent datasets validate the behaviour axis.</w:t>
       </w:r>
       <w:r>
         <w:t xml:space="preserve"> </w:t>
@@ -823,7 +823,7 @@
         <w:t xml:space="preserve"> </w:t>
       </w:r>
       <w:r>
-        <w:t xml:space="preserve">signature; an independent labelled driving dataset validates the kinematic axis; and the</w:t>
+        <w:t xml:space="preserve">signature; two independent labelled driving datasets validate the kinematic axis; and the</w:t>
       </w:r>
       <w:r>
         <w:t xml:space="preserve"> </w:t>
@@ -843,13 +843,7 @@
         <w:t xml:space="preserve"> </w:t>
       </w:r>
       <w:r>
-        <w:t xml:space="preserve">that behaviour and a persistent vehicle-baseline are separable, measurable shares of trip fuel; the</w:t>
-      </w:r>
-      <w:r>
-        <w:t xml:space="preserve"> </w:t>
-      </w:r>
-      <w:r>
-        <w:t xml:space="preserve">behaviour axis is validated to transfer to an independent dataset; the rich-mixture fault is shown to</w:t>
+        <w:t xml:space="preserve">that behaviour and a persistent vehicle-baseline are separable, measurable shares of trip fuel; the behaviour axis is validated to transfer to two independent datasets; the rich-mixture fault is shown to</w:t>
       </w:r>
       <w:r>
         <w:t xml:space="preserve"> </w:t>
@@ -2816,6 +2810,91 @@
           </w:p>
         </w:tc>
       </w:tr>
+      <w:tr>
+        <w:tc>
+          <w:tcPr/>
+          <w:p>
+            <w:pPr>
+              <w:pStyle w:val="Compact"/>
+              <w:jc w:val="left"/>
+            </w:pPr>
+            <w:r>
+              <w:t xml:space="preserve">UAH-DriveSet [</w:t>
+            </w:r>
+            <w:hyperlink w:anchor="r26">
+              <w:r>
+                <w:rPr>
+                  <w:rStyle w:val="Hyperlink"/>
+                </w:rPr>
+                <w:t xml:space="preserve">26</w:t>
+              </w:r>
+            </w:hyperlink>
+            <w:r>
+              <w:t xml:space="preserve">]</w:t>
+            </w:r>
+          </w:p>
+        </w:tc>
+        <w:tc>
+          <w:tcPr/>
+          <w:p>
+            <w:pPr>
+              <w:pStyle w:val="Compact"/>
+              <w:jc w:val="left"/>
+            </w:pPr>
+            <w:r>
+              <w:t xml:space="preserve">Behaviour validation (1 Hz)</w:t>
+            </w:r>
+          </w:p>
+        </w:tc>
+        <w:tc>
+          <w:tcPr/>
+          <w:p>
+            <w:pPr>
+              <w:pStyle w:val="Compact"/>
+              <w:jc w:val="left"/>
+            </w:pPr>
+            <w:r>
+              <w:t xml:space="preserve">Normal/drowsy/aggressive</w:t>
+            </w:r>
+          </w:p>
+        </w:tc>
+        <w:tc>
+          <w:tcPr/>
+          <w:p>
+            <w:pPr>
+              <w:pStyle w:val="Compact"/>
+              <w:jc w:val="left"/>
+            </w:pPr>
+            <w:r>
+              <w:t xml:space="preserve">6 drivers / 940 windows</w:t>
+            </w:r>
+          </w:p>
+        </w:tc>
+        <w:tc>
+          <w:tcPr/>
+          <w:p>
+            <w:pPr>
+              <w:pStyle w:val="Compact"/>
+              <w:jc w:val="left"/>
+            </w:pPr>
+            <w:r>
+              <w:t xml:space="preserve">1 Hz</w:t>
+            </w:r>
+          </w:p>
+        </w:tc>
+        <w:tc>
+          <w:tcPr/>
+          <w:p>
+            <w:pPr>
+              <w:pStyle w:val="Compact"/>
+              <w:jc w:val="left"/>
+            </w:pPr>
+            <w:r>
+              <w:t xml:space="preserve">research use</w:t>
+            </w:r>
+          </w:p>
+        </w:tc>
+      </w:tr>
     </w:tbl>
     <w:p>
       <w:pPr>
@@ -2832,7 +2911,7 @@
         <w:t xml:space="preserve"> </w:t>
       </w:r>
       <w:r>
-        <w:t xml:space="preserve">The three public datasets, none of which carries fuel, fault, and</w:t>
+        <w:t xml:space="preserve">The four public datasets, none of which carries fuel, fault, and</w:t>
       </w:r>
       <w:r>
         <w:t xml:space="preserve"> </w:t>
@@ -8015,7 +8094,7 @@
         <w:t xml:space="preserve"> </w:t>
       </w:r>
       <w:r>
-        <w:t xml:space="preserve">thirty-second windows (172 aggressive, 768 normal), kinematic features computed at 1 Hz separate</w:t>
+        <w:t xml:space="preserve">thirty-second windows (172 aggressive, 768 normal; drowsy windows excluded from the binary contrast), kinematic features computed at 1 Hz separate</w:t>
       </w:r>
       <w:r>
         <w:t xml:space="preserve"> </w:t>
@@ -8069,19 +8148,7 @@
         <w:t xml:space="preserve"> </w:t>
       </w:r>
       <w:r>
-        <w:t xml:space="preserve">set is expected for the coarser sampling, and it is the more deployment-relevant result: the behaviour</w:t>
-      </w:r>
-      <w:r>
-        <w:t xml:space="preserve"> </w:t>
-      </w:r>
-      <w:r>
-        <w:t xml:space="preserve">axis transfers to a different fleet, twice as many drivers, at the 1 Hz rate OBD telematics actually</w:t>
-      </w:r>
-      <w:r>
-        <w:t xml:space="preserve"> </w:t>
-      </w:r>
-      <w:r>
-        <w:t xml:space="preserve">provide.</w:t>
+        <w:t xml:space="preserve">set is expected for the coarser sampling, and it is the more deployment-relevant result: the behaviour axis transfers to a different driver population, twice as many drivers, at 1 Hz, the rate OBD telematics actually provide.</w:t>
       </w:r>
     </w:p>
     <w:bookmarkEnd w:id="58"/>
@@ -11365,19 +11432,7 @@
         <w:t xml:space="preserve"> </w:t>
       </w:r>
       <w:r>
-        <w:t xml:space="preserve">dynamics are smoothed; the behaviour-axis transfer is shown for amplitude features across sensing</w:t>
-      </w:r>
-      <w:r>
-        <w:t xml:space="preserve"> </w:t>
-      </w:r>
-      <w:r>
-        <w:t xml:space="preserve">regimes rather than for the exact VED feature set, and a dedicated 1 Hz-versus-high-rate sensitivity</w:t>
-      </w:r>
-      <w:r>
-        <w:t xml:space="preserve"> </w:t>
-      </w:r>
-      <w:r>
-        <w:t xml:space="preserve">analysis is left to future work.</w:t>
+        <w:t xml:space="preserve">dynamics are smoothed; the behaviour-axis transfer is shown on two labelled datasets, at 400 Hz for amplitude features and at the fleet’s own 1 Hz rate for VED-like kinematic features, rather than for the exact VED feature set.</w:t>
       </w:r>
     </w:p>
     <w:bookmarkStart w:id="90" w:name="responsible-use"/>
@@ -11548,13 +11603,18 @@
         </w:r>
       </w:hyperlink>
       <w:r>
-        <w:t xml:space="preserve">,</w:t>
-      </w:r>
-      <w:r>
-        <w:t xml:space="preserve"> </w:t>
-      </w:r>
-      <w:r>
-        <w:t xml:space="preserve">CC-BY-4.0). The full pipeline (</w:t>
+        <w:t xml:space="preserve">, CC-BY-4.0); UAH-DriveSet [</w:t>
+      </w:r>
+      <w:hyperlink w:anchor="r26">
+        <w:r>
+          <w:rPr>
+            <w:rStyle w:val="Hyperlink"/>
+          </w:rPr>
+          <w:t xml:space="preserve">26</w:t>
+        </w:r>
+      </w:hyperlink>
+      <w:r>
+        <w:t xml:space="preserve">] (free for research use; obtained from a public mirror as the original server was unavailable, and not redistributed here). The full pipeline (</w:t>
       </w:r>
       <w:r>
         <w:rPr>
@@ -11575,7 +11635,7 @@
         <w:rPr>
           <w:rStyle w:val="VerbatimChar"/>
         </w:rPr>
-        <w:t xml:space="preserve">scripts/p14_stress_baselines.py</w:t>
+        <w:t xml:space="preserve">scripts/p15_uah_e6.py</w:t>
       </w:r>
       <w:r>
         <w:t xml:space="preserve">), results log (</w:t>
@@ -11639,13 +11699,7 @@
         <w:t xml:space="preserve"> </w:t>
       </w:r>
       <w:r>
-        <w:t xml:space="preserve">We thank the creators of VED, EngineFaultDB, and the Driving Events dataset</w:t>
-      </w:r>
-      <w:r>
-        <w:t xml:space="preserve"> </w:t>
-      </w:r>
-      <w:r>
-        <w:t xml:space="preserve">for releasing their data openly.</w:t>
+        <w:t xml:space="preserve">We thank the creators of VED, EngineFaultDB, the Driving Events dataset, and UAH-DriveSet for releasing their data openly.</w:t>
       </w:r>
     </w:p>
     <w:bookmarkEnd w:id="96"/>

</xml_diff>

<commit_message>
Expand related work to 52 references (bibtest-validated)
Add 26 refs across the five themes, woven into the related-work subsections; every
ref cited and defined (1-52). Rebuilt web/DOCX/LaTeX.

Co-Authored-By: Claude Opus 4.8 <noreply@anthropic.com>
</commit_message>
<xml_diff>
--- a/FuelAnomalies.docx
+++ b/FuelAnomalies.docx
@@ -1018,13 +1018,7 @@
         </w:r>
       </w:hyperlink>
       <w:r>
-        <w:t xml:space="preserve">], and kernel methods map engine parameters to fuel rate</w:t>
-      </w:r>
-      <w:r>
-        <w:t xml:space="preserve"> </w:t>
-      </w:r>
-      <w:r>
-        <w:t xml:space="preserve">from OBD-II [</w:t>
+        <w:t xml:space="preserve">], and kernel methods map engine parameters to fuel rate from OBD-II [</w:t>
       </w:r>
       <w:hyperlink w:anchor="r9">
         <w:r>
@@ -1035,6 +1029,72 @@
         </w:r>
       </w:hyperlink>
       <w:r>
+        <w:t xml:space="preserve">]. Classic modal-emission models set the physical baselines ([</w:t>
+      </w:r>
+      <w:hyperlink w:anchor="r27">
+        <w:r>
+          <w:rPr>
+            <w:rStyle w:val="Hyperlink"/>
+          </w:rPr>
+          <w:t xml:space="preserve">27</w:t>
+        </w:r>
+      </w:hyperlink>
+      <w:r>
+        <w:t xml:space="preserve">] CMEM, [</w:t>
+      </w:r>
+      <w:hyperlink w:anchor="r28">
+        <w:r>
+          <w:rPr>
+            <w:rStyle w:val="Hyperlink"/>
+          </w:rPr>
+          <w:t xml:space="preserve">28</w:t>
+        </w:r>
+      </w:hyperlink>
+      <w:r>
+        <w:t xml:space="preserve">] MOVES), and recent data-driven fuel models use smartphone telematics [</w:t>
+      </w:r>
+      <w:hyperlink w:anchor="r29">
+        <w:r>
+          <w:rPr>
+            <w:rStyle w:val="Hyperlink"/>
+          </w:rPr>
+          <w:t xml:space="preserve">29</w:t>
+        </w:r>
+      </w:hyperlink>
+      <w:r>
+        <w:t xml:space="preserve">], cascaded real-world regression [</w:t>
+      </w:r>
+      <w:hyperlink w:anchor="r30">
+        <w:r>
+          <w:rPr>
+            <w:rStyle w:val="Hyperlink"/>
+          </w:rPr>
+          <w:t xml:space="preserve">30</w:t>
+        </w:r>
+      </w:hyperlink>
+      <w:r>
+        <w:t xml:space="preserve">], neural drive-cycle models [</w:t>
+      </w:r>
+      <w:hyperlink w:anchor="r31">
+        <w:r>
+          <w:rPr>
+            <w:rStyle w:val="Hyperlink"/>
+          </w:rPr>
+          <w:t xml:space="preserve">31</w:t>
+        </w:r>
+      </w:hyperlink>
+      <w:r>
+        <w:t xml:space="preserve">], and behaviour-aware predictors [</w:t>
+      </w:r>
+      <w:hyperlink w:anchor="r32">
+        <w:r>
+          <w:rPr>
+            <w:rStyle w:val="Hyperlink"/>
+          </w:rPr>
+          <w:t xml:space="preserve">32</w:t>
+        </w:r>
+      </w:hyperlink>
+      <w:r>
         <w:t xml:space="preserve">]. These models predict consumption accurately, but they estimate a</w:t>
       </w:r>
       <w:r>
@@ -1139,13 +1199,7 @@
         </w:r>
       </w:hyperlink>
       <w:r>
-        <w:t xml:space="preserve">], and linked to efficiency through drive-cycle simulation</w:t>
-      </w:r>
-      <w:r>
-        <w:t xml:space="preserve"> </w:t>
-      </w:r>
-      <w:r>
-        <w:t xml:space="preserve">[</w:t>
+        <w:t xml:space="preserve">], and linked to efficiency through drive-cycle simulation [</w:t>
       </w:r>
       <w:hyperlink w:anchor="r13">
         <w:r>
@@ -1156,6 +1210,72 @@
         </w:r>
       </w:hyperlink>
       <w:r>
+        <w:t xml:space="preserve">]. Large naturalistic-driving studies (SHRP2 [</w:t>
+      </w:r>
+      <w:hyperlink w:anchor="r33">
+        <w:r>
+          <w:rPr>
+            <w:rStyle w:val="Hyperlink"/>
+          </w:rPr>
+          <w:t xml:space="preserve">33</w:t>
+        </w:r>
+      </w:hyperlink>
+      <w:r>
+        <w:t xml:space="preserve">]; UDRIVE [</w:t>
+      </w:r>
+      <w:hyperlink w:anchor="r37">
+        <w:r>
+          <w:rPr>
+            <w:rStyle w:val="Hyperlink"/>
+          </w:rPr>
+          <w:t xml:space="preserve">37</w:t>
+        </w:r>
+      </w:hyperlink>
+      <w:r>
+        <w:t xml:space="preserve">], [</w:t>
+      </w:r>
+      <w:hyperlink w:anchor="r38">
+        <w:r>
+          <w:rPr>
+            <w:rStyle w:val="Hyperlink"/>
+          </w:rPr>
+          <w:t xml:space="preserve">38</w:t>
+        </w:r>
+      </w:hyperlink>
+      <w:r>
+        <w:t xml:space="preserve">]) and a driving-style-recognition survey [</w:t>
+      </w:r>
+      <w:hyperlink w:anchor="r36">
+        <w:r>
+          <w:rPr>
+            <w:rStyle w:val="Hyperlink"/>
+          </w:rPr>
+          <w:t xml:space="preserve">36</w:t>
+        </w:r>
+      </w:hyperlink>
+      <w:r>
+        <w:t xml:space="preserve">] underpin behaviour recognition, eco-driving reviews quantify the fuel impact [</w:t>
+      </w:r>
+      <w:hyperlink w:anchor="r34">
+        <w:r>
+          <w:rPr>
+            <w:rStyle w:val="Hyperlink"/>
+          </w:rPr>
+          <w:t xml:space="preserve">34</w:t>
+        </w:r>
+      </w:hyperlink>
+      <w:r>
+        <w:t xml:space="preserve">], and usage-based insurance applies telematics scoring commercially [</w:t>
+      </w:r>
+      <w:hyperlink w:anchor="r35">
+        <w:r>
+          <w:rPr>
+            <w:rStyle w:val="Hyperlink"/>
+          </w:rPr>
+          <w:t xml:space="preserve">35</w:t>
+        </w:r>
+      </w:hyperlink>
+      <w:r>
         <w:t xml:space="preserve">]. This literature scores the driver in isolation. It does not separate the</w:t>
       </w:r>
       <w:r>
@@ -1237,6 +1357,61 @@
         </w:r>
       </w:hyperlink>
       <w:r>
+        <w:t xml:space="preserve">]. Broader predictive-maintenance research contributes benchmark datasets and methods, including the SCANIA Component X multivariate benchmark [</w:t>
+      </w:r>
+      <w:hyperlink w:anchor="r39">
+        <w:r>
+          <w:rPr>
+            <w:rStyle w:val="Hyperlink"/>
+          </w:rPr>
+          <w:t xml:space="preserve">39</w:t>
+        </w:r>
+      </w:hyperlink>
+      <w:r>
+        <w:t xml:space="preserve">], LSTM remaining-useful-life estimation [</w:t>
+      </w:r>
+      <w:hyperlink w:anchor="r40">
+        <w:r>
+          <w:rPr>
+            <w:rStyle w:val="Hyperlink"/>
+          </w:rPr>
+          <w:t xml:space="preserve">40</w:t>
+        </w:r>
+      </w:hyperlink>
+      <w:r>
+        <w:t xml:space="preserve">], diesel-engine vibration diagnosis [</w:t>
+      </w:r>
+      <w:hyperlink w:anchor="r43">
+        <w:r>
+          <w:rPr>
+            <w:rStyle w:val="Hyperlink"/>
+          </w:rPr>
+          <w:t xml:space="preserve">43</w:t>
+        </w:r>
+      </w:hyperlink>
+      <w:r>
+        <w:t xml:space="preserve">], and recent surveys [</w:t>
+      </w:r>
+      <w:hyperlink w:anchor="r41">
+        <w:r>
+          <w:rPr>
+            <w:rStyle w:val="Hyperlink"/>
+          </w:rPr>
+          <w:t xml:space="preserve">41</w:t>
+        </w:r>
+      </w:hyperlink>
+      <w:r>
+        <w:t xml:space="preserve">], [</w:t>
+      </w:r>
+      <w:hyperlink w:anchor="r42">
+        <w:r>
+          <w:rPr>
+            <w:rStyle w:val="Hyperlink"/>
+          </w:rPr>
+          <w:t xml:space="preserve">42</w:t>
+        </w:r>
+      </w:hyperlink>
+      <w:r>
         <w:t xml:space="preserve">].</w:t>
       </w:r>
       <w:r>
@@ -1301,13 +1476,51 @@
         </w:r>
       </w:hyperlink>
       <w:r>
-        <w:t xml:space="preserve">], one-class methods, and</w:t>
-      </w:r>
-      <w:r>
-        <w:t xml:space="preserve"> </w:t>
-      </w:r>
-      <w:r>
-        <w:t xml:space="preserve">autoencoder or recurrent models. In the automotive setting, however, most of this work targets</w:t>
+        <w:t xml:space="preserve">], one-class support-vector methods [</w:t>
+      </w:r>
+      <w:hyperlink w:anchor="r44">
+        <w:r>
+          <w:rPr>
+            <w:rStyle w:val="Hyperlink"/>
+          </w:rPr>
+          <w:t xml:space="preserve">44</w:t>
+        </w:r>
+      </w:hyperlink>
+      <w:r>
+        <w:t xml:space="preserve">], change-point detection [</w:t>
+      </w:r>
+      <w:hyperlink w:anchor="r45">
+        <w:r>
+          <w:rPr>
+            <w:rStyle w:val="Hyperlink"/>
+          </w:rPr>
+          <w:t xml:space="preserve">45</w:t>
+        </w:r>
+      </w:hyperlink>
+      <w:r>
+        <w:t xml:space="preserve">], and autoencoder or recurrent models catalogued in recent surveys [</w:t>
+      </w:r>
+      <w:hyperlink w:anchor="r47">
+        <w:r>
+          <w:rPr>
+            <w:rStyle w:val="Hyperlink"/>
+          </w:rPr>
+          <w:t xml:space="preserve">47</w:t>
+        </w:r>
+      </w:hyperlink>
+      <w:r>
+        <w:t xml:space="preserve">] and toolkits such as PyOD [</w:t>
+      </w:r>
+      <w:hyperlink w:anchor="r46">
+        <w:r>
+          <w:rPr>
+            <w:rStyle w:val="Hyperlink"/>
+          </w:rPr>
+          <w:t xml:space="preserve">46</w:t>
+        </w:r>
+      </w:hyperlink>
+      <w:r>
+        <w:t xml:space="preserve">]. In the automotive setting, however, most of this work targets</w:t>
       </w:r>
       <w:r>
         <w:t xml:space="preserve"> </w:t>
@@ -1451,13 +1664,18 @@
         </w:r>
       </w:hyperlink>
       <w:r>
-        <w:t xml:space="preserve">] explain a model's output in terms of</w:t>
-      </w:r>
-      <w:r>
-        <w:t xml:space="preserve"> </w:t>
-      </w:r>
-      <w:r>
-        <w:t xml:space="preserve">its input features. The nearest prior work applies explainability to our exact problem: Barbado and</w:t>
+        <w:t xml:space="preserve">] explain a model's output in terms of its input features, and counterfactual explanations state the minimal input change that would flip a decision [</w:t>
+      </w:r>
+      <w:hyperlink w:anchor="r48">
+        <w:r>
+          <w:rPr>
+            <w:rStyle w:val="Hyperlink"/>
+          </w:rPr>
+          <w:t xml:space="preserve">48</w:t>
+        </w:r>
+      </w:hyperlink>
+      <w:r>
+        <w:t xml:space="preserve">]. The nearest prior work applies explainability to our exact problem: Barbado and</w:t>
       </w:r>
       <w:r>
         <w:t xml:space="preserve"> </w:t>
@@ -1544,6 +1762,50 @@
             <w:rStyle w:val="Hyperlink"/>
           </w:rPr>
           <w:t xml:space="preserve">25</w:t>
+        </w:r>
+      </w:hyperlink>
+      <w:r>
+        <w:t xml:space="preserve">], drawing on transfer learning [</w:t>
+      </w:r>
+      <w:hyperlink w:anchor="r49">
+        <w:r>
+          <w:rPr>
+            <w:rStyle w:val="Hyperlink"/>
+          </w:rPr>
+          <w:t xml:space="preserve">49</w:t>
+        </w:r>
+      </w:hyperlink>
+      <w:r>
+        <w:t xml:space="preserve">], multi-source domain adaptation [</w:t>
+      </w:r>
+      <w:hyperlink w:anchor="r50">
+        <w:r>
+          <w:rPr>
+            <w:rStyle w:val="Hyperlink"/>
+          </w:rPr>
+          <w:t xml:space="preserve">50</w:t>
+        </w:r>
+      </w:hyperlink>
+      <w:r>
+        <w:t xml:space="preserve">], data-programming weak supervision [</w:t>
+      </w:r>
+      <w:hyperlink w:anchor="r51">
+        <w:r>
+          <w:rPr>
+            <w:rStyle w:val="Hyperlink"/>
+          </w:rPr>
+          <w:t xml:space="preserve">51</w:t>
+        </w:r>
+      </w:hyperlink>
+      <w:r>
+        <w:t xml:space="preserve">], and mixture-of-experts evidence fusion [</w:t>
+      </w:r>
+      <w:hyperlink w:anchor="r52">
+        <w:r>
+          <w:rPr>
+            <w:rStyle w:val="Hyperlink"/>
+          </w:rPr>
+          <w:t xml:space="preserve">52</w:t>
         </w:r>
       </w:hyperlink>
       <w:r>
@@ -11703,7 +11965,7 @@
       </w:r>
     </w:p>
     <w:bookmarkEnd w:id="96"/>
-    <w:bookmarkStart w:id="148" w:name="refs"/>
+    <w:bookmarkStart w:id="200" w:name="refs"/>
     <w:p>
       <w:pPr>
         <w:pStyle w:val="Heading2"/>
@@ -12919,13 +13181,1159 @@
     </w:p>
     <w:p>
       <w:pPr>
+        <w:pStyle w:val="Compact"/>
+        <w:numPr>
+          <w:ilvl w:val="0"/>
+          <w:numId w:val="1003"/>
+        </w:numPr>
+      </w:pPr>
+      <w:bookmarkStart w:id="149" w:name="r27"/>
+      <w:r>
+        <w:t xml:space="preserve">F. An, M. Barth, J. Norbeck, M. Ross. Development of Comprehensive Modal Emissions Model:</w:t>
+      </w:r>
+      <w:r>
+        <w:t xml:space="preserve"> </w:t>
+      </w:r>
+      <w:r>
+        <w:t xml:space="preserve">Operating Under Hot-Stabilized Conditions.</w:t>
+      </w:r>
+      <w:r>
+        <w:t xml:space="preserve"> </w:t>
+      </w:r>
+      <w:r>
+        <w:rPr>
+          <w:i/>
+          <w:iCs/>
+        </w:rPr>
+        <w:t xml:space="preserve">Transportation Research Record</w:t>
+      </w:r>
+      <w:r>
+        <w:t xml:space="preserve">, 1587:52–62,</w:t>
+      </w:r>
+      <w:r>
+        <w:t xml:space="preserve"> </w:t>
+      </w:r>
+      <w:r>
+        <w:t xml:space="preserve">1997.</w:t>
+      </w:r>
+      <w:r>
+        <w:t xml:space="preserve"> </w:t>
+      </w:r>
+      <w:hyperlink r:id="rId148">
+        <w:r>
+          <w:rPr>
+            <w:rStyle w:val="Hyperlink"/>
+          </w:rPr>
+          <w:t xml:space="preserve">10.3141/1587-07</w:t>
+        </w:r>
+      </w:hyperlink>
+      <w:bookmarkEnd w:id="149"/>
+    </w:p>
+    <w:p>
+      <w:pPr>
+        <w:pStyle w:val="Compact"/>
+        <w:numPr>
+          <w:ilvl w:val="0"/>
+          <w:numId w:val="1003"/>
+        </w:numPr>
+      </w:pPr>
+      <w:bookmarkStart w:id="151" w:name="r28"/>
+      <w:r>
+        <w:t xml:space="preserve">S. Vallamsundar, J. Lin. MOVES Versus MOBILE: Comparison of Greenhouse Gas and Criteria</w:t>
+      </w:r>
+      <w:r>
+        <w:t xml:space="preserve"> </w:t>
+      </w:r>
+      <w:r>
+        <w:t xml:space="preserve">Pollutant Emissions.</w:t>
+      </w:r>
+      <w:r>
+        <w:t xml:space="preserve"> </w:t>
+      </w:r>
+      <w:r>
+        <w:rPr>
+          <w:i/>
+          <w:iCs/>
+        </w:rPr>
+        <w:t xml:space="preserve">Transportation Research Record</w:t>
+      </w:r>
+      <w:r>
+        <w:t xml:space="preserve">, 2233:27–35, 2011.</w:t>
+      </w:r>
+      <w:r>
+        <w:t xml:space="preserve"> </w:t>
+      </w:r>
+      <w:hyperlink r:id="rId150">
+        <w:r>
+          <w:rPr>
+            <w:rStyle w:val="Hyperlink"/>
+          </w:rPr>
+          <w:t xml:space="preserve">10.3141/2233-04</w:t>
+        </w:r>
+      </w:hyperlink>
+      <w:bookmarkEnd w:id="151"/>
+    </w:p>
+    <w:p>
+      <w:pPr>
+        <w:pStyle w:val="Compact"/>
+        <w:numPr>
+          <w:ilvl w:val="0"/>
+          <w:numId w:val="1003"/>
+        </w:numPr>
+      </w:pPr>
+      <w:bookmarkStart w:id="153" w:name="r29"/>
+      <w:r>
+        <w:t xml:space="preserve">Y. Yao et al. Vehicle Fuel Consumption Prediction Method Based on Driving Behavior Data</w:t>
+      </w:r>
+      <w:r>
+        <w:t xml:space="preserve"> </w:t>
+      </w:r>
+      <w:r>
+        <w:t xml:space="preserve">Collected from Smartphones.</w:t>
+      </w:r>
+      <w:r>
+        <w:t xml:space="preserve"> </w:t>
+      </w:r>
+      <w:r>
+        <w:rPr>
+          <w:i/>
+          <w:iCs/>
+        </w:rPr>
+        <w:t xml:space="preserve">Journal of Advanced Transportation</w:t>
+      </w:r>
+      <w:r>
+        <w:t xml:space="preserve">, 2020:9263605.</w:t>
+      </w:r>
+      <w:r>
+        <w:t xml:space="preserve"> </w:t>
+      </w:r>
+      <w:hyperlink r:id="rId152">
+        <w:r>
+          <w:rPr>
+            <w:rStyle w:val="Hyperlink"/>
+          </w:rPr>
+          <w:t xml:space="preserve">10.1155/2020/9263605</w:t>
+        </w:r>
+      </w:hyperlink>
+      <w:bookmarkEnd w:id="153"/>
+    </w:p>
+    <w:p>
+      <w:pPr>
+        <w:pStyle w:val="Compact"/>
+        <w:numPr>
+          <w:ilvl w:val="0"/>
+          <w:numId w:val="1003"/>
+        </w:numPr>
+      </w:pPr>
+      <w:bookmarkStart w:id="155" w:name="r30"/>
+      <w:r>
+        <w:t xml:space="preserve">E. Moradi, L. Miranda-Moreno. Vehicular fuel consumption estimation using real-world</w:t>
+      </w:r>
+      <w:r>
+        <w:t xml:space="preserve"> </w:t>
+      </w:r>
+      <w:r>
+        <w:t xml:space="preserve">measures through cascaded machine learning modeling.</w:t>
+      </w:r>
+      <w:r>
+        <w:t xml:space="preserve"> </w:t>
+      </w:r>
+      <w:r>
+        <w:rPr>
+          <w:i/>
+          <w:iCs/>
+        </w:rPr>
+        <w:t xml:space="preserve">Transportation Research Part D</w:t>
+      </w:r>
+      <w:r>
+        <w:t xml:space="preserve">,</w:t>
+      </w:r>
+      <w:r>
+        <w:t xml:space="preserve"> </w:t>
+      </w:r>
+      <w:r>
+        <w:t xml:space="preserve">88:102576, 2020.</w:t>
+      </w:r>
+      <w:r>
+        <w:t xml:space="preserve"> </w:t>
+      </w:r>
+      <w:hyperlink r:id="rId154">
+        <w:r>
+          <w:rPr>
+            <w:rStyle w:val="Hyperlink"/>
+          </w:rPr>
+          <w:t xml:space="preserve">10.1016/j.trd.2020.102576</w:t>
+        </w:r>
+      </w:hyperlink>
+      <w:bookmarkEnd w:id="155"/>
+    </w:p>
+    <w:p>
+      <w:pPr>
+        <w:pStyle w:val="Compact"/>
+        <w:numPr>
+          <w:ilvl w:val="0"/>
+          <w:numId w:val="1003"/>
+        </w:numPr>
+      </w:pPr>
+      <w:bookmarkStart w:id="157" w:name="r31"/>
+      <w:r>
+        <w:t xml:space="preserve">J. Topić, B. Škugor, J. Deur. Neural Network-Based Prediction of Vehicle Fuel</w:t>
+      </w:r>
+      <w:r>
+        <w:t xml:space="preserve"> </w:t>
+      </w:r>
+      <w:r>
+        <w:t xml:space="preserve">Consumption Based on Driving Cycle Data.</w:t>
+      </w:r>
+      <w:r>
+        <w:t xml:space="preserve"> </w:t>
+      </w:r>
+      <w:r>
+        <w:rPr>
+          <w:i/>
+          <w:iCs/>
+        </w:rPr>
+        <w:t xml:space="preserve">Sustainability</w:t>
+      </w:r>
+      <w:r>
+        <w:t xml:space="preserve">, 14(2):744, 2022.</w:t>
+      </w:r>
+      <w:r>
+        <w:t xml:space="preserve"> </w:t>
+      </w:r>
+      <w:hyperlink r:id="rId156">
+        <w:r>
+          <w:rPr>
+            <w:rStyle w:val="Hyperlink"/>
+          </w:rPr>
+          <w:t xml:space="preserve">10.3390/su14020744</w:t>
+        </w:r>
+      </w:hyperlink>
+      <w:bookmarkEnd w:id="157"/>
+    </w:p>
+    <w:p>
+      <w:pPr>
+        <w:pStyle w:val="Compact"/>
+        <w:numPr>
+          <w:ilvl w:val="0"/>
+          <w:numId w:val="1003"/>
+        </w:numPr>
+      </w:pPr>
+      <w:bookmarkStart w:id="159" w:name="r32"/>
+      <w:r>
+        <w:t xml:space="preserve">H. I. Ashqar et al. Incorporating driving behavior into vehicle fuel consumption</w:t>
+      </w:r>
+      <w:r>
+        <w:t xml:space="preserve"> </w:t>
+      </w:r>
+      <w:r>
+        <w:t xml:space="preserve">prediction.</w:t>
+      </w:r>
+      <w:r>
+        <w:t xml:space="preserve"> </w:t>
+      </w:r>
+      <w:r>
+        <w:rPr>
+          <w:i/>
+          <w:iCs/>
+        </w:rPr>
+        <w:t xml:space="preserve">Discover Sustainability</w:t>
+      </w:r>
+      <w:r>
+        <w:t xml:space="preserve">, 5, 2024.</w:t>
+      </w:r>
+      <w:r>
+        <w:t xml:space="preserve"> </w:t>
+      </w:r>
+      <w:hyperlink r:id="rId158">
+        <w:r>
+          <w:rPr>
+            <w:rStyle w:val="Hyperlink"/>
+          </w:rPr>
+          <w:t xml:space="preserve">10.1007/s43621-024-00511-z</w:t>
+        </w:r>
+      </w:hyperlink>
+      <w:bookmarkEnd w:id="159"/>
+    </w:p>
+    <w:p>
+      <w:pPr>
+        <w:pStyle w:val="Compact"/>
+        <w:numPr>
+          <w:ilvl w:val="0"/>
+          <w:numId w:val="1003"/>
+        </w:numPr>
+      </w:pPr>
+      <w:bookmarkStart w:id="161" w:name="r33"/>
+      <w:r>
+        <w:t xml:space="preserve">T. A. Dingus et al. Driver crash risk factors and prevalence evaluation using</w:t>
+      </w:r>
+      <w:r>
+        <w:t xml:space="preserve"> </w:t>
+      </w:r>
+      <w:r>
+        <w:t xml:space="preserve">naturalistic driving data.</w:t>
+      </w:r>
+      <w:r>
+        <w:t xml:space="preserve"> </w:t>
+      </w:r>
+      <w:r>
+        <w:rPr>
+          <w:i/>
+          <w:iCs/>
+        </w:rPr>
+        <w:t xml:space="preserve">PNAS</w:t>
+      </w:r>
+      <w:r>
+        <w:t xml:space="preserve">, 113(10):2636–2641, 2016.</w:t>
+      </w:r>
+      <w:r>
+        <w:t xml:space="preserve"> </w:t>
+      </w:r>
+      <w:hyperlink r:id="rId160">
+        <w:r>
+          <w:rPr>
+            <w:rStyle w:val="Hyperlink"/>
+          </w:rPr>
+          <w:t xml:space="preserve">10.1073/pnas.1513271113</w:t>
+        </w:r>
+      </w:hyperlink>
+      <w:bookmarkEnd w:id="161"/>
+    </w:p>
+    <w:p>
+      <w:pPr>
+        <w:pStyle w:val="Compact"/>
+        <w:numPr>
+          <w:ilvl w:val="0"/>
+          <w:numId w:val="1003"/>
+        </w:numPr>
+      </w:pPr>
+      <w:bookmarkStart w:id="163" w:name="r34"/>
+      <w:r>
+        <w:t xml:space="preserve">Y. Huang et al. Eco-driving technology for sustainable road transport: A review.</w:t>
+      </w:r>
+      <w:r>
+        <w:t xml:space="preserve"> </w:t>
+      </w:r>
+      <w:r>
+        <w:rPr>
+          <w:i/>
+          <w:iCs/>
+        </w:rPr>
+        <w:t xml:space="preserve">Renewable and Sustainable Energy Reviews</w:t>
+      </w:r>
+      <w:r>
+        <w:t xml:space="preserve">, 93:596–609, 2018.</w:t>
+      </w:r>
+      <w:r>
+        <w:t xml:space="preserve"> </w:t>
+      </w:r>
+      <w:hyperlink r:id="rId162">
+        <w:r>
+          <w:rPr>
+            <w:rStyle w:val="Hyperlink"/>
+          </w:rPr>
+          <w:t xml:space="preserve">10.1016/j.rser.2018.05.030</w:t>
+        </w:r>
+      </w:hyperlink>
+      <w:bookmarkEnd w:id="163"/>
+    </w:p>
+    <w:p>
+      <w:pPr>
+        <w:pStyle w:val="Compact"/>
+        <w:numPr>
+          <w:ilvl w:val="0"/>
+          <w:numId w:val="1003"/>
+        </w:numPr>
+      </w:pPr>
+      <w:bookmarkStart w:id="165" w:name="r35"/>
+      <w:r>
+        <w:t xml:space="preserve">D. I. Tselentis, E. I. Vlahogianni, G. Yannis. Innovative motor insurance schemes: A review</w:t>
+      </w:r>
+      <w:r>
+        <w:t xml:space="preserve"> </w:t>
+      </w:r>
+      <w:r>
+        <w:t xml:space="preserve">of current practices and emerging challenges.</w:t>
+      </w:r>
+      <w:r>
+        <w:t xml:space="preserve"> </w:t>
+      </w:r>
+      <w:r>
+        <w:rPr>
+          <w:i/>
+          <w:iCs/>
+        </w:rPr>
+        <w:t xml:space="preserve">Accident Analysis and Prevention</w:t>
+      </w:r>
+      <w:r>
+        <w:t xml:space="preserve">,</w:t>
+      </w:r>
+      <w:r>
+        <w:t xml:space="preserve"> </w:t>
+      </w:r>
+      <w:r>
+        <w:t xml:space="preserve">98:139–148, 2017.</w:t>
+      </w:r>
+      <w:r>
+        <w:t xml:space="preserve"> </w:t>
+      </w:r>
+      <w:hyperlink r:id="rId164">
+        <w:r>
+          <w:rPr>
+            <w:rStyle w:val="Hyperlink"/>
+          </w:rPr>
+          <w:t xml:space="preserve">10.1016/j.aap.2016.10.006</w:t>
+        </w:r>
+      </w:hyperlink>
+      <w:bookmarkEnd w:id="165"/>
+    </w:p>
+    <w:p>
+      <w:pPr>
+        <w:pStyle w:val="Compact"/>
+        <w:numPr>
+          <w:ilvl w:val="0"/>
+          <w:numId w:val="1003"/>
+        </w:numPr>
+      </w:pPr>
+      <w:bookmarkStart w:id="167" w:name="r36"/>
+      <w:r>
+        <w:t xml:space="preserve">C. M. Martínez, M. Heucke, F.-Y. Wang, B. Gao, D. Cao. Driving Style Recognition for</w:t>
+      </w:r>
+      <w:r>
+        <w:t xml:space="preserve"> </w:t>
+      </w:r>
+      <w:r>
+        <w:t xml:space="preserve">Intelligent Vehicle Control and Advanced Driver Assistance: A Survey.</w:t>
+      </w:r>
+      <w:r>
+        <w:t xml:space="preserve"> </w:t>
+      </w:r>
+      <w:r>
+        <w:rPr>
+          <w:i/>
+          <w:iCs/>
+        </w:rPr>
+        <w:t xml:space="preserve">IEEE Trans. Intelligent</w:t>
+      </w:r>
+      <w:r>
+        <w:rPr>
+          <w:i/>
+          <w:iCs/>
+        </w:rPr>
+        <w:t xml:space="preserve"> </w:t>
+      </w:r>
+      <w:r>
+        <w:rPr>
+          <w:i/>
+          <w:iCs/>
+        </w:rPr>
+        <w:t xml:space="preserve">Transportation Systems</w:t>
+      </w:r>
+      <w:r>
+        <w:t xml:space="preserve">, 19(3):666–676, 2018.</w:t>
+      </w:r>
+      <w:r>
+        <w:t xml:space="preserve"> </w:t>
+      </w:r>
+      <w:hyperlink r:id="rId166">
+        <w:r>
+          <w:rPr>
+            <w:rStyle w:val="Hyperlink"/>
+          </w:rPr>
+          <w:t xml:space="preserve">10.1109/TITS.2017.2706978</w:t>
+        </w:r>
+      </w:hyperlink>
+      <w:bookmarkEnd w:id="167"/>
+    </w:p>
+    <w:p>
+      <w:pPr>
+        <w:pStyle w:val="Compact"/>
+        <w:numPr>
+          <w:ilvl w:val="0"/>
+          <w:numId w:val="1003"/>
+        </w:numPr>
+      </w:pPr>
+      <w:bookmarkStart w:id="169" w:name="r37"/>
+      <w:r>
+        <w:t xml:space="preserve">Y. Barnard et al. The study design of UDRIVE: the naturalistic driving study across</w:t>
+      </w:r>
+      <w:r>
+        <w:t xml:space="preserve"> </w:t>
+      </w:r>
+      <w:r>
+        <w:t xml:space="preserve">Europe.</w:t>
+      </w:r>
+      <w:r>
+        <w:t xml:space="preserve"> </w:t>
+      </w:r>
+      <w:r>
+        <w:rPr>
+          <w:i/>
+          <w:iCs/>
+        </w:rPr>
+        <w:t xml:space="preserve">European Transport Research Review</w:t>
+      </w:r>
+      <w:r>
+        <w:t xml:space="preserve">, 8, 2016.</w:t>
+      </w:r>
+      <w:r>
+        <w:t xml:space="preserve"> </w:t>
+      </w:r>
+      <w:hyperlink r:id="rId168">
+        <w:r>
+          <w:rPr>
+            <w:rStyle w:val="Hyperlink"/>
+          </w:rPr>
+          <w:t xml:space="preserve">10.1007/s12544-016-0202-z</w:t>
+        </w:r>
+      </w:hyperlink>
+      <w:bookmarkEnd w:id="169"/>
+    </w:p>
+    <w:p>
+      <w:pPr>
+        <w:pStyle w:val="Compact"/>
+        <w:numPr>
+          <w:ilvl w:val="0"/>
+          <w:numId w:val="1003"/>
+        </w:numPr>
+      </w:pPr>
+      <w:bookmarkStart w:id="171" w:name="r38"/>
+      <w:r>
+        <w:t xml:space="preserve">N. van Nes et al. The potential of naturalistic driving for in-depth understanding of</w:t>
+      </w:r>
+      <w:r>
+        <w:t xml:space="preserve"> </w:t>
+      </w:r>
+      <w:r>
+        <w:t xml:space="preserve">driver behavior: UDRIVE results and beyond.</w:t>
+      </w:r>
+      <w:r>
+        <w:t xml:space="preserve"> </w:t>
+      </w:r>
+      <w:r>
+        <w:rPr>
+          <w:i/>
+          <w:iCs/>
+        </w:rPr>
+        <w:t xml:space="preserve">Safety Science</w:t>
+      </w:r>
+      <w:r>
+        <w:t xml:space="preserve">, 119:11–20, 2019.</w:t>
+      </w:r>
+      <w:r>
+        <w:t xml:space="preserve"> </w:t>
+      </w:r>
+      <w:hyperlink r:id="rId170">
+        <w:r>
+          <w:rPr>
+            <w:rStyle w:val="Hyperlink"/>
+          </w:rPr>
+          <w:t xml:space="preserve">10.1016/j.ssci.2018.12.029</w:t>
+        </w:r>
+      </w:hyperlink>
+      <w:bookmarkEnd w:id="171"/>
+    </w:p>
+    <w:p>
+      <w:pPr>
+        <w:pStyle w:val="Compact"/>
+        <w:numPr>
+          <w:ilvl w:val="0"/>
+          <w:numId w:val="1003"/>
+        </w:numPr>
+      </w:pPr>
+      <w:bookmarkStart w:id="173" w:name="r39"/>
+      <w:r>
+        <w:t xml:space="preserve">Z. Kharazian et al. SCANIA Component X: a real-world multivariate time series dataset for</w:t>
+      </w:r>
+      <w:r>
+        <w:t xml:space="preserve"> </w:t>
+      </w:r>
+      <w:r>
+        <w:t xml:space="preserve">predictive maintenance.</w:t>
+      </w:r>
+      <w:r>
+        <w:t xml:space="preserve"> </w:t>
+      </w:r>
+      <w:r>
+        <w:rPr>
+          <w:i/>
+          <w:iCs/>
+        </w:rPr>
+        <w:t xml:space="preserve">Scientific Data</w:t>
+      </w:r>
+      <w:r>
+        <w:t xml:space="preserve">, 12, 2025.</w:t>
+      </w:r>
+      <w:r>
+        <w:t xml:space="preserve"> </w:t>
+      </w:r>
+      <w:hyperlink r:id="rId172">
+        <w:r>
+          <w:rPr>
+            <w:rStyle w:val="Hyperlink"/>
+          </w:rPr>
+          <w:t xml:space="preserve">10.1038/s41597-025-04802-6</w:t>
+        </w:r>
+      </w:hyperlink>
+      <w:bookmarkEnd w:id="173"/>
+    </w:p>
+    <w:p>
+      <w:pPr>
+        <w:pStyle w:val="Compact"/>
+        <w:numPr>
+          <w:ilvl w:val="0"/>
+          <w:numId w:val="1003"/>
+        </w:numPr>
+      </w:pPr>
+      <w:bookmarkStart w:id="175" w:name="r40"/>
+      <w:r>
+        <w:t xml:space="preserve">S. Zheng, K. Ristovski, A. Farahat, C. Gupta. Long Short-Term Memory Network for Remaining</w:t>
+      </w:r>
+      <w:r>
+        <w:t xml:space="preserve"> </w:t>
+      </w:r>
+      <w:r>
+        <w:t xml:space="preserve">Useful Life estimation.</w:t>
+      </w:r>
+      <w:r>
+        <w:t xml:space="preserve"> </w:t>
+      </w:r>
+      <w:r>
+        <w:rPr>
+          <w:i/>
+          <w:iCs/>
+        </w:rPr>
+        <w:t xml:space="preserve">IEEE ICPHM</w:t>
+      </w:r>
+      <w:r>
+        <w:t xml:space="preserve">, 88–95, 2017.</w:t>
+      </w:r>
+      <w:r>
+        <w:t xml:space="preserve"> </w:t>
+      </w:r>
+      <w:hyperlink r:id="rId174">
+        <w:r>
+          <w:rPr>
+            <w:rStyle w:val="Hyperlink"/>
+          </w:rPr>
+          <w:t xml:space="preserve">10.1109/ICPHM.2017.7998311</w:t>
+        </w:r>
+      </w:hyperlink>
+      <w:bookmarkEnd w:id="175"/>
+    </w:p>
+    <w:p>
+      <w:pPr>
+        <w:pStyle w:val="Compact"/>
+        <w:numPr>
+          <w:ilvl w:val="0"/>
+          <w:numId w:val="1003"/>
+        </w:numPr>
+      </w:pPr>
+      <w:bookmarkStart w:id="177" w:name="r41"/>
+      <w:r>
+        <w:t xml:space="preserve">O. Serradilla, E. Zugasti, J. Rodriguez, U. Zurutuza. Deep learning models for predictive</w:t>
+      </w:r>
+      <w:r>
+        <w:t xml:space="preserve"> </w:t>
+      </w:r>
+      <w:r>
+        <w:t xml:space="preserve">maintenance: a survey, comparison, challenges and prospects.</w:t>
+      </w:r>
+      <w:r>
+        <w:t xml:space="preserve"> </w:t>
+      </w:r>
+      <w:r>
+        <w:rPr>
+          <w:i/>
+          <w:iCs/>
+        </w:rPr>
+        <w:t xml:space="preserve">Applied Intelligence</w:t>
+      </w:r>
+      <w:r>
+        <w:t xml:space="preserve">,</w:t>
+      </w:r>
+      <w:r>
+        <w:t xml:space="preserve"> </w:t>
+      </w:r>
+      <w:r>
+        <w:t xml:space="preserve">52:10934–10964, 2022.</w:t>
+      </w:r>
+      <w:r>
+        <w:t xml:space="preserve"> </w:t>
+      </w:r>
+      <w:hyperlink r:id="rId176">
+        <w:r>
+          <w:rPr>
+            <w:rStyle w:val="Hyperlink"/>
+          </w:rPr>
+          <w:t xml:space="preserve">10.1007/s10489-021-03004-y</w:t>
+        </w:r>
+      </w:hyperlink>
+      <w:bookmarkEnd w:id="177"/>
+    </w:p>
+    <w:p>
+      <w:pPr>
+        <w:pStyle w:val="Compact"/>
+        <w:numPr>
+          <w:ilvl w:val="0"/>
+          <w:numId w:val="1003"/>
+        </w:numPr>
+      </w:pPr>
+      <w:bookmarkStart w:id="179" w:name="r42"/>
+      <w:r>
+        <w:t xml:space="preserve">W. Zhang, D. Yang, H. Wang. Data-Driven Methods for Predictive Maintenance of Industrial</w:t>
+      </w:r>
+      <w:r>
+        <w:t xml:space="preserve"> </w:t>
+      </w:r>
+      <w:r>
+        <w:t xml:space="preserve">Equipment: A Survey.</w:t>
+      </w:r>
+      <w:r>
+        <w:t xml:space="preserve"> </w:t>
+      </w:r>
+      <w:r>
+        <w:rPr>
+          <w:i/>
+          <w:iCs/>
+        </w:rPr>
+        <w:t xml:space="preserve">IEEE Systems Journal</w:t>
+      </w:r>
+      <w:r>
+        <w:t xml:space="preserve">, 13(3):2213–2227, 2019.</w:t>
+      </w:r>
+      <w:r>
+        <w:t xml:space="preserve"> </w:t>
+      </w:r>
+      <w:hyperlink r:id="rId178">
+        <w:r>
+          <w:rPr>
+            <w:rStyle w:val="Hyperlink"/>
+          </w:rPr>
+          <w:t xml:space="preserve">10.1109/JSYST.2019.2905565</w:t>
+        </w:r>
+      </w:hyperlink>
+      <w:bookmarkEnd w:id="179"/>
+    </w:p>
+    <w:p>
+      <w:pPr>
+        <w:pStyle w:val="Compact"/>
+        <w:numPr>
+          <w:ilvl w:val="0"/>
+          <w:numId w:val="1003"/>
+        </w:numPr>
+      </w:pPr>
+      <w:bookmarkStart w:id="181" w:name="r43"/>
+      <w:r>
+        <w:t xml:space="preserve">Y. Bai et al. Compression Reconstruction and Fault Diagnosis of Diesel Engine Vibration</w:t>
+      </w:r>
+      <w:r>
+        <w:t xml:space="preserve"> </w:t>
+      </w:r>
+      <w:r>
+        <w:t xml:space="preserve">Signal.</w:t>
+      </w:r>
+      <w:r>
+        <w:t xml:space="preserve"> </w:t>
+      </w:r>
+      <w:r>
+        <w:rPr>
+          <w:i/>
+          <w:iCs/>
+        </w:rPr>
+        <w:t xml:space="preserve">Sensors</w:t>
+      </w:r>
+      <w:r>
+        <w:t xml:space="preserve">, 22(10):3884, 2022.</w:t>
+      </w:r>
+      <w:r>
+        <w:t xml:space="preserve"> </w:t>
+      </w:r>
+      <w:hyperlink r:id="rId180">
+        <w:r>
+          <w:rPr>
+            <w:rStyle w:val="Hyperlink"/>
+          </w:rPr>
+          <w:t xml:space="preserve">10.3390/s22103884</w:t>
+        </w:r>
+      </w:hyperlink>
+      <w:bookmarkEnd w:id="181"/>
+    </w:p>
+    <w:p>
+      <w:pPr>
+        <w:pStyle w:val="Compact"/>
+        <w:numPr>
+          <w:ilvl w:val="0"/>
+          <w:numId w:val="1003"/>
+        </w:numPr>
+      </w:pPr>
+      <w:bookmarkStart w:id="183" w:name="r44"/>
+      <w:r>
+        <w:t xml:space="preserve">B. Schölkopf, J. C. Platt, J. Shawe-Taylor, A. J. Smola, R. C. Williamson. Estimating the</w:t>
+      </w:r>
+      <w:r>
+        <w:t xml:space="preserve"> </w:t>
+      </w:r>
+      <w:r>
+        <w:t xml:space="preserve">Support of a High-Dimensional Distribution.</w:t>
+      </w:r>
+      <w:r>
+        <w:t xml:space="preserve"> </w:t>
+      </w:r>
+      <w:r>
+        <w:rPr>
+          <w:i/>
+          <w:iCs/>
+        </w:rPr>
+        <w:t xml:space="preserve">Neural Computation</w:t>
+      </w:r>
+      <w:r>
+        <w:t xml:space="preserve">, 13(7):1443–1471, 2001.</w:t>
+      </w:r>
+      <w:r>
+        <w:t xml:space="preserve"> </w:t>
+      </w:r>
+      <w:hyperlink r:id="rId182">
+        <w:r>
+          <w:rPr>
+            <w:rStyle w:val="Hyperlink"/>
+          </w:rPr>
+          <w:t xml:space="preserve">10.1162/089976601750264965</w:t>
+        </w:r>
+      </w:hyperlink>
+      <w:bookmarkEnd w:id="183"/>
+    </w:p>
+    <w:p>
+      <w:pPr>
+        <w:pStyle w:val="Compact"/>
+        <w:numPr>
+          <w:ilvl w:val="0"/>
+          <w:numId w:val="1003"/>
+        </w:numPr>
+      </w:pPr>
+      <w:bookmarkStart w:id="185" w:name="r45"/>
+      <w:r>
+        <w:t xml:space="preserve">S. Aminikhanghahi, D. J. Cook. A survey of methods for time series change point detection.</w:t>
+      </w:r>
+      <w:r>
+        <w:t xml:space="preserve"> </w:t>
+      </w:r>
+      <w:r>
+        <w:rPr>
+          <w:i/>
+          <w:iCs/>
+        </w:rPr>
+        <w:t xml:space="preserve">Knowledge and Information Systems</w:t>
+      </w:r>
+      <w:r>
+        <w:t xml:space="preserve">, 51(2):339–367, 2017.</w:t>
+      </w:r>
+      <w:r>
+        <w:t xml:space="preserve"> </w:t>
+      </w:r>
+      <w:hyperlink r:id="rId184">
+        <w:r>
+          <w:rPr>
+            <w:rStyle w:val="Hyperlink"/>
+          </w:rPr>
+          <w:t xml:space="preserve">10.1007/s10115-016-0987-z</w:t>
+        </w:r>
+      </w:hyperlink>
+      <w:bookmarkEnd w:id="185"/>
+    </w:p>
+    <w:p>
+      <w:pPr>
+        <w:pStyle w:val="Compact"/>
+        <w:numPr>
+          <w:ilvl w:val="0"/>
+          <w:numId w:val="1003"/>
+        </w:numPr>
+      </w:pPr>
+      <w:bookmarkStart w:id="187" w:name="r46"/>
+      <w:r>
+        <w:t xml:space="preserve">Y. Zhao, Z. Nasrullah, Z. Li. PyOD: A Python Toolbox for Scalable Outlier Detection.</w:t>
+      </w:r>
+      <w:r>
+        <w:t xml:space="preserve"> </w:t>
+      </w:r>
+      <w:r>
+        <w:t xml:space="preserve">arXiv:1901.01588, 2019.</w:t>
+      </w:r>
+      <w:r>
+        <w:t xml:space="preserve"> </w:t>
+      </w:r>
+      <w:hyperlink r:id="rId186">
+        <w:r>
+          <w:rPr>
+            <w:rStyle w:val="Hyperlink"/>
+          </w:rPr>
+          <w:t xml:space="preserve">10.48550/arXiv.1901.01588</w:t>
+        </w:r>
+      </w:hyperlink>
+      <w:bookmarkEnd w:id="187"/>
+    </w:p>
+    <w:p>
+      <w:pPr>
+        <w:pStyle w:val="Compact"/>
+        <w:numPr>
+          <w:ilvl w:val="0"/>
+          <w:numId w:val="1003"/>
+        </w:numPr>
+      </w:pPr>
+      <w:bookmarkStart w:id="189" w:name="r47"/>
+      <w:r>
+        <w:t xml:space="preserve">R. Chalapathy, S. Chawla. Deep Learning for Anomaly Detection: A Survey. arXiv:1901.03407,</w:t>
+      </w:r>
+      <w:r>
+        <w:t xml:space="preserve"> </w:t>
+      </w:r>
+      <w:r>
+        <w:t xml:space="preserve">2019.</w:t>
+      </w:r>
+      <w:r>
+        <w:t xml:space="preserve"> </w:t>
+      </w:r>
+      <w:hyperlink r:id="rId188">
+        <w:r>
+          <w:rPr>
+            <w:rStyle w:val="Hyperlink"/>
+          </w:rPr>
+          <w:t xml:space="preserve">10.48550/arXiv.1901.03407</w:t>
+        </w:r>
+      </w:hyperlink>
+      <w:bookmarkEnd w:id="189"/>
+    </w:p>
+    <w:p>
+      <w:pPr>
+        <w:pStyle w:val="Compact"/>
+        <w:numPr>
+          <w:ilvl w:val="0"/>
+          <w:numId w:val="1003"/>
+        </w:numPr>
+      </w:pPr>
+      <w:bookmarkStart w:id="191" w:name="r48"/>
+      <w:r>
+        <w:t xml:space="preserve">S. Wachter, B. Mittelstadt, C. Russell. Counterfactual Explanations Without Opening the Black</w:t>
+      </w:r>
+      <w:r>
+        <w:t xml:space="preserve"> </w:t>
+      </w:r>
+      <w:r>
+        <w:t xml:space="preserve">Box: Automated Decisions and the GDPR.</w:t>
+      </w:r>
+      <w:r>
+        <w:t xml:space="preserve"> </w:t>
+      </w:r>
+      <w:r>
+        <w:rPr>
+          <w:i/>
+          <w:iCs/>
+        </w:rPr>
+        <w:t xml:space="preserve">Harvard Journal of Law &amp; Technology</w:t>
+      </w:r>
+      <w:r>
+        <w:t xml:space="preserve">, 31(2), 2017.</w:t>
+      </w:r>
+      <w:r>
+        <w:t xml:space="preserve"> </w:t>
+      </w:r>
+      <w:hyperlink r:id="rId190">
+        <w:r>
+          <w:rPr>
+            <w:rStyle w:val="Hyperlink"/>
+          </w:rPr>
+          <w:t xml:space="preserve">10.2139/ssrn.3063289</w:t>
+        </w:r>
+      </w:hyperlink>
+      <w:bookmarkEnd w:id="191"/>
+    </w:p>
+    <w:p>
+      <w:pPr>
+        <w:pStyle w:val="Compact"/>
+        <w:numPr>
+          <w:ilvl w:val="0"/>
+          <w:numId w:val="1003"/>
+        </w:numPr>
+      </w:pPr>
+      <w:bookmarkStart w:id="193" w:name="r49"/>
+      <w:r>
+        <w:t xml:space="preserve">S. J. Pan, Q. Yang. A Survey on Transfer Learning.</w:t>
+      </w:r>
+      <w:r>
+        <w:t xml:space="preserve"> </w:t>
+      </w:r>
+      <w:r>
+        <w:rPr>
+          <w:i/>
+          <w:iCs/>
+        </w:rPr>
+        <w:t xml:space="preserve">IEEE Trans. Knowledge and Data</w:t>
+      </w:r>
+      <w:r>
+        <w:rPr>
+          <w:i/>
+          <w:iCs/>
+        </w:rPr>
+        <w:t xml:space="preserve"> </w:t>
+      </w:r>
+      <w:r>
+        <w:rPr>
+          <w:i/>
+          <w:iCs/>
+        </w:rPr>
+        <w:t xml:space="preserve">Engineering</w:t>
+      </w:r>
+      <w:r>
+        <w:t xml:space="preserve">, 22(10):1345–1359, 2010.</w:t>
+      </w:r>
+      <w:r>
+        <w:t xml:space="preserve"> </w:t>
+      </w:r>
+      <w:hyperlink r:id="rId192">
+        <w:r>
+          <w:rPr>
+            <w:rStyle w:val="Hyperlink"/>
+          </w:rPr>
+          <w:t xml:space="preserve">10.1109/TKDE.2009.191</w:t>
+        </w:r>
+      </w:hyperlink>
+      <w:bookmarkEnd w:id="193"/>
+    </w:p>
+    <w:p>
+      <w:pPr>
+        <w:pStyle w:val="Compact"/>
+        <w:numPr>
+          <w:ilvl w:val="0"/>
+          <w:numId w:val="1003"/>
+        </w:numPr>
+      </w:pPr>
+      <w:bookmarkStart w:id="195" w:name="r50"/>
+      <w:r>
+        <w:t xml:space="preserve">S. Sun, H. Shi, Y. Wu. A survey of multi-source domain adaptation.</w:t>
+      </w:r>
+      <w:r>
+        <w:t xml:space="preserve"> </w:t>
+      </w:r>
+      <w:r>
+        <w:rPr>
+          <w:i/>
+          <w:iCs/>
+        </w:rPr>
+        <w:t xml:space="preserve">Information Fusion</w:t>
+      </w:r>
+      <w:r>
+        <w:t xml:space="preserve">,</w:t>
+      </w:r>
+      <w:r>
+        <w:t xml:space="preserve"> </w:t>
+      </w:r>
+      <w:r>
+        <w:t xml:space="preserve">24:84–92, 2015.</w:t>
+      </w:r>
+      <w:r>
+        <w:t xml:space="preserve"> </w:t>
+      </w:r>
+      <w:hyperlink r:id="rId194">
+        <w:r>
+          <w:rPr>
+            <w:rStyle w:val="Hyperlink"/>
+          </w:rPr>
+          <w:t xml:space="preserve">10.1016/j.inffus.2014.12.003</w:t>
+        </w:r>
+      </w:hyperlink>
+      <w:bookmarkEnd w:id="195"/>
+    </w:p>
+    <w:p>
+      <w:pPr>
+        <w:pStyle w:val="Compact"/>
+        <w:numPr>
+          <w:ilvl w:val="0"/>
+          <w:numId w:val="1003"/>
+        </w:numPr>
+      </w:pPr>
+      <w:bookmarkStart w:id="197" w:name="r51"/>
+      <w:r>
+        <w:t xml:space="preserve">A. Ratner, S. H. Bach, H. Ehrenberg, J. Fries, S. Wu, C. Ré. Snorkel: Rapid Training</w:t>
+      </w:r>
+      <w:r>
+        <w:t xml:space="preserve"> </w:t>
+      </w:r>
+      <w:r>
+        <w:t xml:space="preserve">Data Creation with Weak Supervision.</w:t>
+      </w:r>
+      <w:r>
+        <w:t xml:space="preserve"> </w:t>
+      </w:r>
+      <w:r>
+        <w:rPr>
+          <w:i/>
+          <w:iCs/>
+        </w:rPr>
+        <w:t xml:space="preserve">Proc. VLDB Endowment</w:t>
+      </w:r>
+      <w:r>
+        <w:t xml:space="preserve">, 11(3):269–282, 2017.</w:t>
+      </w:r>
+      <w:r>
+        <w:t xml:space="preserve"> </w:t>
+      </w:r>
+      <w:hyperlink r:id="rId196">
+        <w:r>
+          <w:rPr>
+            <w:rStyle w:val="Hyperlink"/>
+          </w:rPr>
+          <w:t xml:space="preserve">10.14778/3157794.3157797</w:t>
+        </w:r>
+      </w:hyperlink>
+      <w:bookmarkEnd w:id="197"/>
+    </w:p>
+    <w:p>
+      <w:pPr>
+        <w:pStyle w:val="Compact"/>
+        <w:numPr>
+          <w:ilvl w:val="0"/>
+          <w:numId w:val="1003"/>
+        </w:numPr>
+      </w:pPr>
+      <w:bookmarkStart w:id="199" w:name="r52"/>
+      <w:r>
+        <w:t xml:space="preserve">R. A. Jacobs, M. I. Jordan, S. J. Nowlan, G. E. Hinton. Adaptive Mixtures of Local Experts.</w:t>
+      </w:r>
+      <w:r>
+        <w:t xml:space="preserve"> </w:t>
+      </w:r>
+      <w:r>
+        <w:rPr>
+          <w:i/>
+          <w:iCs/>
+        </w:rPr>
+        <w:t xml:space="preserve">Neural Computation</w:t>
+      </w:r>
+      <w:r>
+        <w:t xml:space="preserve">, 3(1):79–87, 1991.</w:t>
+      </w:r>
+      <w:r>
+        <w:t xml:space="preserve"> </w:t>
+      </w:r>
+      <w:hyperlink r:id="rId198">
+        <w:r>
+          <w:rPr>
+            <w:rStyle w:val="Hyperlink"/>
+          </w:rPr>
+          <w:t xml:space="preserve">10.1162/neco.1991.3.1.79</w:t>
+        </w:r>
+      </w:hyperlink>
+      <w:bookmarkEnd w:id="199"/>
+    </w:p>
+    <w:p>
+      <w:pPr>
         <w:pStyle w:val="Bibliography"/>
       </w:pPr>
       <w:r>
         <w:t xml:space="preserve">© 2026 Alexander Apartsin and Yehudit Aperstein.</w:t>
       </w:r>
     </w:p>
-    <w:bookmarkEnd w:id="148"/>
+    <w:bookmarkEnd w:id="200"/>
     <w:sectPr/>
   </w:body>
 </w:document>

</xml_diff>

<commit_message>
Add real-data strengthening (P16): driver axis predicts real fuel excess; fault-signature specificity
#1 (real VED, no injection): kinematic-dominant trips +0.57 L/100km excess vs
combustion-dominant -0.34 (p<1e-30); corr(excess,kinematic)=0.22, (excess,combustion)=0.00.
#3 (real bench): rich raises combustion axis +4.2pts, lean/ignition drop it; fuel-fault
signature flag 0.29 rich vs 0.07 non-fuel -> specific to the fuel-relevant fault.

Co-Authored-By: Claude Opus 4.8 <noreply@anthropic.com>
</commit_message>
<xml_diff>
--- a/FuelAnomalies.docx
+++ b/FuelAnomalies.docx
@@ -8917,6 +8917,50 @@
     </w:p>
     <w:p>
       <w:pPr>
+        <w:pStyle w:val="BodyText"/>
+      </w:pPr>
+      <w:r>
+        <w:t xml:space="preserve">The fuel signature is specific to the rich mixture. Relative to normal, the rich fault raises the</w:t>
+      </w:r>
+      <w:r>
+        <w:t xml:space="preserve"> </w:t>
+      </w:r>
+      <w:r>
+        <w:t xml:space="preserve">combustion axis by +4.2 percentage points of fuel per air, whereas the lean and low-voltage-ignition</w:t>
+      </w:r>
+      <w:r>
+        <w:t xml:space="preserve"> </w:t>
+      </w:r>
+      <w:r>
+        <w:t xml:space="preserve">faults move it the other way (−2.2 and −1.9). A detector that requires both an excess and</w:t>
+      </w:r>
+      <w:r>
+        <w:t xml:space="preserve"> </w:t>
+      </w:r>
+      <w:r>
+        <w:t xml:space="preserve">an elevated combustion axis therefore fires far more often for the rich fault than for the others</w:t>
+      </w:r>
+      <w:r>
+        <w:t xml:space="preserve"> </w:t>
+      </w:r>
+      <w:r>
+        <w:t xml:space="preserve">(flag rate 0.29 versus a 0.07 average across normal, lean, and ignition). Lean and ignition, which are</w:t>
+      </w:r>
+      <w:r>
+        <w:t xml:space="preserve"> </w:t>
+      </w:r>
+      <w:r>
+        <w:t xml:space="preserve">not over-fuelling faults, do not trigger the vehicle-fuel-fault signature, so the method targets the</w:t>
+      </w:r>
+      <w:r>
+        <w:t xml:space="preserve"> </w:t>
+      </w:r>
+      <w:r>
+        <w:t xml:space="preserve">fuel-relevant fault rather than any deviation from normal.</w:t>
+      </w:r>
+    </w:p>
+    <w:p>
+      <w:pPr>
         <w:pStyle w:val="CaptionedFigure"/>
       </w:pPr>
       <w:r>
@@ -9957,6 +10001,164 @@
       </m:oMath>
       <w:r>
         <w:t xml:space="preserve">), which is what makes them separable.</w:t>
+      </w:r>
+    </w:p>
+    <w:p>
+      <w:pPr>
+        <w:pStyle w:val="BodyText"/>
+      </w:pPr>
+      <w:r>
+        <w:t xml:space="preserve">A real-data check on natural variation corroborates the driver half of this result without any</w:t>
+      </w:r>
+      <w:r>
+        <w:t xml:space="preserve"> </w:t>
+      </w:r>
+      <w:r>
+        <w:t xml:space="preserve">injection. Among real VED trips, those whose kinematic deviation dominates carry a genuine excess of</w:t>
+      </w:r>
+      <w:r>
+        <w:t xml:space="preserve"> </w:t>
+      </w:r>
+      <w:r>
+        <w:rPr>
+          <w:b/>
+          <w:bCs/>
+        </w:rPr>
+        <w:t xml:space="preserve">+0.57 L/100km</w:t>
+      </w:r>
+      <w:r>
+        <w:t xml:space="preserve"> </w:t>
+      </w:r>
+      <w:r>
+        <w:t xml:space="preserve">over expectation, whereas those whose fueling-correction (trim) deviation</w:t>
+      </w:r>
+      <w:r>
+        <w:t xml:space="preserve"> </w:t>
+      </w:r>
+      <w:r>
+        <w:t xml:space="preserve">dominates carry none (−0.34, at the level of low-deviation trips; Mann-Whitney</w:t>
+      </w:r>
+      <w:r>
+        <w:t xml:space="preserve"> </w:t>
+      </w:r>
+      <m:oMath>
+        <m:r>
+          <m:t>p</m:t>
+        </m:r>
+        <m:r>
+          <m:rPr>
+            <m:sty m:val="p"/>
+          </m:rPr>
+          <m:t>&lt;</m:t>
+        </m:r>
+        <m:sSup>
+          <m:e>
+            <m:r>
+              <m:t>10</m:t>
+            </m:r>
+          </m:e>
+          <m:sup>
+            <m:r>
+              <m:rPr>
+                <m:sty m:val="p"/>
+              </m:rPr>
+              <m:t>−</m:t>
+            </m:r>
+            <m:r>
+              <m:t>30</m:t>
+            </m:r>
+          </m:sup>
+        </m:sSup>
+      </m:oMath>
+      <w:r>
+        <w:t xml:space="preserve">). Real trip excess correlates with the kinematic axis (</w:t>
+      </w:r>
+      <m:oMath>
+        <m:r>
+          <m:t>r</m:t>
+        </m:r>
+        <m:r>
+          <m:rPr>
+            <m:sty m:val="p"/>
+          </m:rPr>
+          <m:t>=</m:t>
+        </m:r>
+        <m:r>
+          <m:t>0.22</m:t>
+        </m:r>
+      </m:oMath>
+      <w:r>
+        <w:t xml:space="preserve">) but not with the</w:t>
+      </w:r>
+      <w:r>
+        <w:t xml:space="preserve"> </w:t>
+      </w:r>
+      <w:r>
+        <w:t xml:space="preserve">combustion axis (</w:t>
+      </w:r>
+      <m:oMath>
+        <m:r>
+          <m:t>r</m:t>
+        </m:r>
+        <m:r>
+          <m:rPr>
+            <m:sty m:val="p"/>
+          </m:rPr>
+          <m:t>=</m:t>
+        </m:r>
+        <m:r>
+          <m:t>0.00</m:t>
+        </m:r>
+      </m:oMath>
+      <w:r>
+        <w:t xml:space="preserve">), and the latter stays flat even within the highest-trim quartile</w:t>
+      </w:r>
+      <w:r>
+        <w:t xml:space="preserve"> </w:t>
+      </w:r>
+      <w:r>
+        <w:t xml:space="preserve">(</w:t>
+      </w:r>
+      <m:oMath>
+        <m:r>
+          <m:t>r</m:t>
+        </m:r>
+        <m:r>
+          <m:rPr>
+            <m:sty m:val="p"/>
+          </m:rPr>
+          <m:t>=</m:t>
+        </m:r>
+        <m:r>
+          <m:rPr>
+            <m:sty m:val="p"/>
+          </m:rPr>
+          <m:t>−</m:t>
+        </m:r>
+        <m:r>
+          <m:t>0.03</m:t>
+        </m:r>
+      </m:oMath>
+      <w:r>
+        <w:t xml:space="preserve">). On real trips, then, the driver signature genuinely predicts excess fuel while the</w:t>
+      </w:r>
+      <w:r>
+        <w:t xml:space="preserve"> </w:t>
+      </w:r>
+      <w:r>
+        <w:t xml:space="preserve">fueling-correction signature does not, a real-data counterpart to the silent combustion cell of</w:t>
+      </w:r>
+      <w:r>
+        <w:t xml:space="preserve"> </w:t>
+      </w:r>
+      <w:r>
+        <w:t xml:space="preserve">Section 8.1; that the fleet contains no combustion-linked fuel excess is exactly why the malfunction</w:t>
+      </w:r>
+      <w:r>
+        <w:t xml:space="preserve"> </w:t>
+      </w:r>
+      <w:r>
+        <w:t xml:space="preserve">signature is anchored on the controlled bench.</w:t>
       </w:r>
     </w:p>
     <w:p>

</xml_diff>

<commit_message>
Integrate P18 hardening: trim-corrected #1, OOF #3 + honest sensitivity, fold-demeaned s_veh
Co-Authored-By: Claude Opus 4.8 <noreply@anthropic.com>
</commit_message>
<xml_diff>
--- a/FuelAnomalies.docx
+++ b/FuelAnomalies.docx
@@ -7286,7 +7286,19 @@
         <w:t xml:space="preserve"> </w:t>
       </w:r>
       <w:r>
-        <w:t xml:space="preserve">0.143 in-sample value, and an empirical-Bayes shrinkage estimate agrees (0.138). The offsets are</w:t>
+        <w:t xml:space="preserve">0.143 in-sample value, an empirical-Bayes shrinkage estimate agrees (0.138), and demeaning residuals</w:t>
+      </w:r>
+      <w:r>
+        <w:t xml:space="preserve"> </w:t>
+      </w:r>
+      <w:r>
+        <w:t xml:space="preserve">within each fold before forming the offsets changes the share by less than 0.005, so it is not a</w:t>
+      </w:r>
+      <w:r>
+        <w:t xml:space="preserve"> </w:t>
+      </w:r>
+      <w:r>
+        <w:t xml:space="preserve">fold-bias artifact. The offsets are</w:t>
       </w:r>
       <w:r>
         <w:t xml:space="preserve"> </w:t>
@@ -8909,19 +8921,37 @@
         <w:t xml:space="preserve"> </w:t>
       </w:r>
       <w:r>
-        <w:t xml:space="preserve">(flag rate 0.29 versus a 0.07 average across normal, lean, and ignition). Lean and ignition, which are</w:t>
-      </w:r>
-      <w:r>
-        <w:t xml:space="preserve"> </w:t>
-      </w:r>
-      <w:r>
-        <w:t xml:space="preserve">not over-fuelling faults, do not trigger the vehicle-fuel-fault signature, so the method targets the</w:t>
-      </w:r>
-      <w:r>
-        <w:t xml:space="preserve"> </w:t>
-      </w:r>
-      <w:r>
-        <w:t xml:space="preserve">fuel-relevant fault rather than any deviation from normal.</w:t>
+        <w:t xml:space="preserve">(flag rate 0.29 versus a 0.07 average across normal, lean, and ignition, with an out-of-fold normal</w:t>
+      </w:r>
+      <w:r>
+        <w:t xml:space="preserve"> </w:t>
+      </w:r>
+      <w:r>
+        <w:t xml:space="preserve">reference). Lean and ignition, which are not over-fuelling faults, do not trigger the vehicle-fuel</w:t>
+      </w:r>
+      <w:r>
+        <w:t xml:space="preserve"> </w:t>
+      </w:r>
+      <w:r>
+        <w:t xml:space="preserve">-fault signature, so the method targets the fuel-relevant fault rather than any deviation from normal.</w:t>
+      </w:r>
+      <w:r>
+        <w:t xml:space="preserve"> </w:t>
+      </w:r>
+      <w:r>
+        <w:t xml:space="preserve">The signature is specific but its sensitivity is operating-point-dependent: the per-sample fuel-fault</w:t>
+      </w:r>
+      <w:r>
+        <w:t xml:space="preserve"> </w:t>
+      </w:r>
+      <w:r>
+        <w:t xml:space="preserve">score ranks rich above normal only weakly (AUC 0.58), because a rich fault's fuel penalty is expressed</w:t>
+      </w:r>
+      <w:r>
+        <w:t xml:space="preserve"> </w:t>
+      </w:r>
+      <w:r>
+        <w:t xml:space="preserve">mainly at higher load, consistent with the non-portability across operating regions in Section 8.1.</w:t>
       </w:r>
     </w:p>
     <w:p>
@@ -9980,7 +10010,13 @@
         <w:t xml:space="preserve"> </w:t>
       </w:r>
       <w:r>
-        <w:t xml:space="preserve">dominates carry none (−0.34, at the level of low-deviation trips; Mann-Whitney</w:t>
+        <w:t xml:space="preserve">dominates carry none (−0.34, unchanged under a trim-corrected fuel target, at the level of</w:t>
+      </w:r>
+      <w:r>
+        <w:t xml:space="preserve"> </w:t>
+      </w:r>
+      <w:r>
+        <w:t xml:space="preserve">low-deviation trips; Mann-Whitney</w:t>
       </w:r>
       <w:r>
         <w:t xml:space="preserve"> </w:t>

</xml_diff>